<commit_message>
Retarget to Results in Engineering (manuscript, PDF, Word, READMEs)
Co-Authored-By: Claude Opus 5.5 <noreply@anthropic.com>
</commit_message>
<xml_diff>
--- a/paper/main.docx
+++ b/paper/main.docx
@@ -12867,13 +12867,13 @@
       </w:r>
     </w:p>
     <w:bookmarkEnd w:id="132"/>
-    <w:bookmarkStart w:id="133" w:name="X071796dd6bc546c91e96cca1cf5ff96599de61f"/>
+    <w:bookmarkStart w:id="133" w:name="X1f74eb43af444059c7518034463b6c89b1cacf4"/>
     <w:p>
       <w:pPr>
         <w:pStyle w:val="Heading1"/>
       </w:pPr>
       <w:r>
-        <w:t xml:space="preserve">Declaration of generative AI and AI-assisted technologies in the writing process</w:t>
+        <w:t xml:space="preserve">Declaration of generative AI and AI-assisted technologies in the manuscript preparation process</w:t>
       </w:r>
     </w:p>
     <w:p>
@@ -14687,7 +14687,7 @@
         <w:pStyle w:val="TableCaption"/>
       </w:pPr>
       <w:r>
-        <w:t xml:space="preserve">Table A.14. Software adaptations, by node.</w:t>
+        <w:t xml:space="preserve">Table A.1. Software adaptations, by node.</w:t>
       </w:r>
     </w:p>
     <w:tbl>
@@ -14696,7 +14696,7 @@
         <w:tblW w:type="pct" w:w="4992"/>
         <w:tblLayout w:type="fixed"/>
         <w:tblLook w:firstRow="1" w:lastRow="0" w:firstColumn="0" w:lastColumn="0" w:noHBand="0" w:noVBand="0" w:val="0020"/>
-        <w:tblCaption w:val="Table A.14. Software adaptations, by node."/>
+        <w:tblCaption w:val="Table A.1. Software adaptations, by node."/>
       </w:tblPr>
       <w:tblGrid>
         <w:gridCol w:w="425"/>

</xml_diff>

<commit_message>
Cite paper 1 as published (Frontiers in Plant Science, 2026)
Co-Authored-By: Claude Opus 5.5 <noreply@anthropic.com>
</commit_message>
<xml_diff>
--- a/paper/main.docx
+++ b/paper/main.docx
@@ -554,12 +554,12 @@
       <w:r>
         <w:t xml:space="preserve">(</w:t>
       </w:r>
-      <w:hyperlink w:anchor="ref-elkarch2025backbone">
+      <w:hyperlink w:anchor="ref-elkarch2026backbone">
         <w:r>
           <w:rPr>
             <w:rStyle w:val="Hyperlink"/>
           </w:rPr>
-          <w:t xml:space="preserve">El Karch et al. 2025</w:t>
+          <w:t xml:space="preserve">El Karch et al. 2026</w:t>
         </w:r>
       </w:hyperlink>
       <w:r>
@@ -1159,12 +1159,12 @@
       <w:r>
         <w:t xml:space="preserve">El Karch et al. (</w:t>
       </w:r>
-      <w:hyperlink w:anchor="ref-elkarch2025backbone">
+      <w:hyperlink w:anchor="ref-elkarch2026backbone">
         <w:r>
           <w:rPr>
             <w:rStyle w:val="Hyperlink"/>
           </w:rPr>
-          <w:t xml:space="preserve">2025</w:t>
+          <w:t xml:space="preserve">2026</w:t>
         </w:r>
       </w:hyperlink>
       <w:r>
@@ -1649,12 +1649,12 @@
       <w:r>
         <w:t xml:space="preserve">El Karch et al. (</w:t>
       </w:r>
-      <w:hyperlink w:anchor="ref-elkarch2025backbone">
+      <w:hyperlink w:anchor="ref-elkarch2026backbone">
         <w:r>
           <w:rPr>
             <w:rStyle w:val="Hyperlink"/>
           </w:rPr>
-          <w:t xml:space="preserve">2025</w:t>
+          <w:t xml:space="preserve">2026</w:t>
         </w:r>
       </w:hyperlink>
       <w:r>
@@ -12885,7 +12885,7 @@
       </w:r>
     </w:p>
     <w:bookmarkEnd w:id="133"/>
-    <w:bookmarkStart w:id="207" w:name="references"/>
+    <w:bookmarkStart w:id="208" w:name="references"/>
     <w:p>
       <w:pPr>
         <w:pStyle w:val="Heading1"/>
@@ -12894,7 +12894,7 @@
         <w:t xml:space="preserve">References</w:t>
       </w:r>
     </w:p>
-    <w:bookmarkStart w:id="206" w:name="refs"/>
+    <w:bookmarkStart w:id="207" w:name="refs"/>
     <w:bookmarkStart w:id="135" w:name="ref-ahmad2023toward"/>
     <w:p>
       <w:pPr>
@@ -13129,13 +13129,19 @@
       </w:r>
     </w:p>
     <w:bookmarkEnd w:id="143"/>
-    <w:bookmarkStart w:id="144" w:name="ref-elkarch2025backbone"/>
+    <w:bookmarkStart w:id="145" w:name="ref-elkarch2026backbone"/>
     <w:p>
       <w:pPr>
         <w:pStyle w:val="Bibliography"/>
       </w:pPr>
       <w:r>
-        <w:t xml:space="preserve">El Karch, Hajar, Youssef Natij, Mohamed Benaly, Rachid Elgouri, and Abdelkader Mezouari. 2025.</w:t>
+        <w:t xml:space="preserve">El Karch, Hajar, Youssef Natij, Mohamed Benaly, Rachid El Gouri, and Abdelkader Mezouari. 2026.</w:t>
+      </w:r>
+      <w:r>
+        <w:t xml:space="preserve"> </w:t>
+      </w:r>
+      <w:r>
+        <w:t xml:space="preserve">“Backbone Diversity Beats Text Supervision: A Systematic Study of Frozen Multi-Foundation Model Fusion for in-the-Wild Plant Disease Recognition.”</w:t>
       </w:r>
       <w:r>
         <w:t xml:space="preserve"> </w:t>
@@ -13145,14 +13151,31 @@
           <w:i/>
           <w:iCs/>
         </w:rPr>
-        <w:t xml:space="preserve">Backbone Diversity Beats Text Supervision: A Systematic Study of Frozen Multi-Foundation-Model Fusion for in-the-Wild Plant Disease Recognition</w:t>
-      </w:r>
+        <w:t xml:space="preserve">Frontiers in Plant Science</w:t>
+      </w:r>
+      <w:r>
+        <w:t xml:space="preserve"> </w:t>
+      </w:r>
+      <w:r>
+        <w:t xml:space="preserve">17: 1860665.</w:t>
+      </w:r>
+      <w:r>
+        <w:t xml:space="preserve"> </w:t>
+      </w:r>
+      <w:hyperlink r:id="rId144">
+        <w:r>
+          <w:rPr>
+            <w:rStyle w:val="Hyperlink"/>
+          </w:rPr>
+          <w:t xml:space="preserve">https://doi.org/10.3389/fpls.2026.1860665</w:t>
+        </w:r>
+      </w:hyperlink>
       <w:r>
         <w:t xml:space="preserve">.</w:t>
       </w:r>
     </w:p>
-    <w:bookmarkEnd w:id="144"/>
-    <w:bookmarkStart w:id="146" w:name="ref-ferentinos2018deep"/>
+    <w:bookmarkEnd w:id="145"/>
+    <w:bookmarkStart w:id="147" w:name="ref-ferentinos2018deep"/>
     <w:p>
       <w:pPr>
         <w:pStyle w:val="Bibliography"/>
@@ -13185,7 +13208,7 @@
       <w:r>
         <w:t xml:space="preserve"> </w:t>
       </w:r>
-      <w:hyperlink r:id="rId145">
+      <w:hyperlink r:id="rId146">
         <w:r>
           <w:rPr>
             <w:rStyle w:val="Hyperlink"/>
@@ -13197,8 +13220,8 @@
         <w:t xml:space="preserve">.</w:t>
       </w:r>
     </w:p>
-    <w:bookmarkEnd w:id="146"/>
-    <w:bookmarkStart w:id="147" w:name="ref-geifman2017selective"/>
+    <w:bookmarkEnd w:id="147"/>
+    <w:bookmarkStart w:id="148" w:name="ref-geifman2017selective"/>
     <w:p>
       <w:pPr>
         <w:pStyle w:val="Bibliography"/>
@@ -13226,8 +13249,8 @@
         <w:t xml:space="preserve">.</w:t>
       </w:r>
     </w:p>
-    <w:bookmarkEnd w:id="147"/>
-    <w:bookmarkStart w:id="148" w:name="ref-guo2017calibration"/>
+    <w:bookmarkEnd w:id="148"/>
+    <w:bookmarkStart w:id="149" w:name="ref-guo2017calibration"/>
     <w:p>
       <w:pPr>
         <w:pStyle w:val="Bibliography"/>
@@ -13255,8 +13278,8 @@
         <w:t xml:space="preserve">, Proceedings of machine learning research, vol. 70: 1321–30.</w:t>
       </w:r>
     </w:p>
-    <w:bookmarkEnd w:id="148"/>
-    <w:bookmarkStart w:id="150" w:name="ref-hasan2025deployable"/>
+    <w:bookmarkEnd w:id="149"/>
+    <w:bookmarkStart w:id="151" w:name="ref-hasan2025deployable"/>
     <w:p>
       <w:pPr>
         <w:pStyle w:val="Bibliography"/>
@@ -13289,7 +13312,7 @@
       <w:r>
         <w:t xml:space="preserve"> </w:t>
       </w:r>
-      <w:hyperlink r:id="rId149">
+      <w:hyperlink r:id="rId150">
         <w:r>
           <w:rPr>
             <w:rStyle w:val="Hyperlink"/>
@@ -13301,8 +13324,8 @@
         <w:t xml:space="preserve">.</w:t>
       </w:r>
     </w:p>
-    <w:bookmarkEnd w:id="150"/>
-    <w:bookmarkStart w:id="151" w:name="ref-hendrycks2017baseline"/>
+    <w:bookmarkEnd w:id="151"/>
+    <w:bookmarkStart w:id="152" w:name="ref-hendrycks2017baseline"/>
     <w:p>
       <w:pPr>
         <w:pStyle w:val="Bibliography"/>
@@ -13330,8 +13353,8 @@
         <w:t xml:space="preserve">.</w:t>
       </w:r>
     </w:p>
-    <w:bookmarkEnd w:id="151"/>
-    <w:bookmarkStart w:id="153" w:name="ref-hinton2015distilling"/>
+    <w:bookmarkEnd w:id="152"/>
+    <w:bookmarkStart w:id="154" w:name="ref-hinton2015distilling"/>
     <w:p>
       <w:pPr>
         <w:pStyle w:val="Bibliography"/>
@@ -13355,7 +13378,7 @@
       <w:r>
         <w:t xml:space="preserve"> </w:t>
       </w:r>
-      <w:hyperlink r:id="rId152">
+      <w:hyperlink r:id="rId153">
         <w:r>
           <w:rPr>
             <w:rStyle w:val="Hyperlink"/>
@@ -13367,8 +13390,8 @@
         <w:t xml:space="preserve">.</w:t>
       </w:r>
     </w:p>
-    <w:bookmarkEnd w:id="153"/>
-    <w:bookmarkStart w:id="155" w:name="ref-howard2019mobilenetv3"/>
+    <w:bookmarkEnd w:id="154"/>
+    <w:bookmarkStart w:id="156" w:name="ref-howard2019mobilenetv3"/>
     <w:p>
       <w:pPr>
         <w:pStyle w:val="Bibliography"/>
@@ -13407,7 +13430,7 @@
       <w:r>
         <w:t xml:space="preserve"> </w:t>
       </w:r>
-      <w:hyperlink r:id="rId154">
+      <w:hyperlink r:id="rId155">
         <w:r>
           <w:rPr>
             <w:rStyle w:val="Hyperlink"/>
@@ -13419,8 +13442,8 @@
         <w:t xml:space="preserve">.</w:t>
       </w:r>
     </w:p>
-    <w:bookmarkEnd w:id="155"/>
-    <w:bookmarkStart w:id="157" w:name="ref-hughes2015plantvillage"/>
+    <w:bookmarkEnd w:id="156"/>
+    <w:bookmarkStart w:id="158" w:name="ref-hughes2015plantvillage"/>
     <w:p>
       <w:pPr>
         <w:pStyle w:val="Bibliography"/>
@@ -13444,7 +13467,7 @@
       <w:r>
         <w:t xml:space="preserve"> </w:t>
       </w:r>
-      <w:hyperlink r:id="rId156">
+      <w:hyperlink r:id="rId157">
         <w:r>
           <w:rPr>
             <w:rStyle w:val="Hyperlink"/>
@@ -13456,8 +13479,8 @@
         <w:t xml:space="preserve">.</w:t>
       </w:r>
     </w:p>
-    <w:bookmarkEnd w:id="157"/>
-    <w:bookmarkStart w:id="159" w:name="ref-jiang2025plantcafo"/>
+    <w:bookmarkEnd w:id="158"/>
+    <w:bookmarkStart w:id="160" w:name="ref-jiang2025plantcafo"/>
     <w:p>
       <w:pPr>
         <w:pStyle w:val="Bibliography"/>
@@ -13496,7 +13519,7 @@
       <w:r>
         <w:t xml:space="preserve"> </w:t>
       </w:r>
-      <w:hyperlink r:id="rId158">
+      <w:hyperlink r:id="rId159">
         <w:r>
           <w:rPr>
             <w:rStyle w:val="Hyperlink"/>
@@ -13508,8 +13531,8 @@
         <w:t xml:space="preserve">.</w:t>
       </w:r>
     </w:p>
-    <w:bookmarkEnd w:id="159"/>
-    <w:bookmarkStart w:id="160" w:name="ref-kag2023selective"/>
+    <w:bookmarkEnd w:id="160"/>
+    <w:bookmarkStart w:id="161" w:name="ref-kag2023selective"/>
     <w:p>
       <w:pPr>
         <w:pStyle w:val="Bibliography"/>
@@ -13537,8 +13560,8 @@
         <w:t xml:space="preserve">.</w:t>
       </w:r>
     </w:p>
-    <w:bookmarkEnd w:id="160"/>
-    <w:bookmarkStart w:id="162" w:name="ref-kamilaris2018survey"/>
+    <w:bookmarkEnd w:id="161"/>
+    <w:bookmarkStart w:id="163" w:name="ref-kamilaris2018survey"/>
     <w:p>
       <w:pPr>
         <w:pStyle w:val="Bibliography"/>
@@ -13571,7 +13594,7 @@
       <w:r>
         <w:t xml:space="preserve"> </w:t>
       </w:r>
-      <w:hyperlink r:id="rId161">
+      <w:hyperlink r:id="rId162">
         <w:r>
           <w:rPr>
             <w:rStyle w:val="Hyperlink"/>
@@ -13583,8 +13606,8 @@
         <w:t xml:space="preserve">.</w:t>
       </w:r>
     </w:p>
-    <w:bookmarkEnd w:id="162"/>
-    <w:bookmarkStart w:id="164" w:name="ref-kang2017neurosurgeon"/>
+    <w:bookmarkEnd w:id="163"/>
+    <w:bookmarkStart w:id="165" w:name="ref-kang2017neurosurgeon"/>
     <w:p>
       <w:pPr>
         <w:pStyle w:val="Bibliography"/>
@@ -13614,7 +13637,7 @@
       <w:r>
         <w:t xml:space="preserve"> </w:t>
       </w:r>
-      <w:hyperlink r:id="rId163">
+      <w:hyperlink r:id="rId164">
         <w:r>
           <w:rPr>
             <w:rStyle w:val="Hyperlink"/>
@@ -13626,8 +13649,8 @@
         <w:t xml:space="preserve">.</w:t>
       </w:r>
     </w:p>
-    <w:bookmarkEnd w:id="164"/>
-    <w:bookmarkStart w:id="166" w:name="ref-lin2017focal"/>
+    <w:bookmarkEnd w:id="165"/>
+    <w:bookmarkStart w:id="167" w:name="ref-lin2017focal"/>
     <w:p>
       <w:pPr>
         <w:pStyle w:val="Bibliography"/>
@@ -13657,7 +13680,7 @@
       <w:r>
         <w:t xml:space="preserve"> </w:t>
       </w:r>
-      <w:hyperlink r:id="rId165">
+      <w:hyperlink r:id="rId166">
         <w:r>
           <w:rPr>
             <w:rStyle w:val="Hyperlink"/>
@@ -13669,8 +13692,8 @@
         <w:t xml:space="preserve">.</w:t>
       </w:r>
     </w:p>
-    <w:bookmarkEnd w:id="166"/>
-    <w:bookmarkStart w:id="167" w:name="ref-loshchilov2019adamw"/>
+    <w:bookmarkEnd w:id="167"/>
+    <w:bookmarkStart w:id="168" w:name="ref-loshchilov2019adamw"/>
     <w:p>
       <w:pPr>
         <w:pStyle w:val="Bibliography"/>
@@ -13698,8 +13721,8 @@
         <w:t xml:space="preserve">.</w:t>
       </w:r>
     </w:p>
-    <w:bookmarkEnd w:id="167"/>
-    <w:bookmarkStart w:id="169" w:name="ref-matsubara2022split"/>
+    <w:bookmarkEnd w:id="168"/>
+    <w:bookmarkStart w:id="170" w:name="ref-matsubara2022split"/>
     <w:p>
       <w:pPr>
         <w:pStyle w:val="Bibliography"/>
@@ -13732,7 +13755,7 @@
       <w:r>
         <w:t xml:space="preserve"> </w:t>
       </w:r>
-      <w:hyperlink r:id="rId168">
+      <w:hyperlink r:id="rId169">
         <w:r>
           <w:rPr>
             <w:rStyle w:val="Hyperlink"/>
@@ -13744,8 +13767,8 @@
         <w:t xml:space="preserve">.</w:t>
       </w:r>
     </w:p>
-    <w:bookmarkEnd w:id="169"/>
-    <w:bookmarkStart w:id="171" w:name="ref-mohanty2016deeplearning"/>
+    <w:bookmarkEnd w:id="170"/>
+    <w:bookmarkStart w:id="172" w:name="ref-mohanty2016deeplearning"/>
     <w:p>
       <w:pPr>
         <w:pStyle w:val="Bibliography"/>
@@ -13778,7 +13801,7 @@
       <w:r>
         <w:t xml:space="preserve"> </w:t>
       </w:r>
-      <w:hyperlink r:id="rId170">
+      <w:hyperlink r:id="rId171">
         <w:r>
           <w:rPr>
             <w:rStyle w:val="Hyperlink"/>
@@ -13790,8 +13813,8 @@
         <w:t xml:space="preserve">.</w:t>
       </w:r>
     </w:p>
-    <w:bookmarkEnd w:id="171"/>
-    <w:bookmarkStart w:id="173" w:name="ref-noyan2022uncovering"/>
+    <w:bookmarkEnd w:id="172"/>
+    <w:bookmarkStart w:id="174" w:name="ref-noyan2022uncovering"/>
     <w:p>
       <w:pPr>
         <w:pStyle w:val="Bibliography"/>
@@ -13843,7 +13866,7 @@
       <w:r>
         <w:t xml:space="preserve"> </w:t>
       </w:r>
-      <w:hyperlink r:id="rId172">
+      <w:hyperlink r:id="rId173">
         <w:r>
           <w:rPr>
             <w:rStyle w:val="Hyperlink"/>
@@ -13855,8 +13878,8 @@
         <w:t xml:space="preserve">.</w:t>
       </w:r>
     </w:p>
-    <w:bookmarkEnd w:id="173"/>
-    <w:bookmarkStart w:id="175" w:name="ref-nvidia2022tensorrt"/>
+    <w:bookmarkEnd w:id="174"/>
+    <w:bookmarkStart w:id="176" w:name="ref-nvidia2022tensorrt"/>
     <w:p>
       <w:pPr>
         <w:pStyle w:val="Bibliography"/>
@@ -13894,7 +13917,7 @@
       <w:r>
         <w:t xml:space="preserve"> </w:t>
       </w:r>
-      <w:hyperlink r:id="rId174">
+      <w:hyperlink r:id="rId175">
         <w:r>
           <w:rPr>
             <w:rStyle w:val="Hyperlink"/>
@@ -13906,8 +13929,8 @@
         <w:t xml:space="preserve">.</w:t>
       </w:r>
     </w:p>
-    <w:bookmarkEnd w:id="175"/>
-    <w:bookmarkStart w:id="177" w:name="ref-ogrady2019edge"/>
+    <w:bookmarkEnd w:id="176"/>
+    <w:bookmarkStart w:id="178" w:name="ref-ogrady2019edge"/>
     <w:p>
       <w:pPr>
         <w:pStyle w:val="Bibliography"/>
@@ -13940,7 +13963,7 @@
       <w:r>
         <w:t xml:space="preserve"> </w:t>
       </w:r>
-      <w:hyperlink r:id="rId176">
+      <w:hyperlink r:id="rId177">
         <w:r>
           <w:rPr>
             <w:rStyle w:val="Hyperlink"/>
@@ -13952,8 +13975,8 @@
         <w:t xml:space="preserve">.</w:t>
       </w:r>
     </w:p>
-    <w:bookmarkEnd w:id="177"/>
-    <w:bookmarkStart w:id="178" w:name="ref-oquab2024dinov2"/>
+    <w:bookmarkEnd w:id="178"/>
+    <w:bookmarkStart w:id="179" w:name="ref-oquab2024dinov2"/>
     <w:p>
       <w:pPr>
         <w:pStyle w:val="Bibliography"/>
@@ -13985,8 +14008,8 @@
         <w:t xml:space="preserve">. Transactions on Machine Learning Research (TMLR).</w:t>
       </w:r>
     </w:p>
-    <w:bookmarkEnd w:id="178"/>
-    <w:bookmarkStart w:id="179" w:name="ref-radford2021clip"/>
+    <w:bookmarkEnd w:id="179"/>
+    <w:bookmarkStart w:id="180" w:name="ref-radford2021clip"/>
     <w:p>
       <w:pPr>
         <w:pStyle w:val="Bibliography"/>
@@ -14014,8 +14037,8 @@
         <w:t xml:space="preserve">, 8748–63.</w:t>
       </w:r>
     </w:p>
-    <w:bookmarkEnd w:id="179"/>
-    <w:bookmarkStart w:id="181" w:name="ref-salman2025plantdisease"/>
+    <w:bookmarkEnd w:id="180"/>
+    <w:bookmarkStart w:id="182" w:name="ref-salman2025plantdisease"/>
     <w:p>
       <w:pPr>
         <w:pStyle w:val="Bibliography"/>
@@ -14048,7 +14071,7 @@
       <w:r>
         <w:t xml:space="preserve"> </w:t>
       </w:r>
-      <w:hyperlink r:id="rId180">
+      <w:hyperlink r:id="rId181">
         <w:r>
           <w:rPr>
             <w:rStyle w:val="Hyperlink"/>
@@ -14060,8 +14083,8 @@
         <w:t xml:space="preserve">.</w:t>
       </w:r>
     </w:p>
-    <w:bookmarkEnd w:id="181"/>
-    <w:bookmarkStart w:id="183" w:name="ref-savary2019global"/>
+    <w:bookmarkEnd w:id="182"/>
+    <w:bookmarkStart w:id="184" w:name="ref-savary2019global"/>
     <w:p>
       <w:pPr>
         <w:pStyle w:val="Bibliography"/>
@@ -14094,7 +14117,7 @@
       <w:r>
         <w:t xml:space="preserve"> </w:t>
       </w:r>
-      <w:hyperlink r:id="rId182">
+      <w:hyperlink r:id="rId183">
         <w:r>
           <w:rPr>
             <w:rStyle w:val="Hyperlink"/>
@@ -14106,8 +14129,8 @@
         <w:t xml:space="preserve">.</w:t>
       </w:r>
     </w:p>
-    <w:bookmarkEnd w:id="183"/>
-    <w:bookmarkStart w:id="185" w:name="ref-shi2016edge"/>
+    <w:bookmarkEnd w:id="184"/>
+    <w:bookmarkStart w:id="186" w:name="ref-shi2016edge"/>
     <w:p>
       <w:pPr>
         <w:pStyle w:val="Bibliography"/>
@@ -14140,7 +14163,7 @@
       <w:r>
         <w:t xml:space="preserve"> </w:t>
       </w:r>
-      <w:hyperlink r:id="rId184">
+      <w:hyperlink r:id="rId185">
         <w:r>
           <w:rPr>
             <w:rStyle w:val="Hyperlink"/>
@@ -14152,8 +14175,8 @@
         <w:t xml:space="preserve">.</w:t>
       </w:r>
     </w:p>
-    <w:bookmarkEnd w:id="185"/>
-    <w:bookmarkStart w:id="187" w:name="ref-simeoni2025dinov3"/>
+    <w:bookmarkEnd w:id="186"/>
+    <w:bookmarkStart w:id="188" w:name="ref-simeoni2025dinov3"/>
     <w:p>
       <w:pPr>
         <w:pStyle w:val="Bibliography"/>
@@ -14187,7 +14210,7 @@
       <w:r>
         <w:t xml:space="preserve"> </w:t>
       </w:r>
-      <w:hyperlink r:id="rId186">
+      <w:hyperlink r:id="rId187">
         <w:r>
           <w:rPr>
             <w:rStyle w:val="Hyperlink"/>
@@ -14199,8 +14222,8 @@
         <w:t xml:space="preserve">.</w:t>
       </w:r>
     </w:p>
-    <w:bookmarkEnd w:id="187"/>
-    <w:bookmarkStart w:id="189" w:name="ref-singh2020plantdoc"/>
+    <w:bookmarkEnd w:id="188"/>
+    <w:bookmarkStart w:id="190" w:name="ref-singh2020plantdoc"/>
     <w:p>
       <w:pPr>
         <w:pStyle w:val="Bibliography"/>
@@ -14236,7 +14259,7 @@
       <w:r>
         <w:t xml:space="preserve"> </w:t>
       </w:r>
-      <w:hyperlink r:id="rId188">
+      <w:hyperlink r:id="rId189">
         <w:r>
           <w:rPr>
             <w:rStyle w:val="Hyperlink"/>
@@ -14248,8 +14271,8 @@
         <w:t xml:space="preserve">.</w:t>
       </w:r>
     </w:p>
-    <w:bookmarkEnd w:id="189"/>
-    <w:bookmarkStart w:id="190" w:name="ref-tan2019efficientnet"/>
+    <w:bookmarkEnd w:id="190"/>
+    <w:bookmarkStart w:id="191" w:name="ref-tan2019efficientnet"/>
     <w:p>
       <w:pPr>
         <w:pStyle w:val="Bibliography"/>
@@ -14283,8 +14306,8 @@
         <w:t xml:space="preserve">, 6105–14.</w:t>
       </w:r>
     </w:p>
-    <w:bookmarkEnd w:id="190"/>
-    <w:bookmarkStart w:id="192" w:name="ref-teerapittayanon2016branchynet"/>
+    <w:bookmarkEnd w:id="191"/>
+    <w:bookmarkStart w:id="193" w:name="ref-teerapittayanon2016branchynet"/>
     <w:p>
       <w:pPr>
         <w:pStyle w:val="Bibliography"/>
@@ -14320,7 +14343,7 @@
       <w:r>
         <w:t xml:space="preserve"> </w:t>
       </w:r>
-      <w:hyperlink r:id="rId191">
+      <w:hyperlink r:id="rId192">
         <w:r>
           <w:rPr>
             <w:rStyle w:val="Hyperlink"/>
@@ -14332,8 +14355,8 @@
         <w:t xml:space="preserve">.</w:t>
       </w:r>
     </w:p>
-    <w:bookmarkEnd w:id="192"/>
-    <w:bookmarkStart w:id="194" w:name="ref-teerapittayanon2017ddnn"/>
+    <w:bookmarkEnd w:id="193"/>
+    <w:bookmarkStart w:id="195" w:name="ref-teerapittayanon2017ddnn"/>
     <w:p>
       <w:pPr>
         <w:pStyle w:val="Bibliography"/>
@@ -14363,7 +14386,7 @@
       <w:r>
         <w:t xml:space="preserve"> </w:t>
       </w:r>
-      <w:hyperlink r:id="rId193">
+      <w:hyperlink r:id="rId194">
         <w:r>
           <w:rPr>
             <w:rStyle w:val="Hyperlink"/>
@@ -14375,8 +14398,8 @@
         <w:t xml:space="preserve">.</w:t>
       </w:r>
     </w:p>
-    <w:bookmarkEnd w:id="194"/>
-    <w:bookmarkStart w:id="196" w:name="ref-viola2001cascade"/>
+    <w:bookmarkEnd w:id="195"/>
+    <w:bookmarkStart w:id="197" w:name="ref-viola2001cascade"/>
     <w:p>
       <w:pPr>
         <w:pStyle w:val="Bibliography"/>
@@ -14409,7 +14432,7 @@
       <w:r>
         <w:t xml:space="preserve"> </w:t>
       </w:r>
-      <w:hyperlink r:id="rId195">
+      <w:hyperlink r:id="rId196">
         <w:r>
           <w:rPr>
             <w:rStyle w:val="Hyperlink"/>
@@ -14421,8 +14444,8 @@
         <w:t xml:space="preserve">.</w:t>
       </w:r>
     </w:p>
-    <w:bookmarkEnd w:id="196"/>
-    <w:bookmarkStart w:id="197" w:name="ref-wang2018idk"/>
+    <w:bookmarkEnd w:id="197"/>
+    <w:bookmarkStart w:id="198" w:name="ref-wang2018idk"/>
     <w:p>
       <w:pPr>
         <w:pStyle w:val="Bibliography"/>
@@ -14459,8 +14482,8 @@
         <w:t xml:space="preserve">.</w:t>
       </w:r>
     </w:p>
-    <w:bookmarkEnd w:id="197"/>
-    <w:bookmarkStart w:id="199" w:name="ref-wei2024mvpdr"/>
+    <w:bookmarkEnd w:id="198"/>
+    <w:bookmarkStart w:id="200" w:name="ref-wei2024mvpdr"/>
     <w:p>
       <w:pPr>
         <w:pStyle w:val="Bibliography"/>
@@ -14490,7 +14513,7 @@
       <w:r>
         <w:t xml:space="preserve"> </w:t>
       </w:r>
-      <w:hyperlink r:id="rId198">
+      <w:hyperlink r:id="rId199">
         <w:r>
           <w:rPr>
             <w:rStyle w:val="Hyperlink"/>
@@ -14502,8 +14525,8 @@
         <w:t xml:space="preserve">.</w:t>
       </w:r>
     </w:p>
-    <w:bookmarkEnd w:id="199"/>
-    <w:bookmarkStart w:id="201" w:name="ref-wei2024plantwild"/>
+    <w:bookmarkEnd w:id="200"/>
+    <w:bookmarkStart w:id="202" w:name="ref-wei2024plantwild"/>
     <w:p>
       <w:pPr>
         <w:pStyle w:val="Bibliography"/>
@@ -14533,7 +14556,7 @@
       <w:r>
         <w:t xml:space="preserve"> </w:t>
       </w:r>
-      <w:hyperlink r:id="rId200">
+      <w:hyperlink r:id="rId201">
         <w:r>
           <w:rPr>
             <w:rStyle w:val="Hyperlink"/>
@@ -14545,8 +14568,8 @@
         <w:t xml:space="preserve">.</w:t>
       </w:r>
     </w:p>
-    <w:bookmarkEnd w:id="201"/>
-    <w:bookmarkStart w:id="203" w:name="ref-wolfert2017bigdata"/>
+    <w:bookmarkEnd w:id="202"/>
+    <w:bookmarkStart w:id="204" w:name="ref-wolfert2017bigdata"/>
     <w:p>
       <w:pPr>
         <w:pStyle w:val="Bibliography"/>
@@ -14579,7 +14602,7 @@
       <w:r>
         <w:t xml:space="preserve"> </w:t>
       </w:r>
-      <w:hyperlink r:id="rId202">
+      <w:hyperlink r:id="rId203">
         <w:r>
           <w:rPr>
             <w:rStyle w:val="Hyperlink"/>
@@ -14591,8 +14614,8 @@
         <w:t xml:space="preserve">.</w:t>
       </w:r>
     </w:p>
-    <w:bookmarkEnd w:id="203"/>
-    <w:bookmarkStart w:id="205" w:name="ref-wu2023fromlaboratoryto"/>
+    <w:bookmarkEnd w:id="204"/>
+    <w:bookmarkStart w:id="206" w:name="ref-wu2023fromlaboratoryto"/>
     <w:p>
       <w:pPr>
         <w:pStyle w:val="Bibliography"/>
@@ -14625,7 +14648,7 @@
       <w:r>
         <w:t xml:space="preserve"> </w:t>
       </w:r>
-      <w:hyperlink r:id="rId204">
+      <w:hyperlink r:id="rId205">
         <w:r>
           <w:rPr>
             <w:rStyle w:val="Hyperlink"/>
@@ -14637,10 +14660,10 @@
         <w:t xml:space="preserve">.</w:t>
       </w:r>
     </w:p>
-    <w:bookmarkEnd w:id="205"/>
     <w:bookmarkEnd w:id="206"/>
     <w:bookmarkEnd w:id="207"/>
-    <w:bookmarkStart w:id="209" w:name="app:adaptations"/>
+    <w:bookmarkEnd w:id="208"/>
+    <w:bookmarkStart w:id="210" w:name="app:adaptations"/>
     <w:p>
       <w:pPr>
         <w:pStyle w:val="Heading1"/>
@@ -14681,7 +14704,7 @@
         <w:t xml:space="preserve"> 3.3.0). Running it on the embedded testbed required the adaptations below, listed so that the deployment can be reproduced on the same hardware generation. Each adaptation was verified against the reference pipeline (Table 5).</w:t>
       </w:r>
     </w:p>
-    <w:bookmarkStart w:id="208" w:name="tab:adaptations"/>
+    <w:bookmarkStart w:id="209" w:name="tab:adaptations"/>
     <w:p>
       <w:pPr>
         <w:pStyle w:val="TableCaption"/>
@@ -16497,8 +16520,8 @@
         </w:tc>
       </w:tr>
     </w:tbl>
-    <w:bookmarkEnd w:id="208"/>
     <w:bookmarkEnd w:id="209"/>
+    <w:bookmarkEnd w:id="210"/>
     <w:sectPr>
       <w:footnotePr>
         <w:numRestart w:val="eachSect"/>

</xml_diff>

<commit_message>
Title page: postal addresses and co-author e-mails
Co-Authored-By: Claude Opus 5.5 <noreply@anthropic.com>
</commit_message>
<xml_diff>
--- a/paper/main.docx
+++ b/paper/main.docx
@@ -63,7 +63,7 @@
         <w:t xml:space="preserve">a</w:t>
       </w:r>
       <w:r>
-        <w:t xml:space="preserve">Scientific Research and Innovation Laboratory, Higher School of Technology, Ibn Tofail University, Kenitra, Morocco</w:t>
+        <w:t xml:space="preserve">Scientific Research and Innovation Laboratory, Higher School of Technology, Ibn Tofail University, Campus Universitaire, B.P. 242, 14000 Kenitra, Morocco</w:t>
       </w:r>
     </w:p>
     <w:p>
@@ -77,7 +77,7 @@
         <w:t xml:space="preserve">b</w:t>
       </w:r>
       <w:r>
-        <w:t xml:space="preserve">Laboratory of Advanced Systems Engineering, National School of Applied Engineering, Ibn Tofail University, Kenitra, Morocco</w:t>
+        <w:t xml:space="preserve">Laboratory of Advanced Systems Engineering, National School of Applied Engineering, Ibn Tofail University, Campus Universitaire, B.P. 241, 14000 Kenitra, Morocco</w:t>
       </w:r>
     </w:p>
     <w:p>
@@ -92,6 +92,14 @@
       </w:r>
       <w:r>
         <w:t xml:space="preserve">Corresponding author: youssef.natij@uit.ac.ma</w:t>
+      </w:r>
+    </w:p>
+    <w:p>
+      <w:pPr>
+        <w:pStyle w:val="BodyText"/>
+      </w:pPr>
+      <w:r>
+        <w:t xml:space="preserve">E-mail addresses: youssef.natij@uit.ac.ma (Y. Natij), hajar.elkarch@uit.ac.ma (H. El Karch), abdelkader.mezouari1@uit.ac.ma (A. Mezouari)</w:t>
       </w:r>
     </w:p>
     <w:bookmarkStart w:id="9" w:name="highlights"/>

</xml_diff>

<commit_message>
Manuscript: short captions, explanations in the text
Co-Authored-By: Claude Opus 5.5 <noreply@anthropic.com>
</commit_message>
<xml_diff>
--- a/paper/main.docx
+++ b/paper/main.docx
@@ -3510,7 +3510,7 @@
           <wp:inline>
             <wp:extent cx="5024612" cy="1703414"/>
             <wp:effectExtent b="0" l="0" r="0" t="0"/>
-            <wp:docPr descr="Figure 1. System overview. Each farm node runs the edge model on every image, answers the farmer immediately, and computes the margin m(x) between its two most probable classes. Only uncertain images (m&lt;\tau) are uploaded, resized to a 448 px shorter side, to the cloud node’s queue; the cloud processes its queue in batches, backbone by backbone with one chunk engine in memory at a time, and returns the ensemble’s diagnosis (Section 5.4). All traffic travels over an encrypted WireGuard overlay. In our testbed the four farm nodes are independent processes on one Raspberry Pi 5 (Section 4.4)." title="" id="28" name="Picture"/>
+            <wp:docPr descr="Figure 1. System overview: selective edge–cloud escalation." title="" id="28" name="Picture"/>
             <a:graphic>
               <a:graphicData uri="http://schemas.openxmlformats.org/drawingml/2006/picture">
                 <pic:pic>
@@ -3553,7 +3553,34 @@
         <w:pStyle w:val="ImageCaption"/>
       </w:pPr>
       <w:r>
-        <w:t xml:space="preserve">Figure 1. System overview. Each farm node runs the edge model on every image, answers the farmer immediately, and computes the margin</w:t>
+        <w:t xml:space="preserve">Figure 1. System overview: selective edge–cloud escalation.</w:t>
+      </w:r>
+    </w:p>
+    <w:bookmarkEnd w:id="30"/>
+    <w:bookmarkStart w:id="35" w:name="sec:architecture"/>
+    <w:p>
+      <w:pPr>
+        <w:pStyle w:val="Heading2"/>
+      </w:pPr>
+      <w:r>
+        <w:rPr>
+          <w:rStyle w:val="SectionNumber"/>
+        </w:rPr>
+        <w:t xml:space="preserve">4.1</w:t>
+      </w:r>
+      <w:r>
+        <w:tab/>
+      </w:r>
+      <w:r>
+        <w:t xml:space="preserve">System architecture</w:t>
+      </w:r>
+    </w:p>
+    <w:p>
+      <w:pPr>
+        <w:pStyle w:val="FirstParagraph"/>
+      </w:pPr>
+      <w:r>
+        <w:t xml:space="preserve">Figure 1 summarises how one image travels through the system: each farm node runs the edge model on every image, answers the farmer immediately and computes the margin</w:t>
       </w:r>
       <w:r>
         <w:t xml:space="preserve"> </w:t>
@@ -3582,7 +3609,7 @@
         <w:t xml:space="preserve"> </w:t>
       </w:r>
       <w:r>
-        <w:t xml:space="preserve">between its two most probable classes. Only uncertain images (</w:t>
+        <w:t xml:space="preserve">between its two most probable classes; only uncertain images (</w:t>
       </w:r>
       <m:oMath>
         <m:r>
@@ -3599,34 +3626,7 @@
         </m:r>
       </m:oMath>
       <w:r>
-        <w:t xml:space="preserve">) are uploaded, resized to a 448 px shorter side, to the cloud node’s queue; the cloud processes its queue in batches, backbone by backbone with one chunk engine in memory at a time, and returns the ensemble’s diagnosis (Section 5.4). All traffic travels over an encrypted WireGuard overlay. In our testbed the four farm nodes are independent processes on one Raspberry Pi 5 (Section 4.4).</w:t>
-      </w:r>
-    </w:p>
-    <w:bookmarkEnd w:id="30"/>
-    <w:bookmarkStart w:id="35" w:name="sec:architecture"/>
-    <w:p>
-      <w:pPr>
-        <w:pStyle w:val="Heading2"/>
-      </w:pPr>
-      <w:r>
-        <w:rPr>
-          <w:rStyle w:val="SectionNumber"/>
-        </w:rPr>
-        <w:t xml:space="preserve">4.1</w:t>
-      </w:r>
-      <w:r>
-        <w:tab/>
-      </w:r>
-      <w:r>
-        <w:t xml:space="preserve">System architecture</w:t>
-      </w:r>
-    </w:p>
-    <w:p>
-      <w:pPr>
-        <w:pStyle w:val="FirstParagraph"/>
-      </w:pPr>
-      <w:r>
-        <w:t xml:space="preserve">Figure 2 shows the system as deployed. It has three tiers, each a set of independent services that communicate only through small HTTP/JSON interfaces. The</w:t>
+        <w:t xml:space="preserve">) are uploaded, resized to a 448 px shorter side, to the cloud node’s queue, which is processed in batches, backbone by backbone with one chunk engine in memory at a time (Section 5.4), and the ensemble’s diagnosis is returned. All traffic travels over an encrypted WireGuard overlay. Figure 2 shows the system as deployed. It has three tiers, each a set of independent services that communicate only through small HTTP/JSON interfaces. The</w:t>
       </w:r>
       <w:r>
         <w:t xml:space="preserve"> </w:t>
@@ -3731,7 +3731,7 @@
           <wp:inline>
             <wp:extent cx="5006263" cy="2871644"/>
             <wp:effectExtent b="0" l="0" r="0" t="0"/>
-            <wp:docPr descr="Figure 2. System architecture as deployed. Three tiers of independent services communicate through HTTP/JSON interfaces: (1) a capture is sent to its farm’s edge service, (2) which answers immediately; (3) uncertain images are additionally queued on the cloud node, (4) which processes its queue twice a day and returns the ensemble’s confirmed diagnoses. In our testbed the four edge services share one Raspberry Pi 5 (Section 4.4) and the operations tier runs on the workstation." title="" id="32" name="Picture"/>
+            <wp:docPr descr="Figure 2. System architecture as deployed." title="" id="32" name="Picture"/>
             <a:graphic>
               <a:graphicData uri="http://schemas.openxmlformats.org/drawingml/2006/picture">
                 <pic:pic>
@@ -3774,7 +3774,7 @@
         <w:pStyle w:val="ImageCaption"/>
       </w:pPr>
       <w:r>
-        <w:t xml:space="preserve">Figure 2. System architecture as deployed. Three tiers of independent services communicate through HTTP/JSON interfaces: (1) a capture is sent to its farm’s edge service, (2) which answers immediately; (3) uncertain images are additionally queued on the cloud node, (4) which processes its queue twice a day and returns the ensemble’s confirmed diagnoses. In our testbed the four edge services share one Raspberry Pi 5 (Section 4.4) and the operations tier runs on the workstation.</w:t>
+        <w:t xml:space="preserve">Figure 2. System architecture as deployed.</w:t>
       </w:r>
     </w:p>
     <w:bookmarkEnd w:id="34"/>
@@ -4294,7 +4294,7 @@
         <w:pStyle w:val="FirstParagraph"/>
       </w:pPr>
       <w:r>
-        <w:t xml:space="preserve">Field photographs are often far larger than the cloud model needs: some PlantWild images exceed 12 megapixels, while the cloud backbones operate at 224–336 px. Uploading at the camera’s resolution therefore wastes most of the escalated bytes. The edge instead resizes an escalated image so that its shorter side is 448 px and encodes it as JPEG at quality 90. Table 2 shows the trade-off measured with the reference cloud pipeline: at 448 px the cloud returns the same diagnosis as from the original photograph for 97.7 % of images, for 2.5</w:t>
+        <w:t xml:space="preserve">Field photographs are often far larger than the cloud model needs: some PlantWild images exceed 12 megapixels, while the cloud backbones operate at 224–336 px. Uploading at the camera’s resolution therefore wastes most of the escalated bytes. The edge instead resizes an escalated image so that its shorter side is 448 px and encodes it as JPEG at quality 90. Table 2 shows the trade-off on 300 test images measured with the reference cloud pipeline: at 448 px the cloud returns the same diagnosis as from the original photograph for 97.7 % of images, for 2.5</w:t>
       </w:r>
       <m:oMath>
         <m:r>
@@ -4308,7 +4308,7 @@
         <w:t xml:space="preserve"> </w:t>
       </w:r>
       <w:r>
-        <w:t xml:space="preserve">fewer bytes than a full-resolution upload. The always-cloud baseline in the deployment uses the identical payload, so the measured reduction factor isolates the effect of selective escalation.</w:t>
+        <w:t xml:space="preserve">fewer bytes than a full-resolution upload. Agreement is the fraction of images for which the cloud’s diagnosis from the payload equals its diagnosis from the original file, which averages 162 KB. The always-cloud baseline in the deployment uses the identical payload, so the measured reduction factor isolates the effect of selective escalation.</w:t>
       </w:r>
     </w:p>
     <w:bookmarkStart w:id="38" w:name="tab:payload"/>
@@ -4317,7 +4317,7 @@
         <w:pStyle w:val="TableCaption"/>
       </w:pPr>
       <w:r>
-        <w:t xml:space="preserve">Table 2. Escalation payload policy (300 test images, reference cloud pipeline). Agreement is the fraction of images for which the cloud’s diagnosis from the payload equals its diagnosis from the original file (162 KB on average).</w:t>
+        <w:t xml:space="preserve">Table 2. Escalation payload policy.</w:t>
       </w:r>
     </w:p>
     <w:tbl>
@@ -4325,7 +4325,7 @@
         <w:tblStyle w:val="Table"/>
         <w:tblW w:type="auto" w:w="0"/>
         <w:tblLook w:firstRow="1" w:lastRow="0" w:firstColumn="0" w:lastColumn="0" w:noHBand="0" w:noVBand="0" w:val="0020"/>
-        <w:tblCaption w:val="Table 2. Escalation payload policy (300 test images, reference cloud pipeline). Agreement is the fraction of images for which the cloud’s diagnosis from the payload equals its diagnosis from the original file (162 KB on average)."/>
+        <w:tblCaption w:val="Table 2. Escalation payload policy."/>
       </w:tblPr>
       <w:tblGrid>
         <w:gridCol w:w="1980"/>
@@ -5285,9 +5285,9 @@
       <w:r>
         <w:drawing>
           <wp:inline>
-            <wp:extent cx="5024612" cy="1140706"/>
+            <wp:extent cx="5024612" cy="1143764"/>
             <wp:effectExtent b="0" l="0" r="0" t="0"/>
-            <wp:docPr descr="Figure 3. Porting the cloud ensemble to the Jetson Nano. The model is decoupled from its framework on the workstation and compiled chunk by chunk on the device; the blue labels give the fidelity check passed at each stage (Table 5)." title="" id="48" name="Picture"/>
+            <wp:docPr descr="Figure 3. Porting the cloud ensemble to the Jetson Nano." title="" id="48" name="Picture"/>
             <a:graphic>
               <a:graphicData uri="http://schemas.openxmlformats.org/drawingml/2006/picture">
                 <pic:pic>
@@ -5306,7 +5306,7 @@
                   <pic:spPr bwMode="auto">
                     <a:xfrm>
                       <a:off x="0" y="0"/>
-                      <a:ext cx="5024612" cy="1140706"/>
+                      <a:ext cx="5024612" cy="1143764"/>
                     </a:xfrm>
                     <a:prstGeom prst="rect">
                       <a:avLst/>
@@ -5330,7 +5330,7 @@
         <w:pStyle w:val="ImageCaption"/>
       </w:pPr>
       <w:r>
-        <w:t xml:space="preserve">Figure 3. Porting the cloud ensemble to the Jetson Nano. The model is decoupled from its framework on the workstation and compiled chunk by chunk on the device; the blue labels give the fidelity check passed at each stage (Table 5).</w:t>
+        <w:t xml:space="preserve">Figure 3. Porting the cloud ensemble to the Jetson Nano.</w:t>
       </w:r>
     </w:p>
     <w:bookmarkEnd w:id="50"/>
@@ -5340,7 +5340,7 @@
         <w:pStyle w:val="TableCaption"/>
       </w:pPr>
       <w:r>
-        <w:t xml:space="preserve">Table 4. The decisive obstacles of the port, their causes and the adaptations that resolved them (all items: Appendix A).</w:t>
+        <w:t xml:space="preserve">Table 4. Decisive obstacles of the port, their causes and the adaptations that resolved them.</w:t>
       </w:r>
     </w:p>
     <w:tbl>
@@ -5349,7 +5349,7 @@
         <w:tblW w:type="pct" w:w="4959"/>
         <w:tblLayout w:type="fixed"/>
         <w:tblLook w:firstRow="1" w:lastRow="0" w:firstColumn="0" w:lastColumn="0" w:noHBand="0" w:noVBand="0" w:val="0020"/>
-        <w:tblCaption w:val="Table 4. The decisive obstacles of the port, their causes and the adaptations that resolved them (all items: Appendix A)."/>
+        <w:tblCaption w:val="Table 4. Decisive obstacles of the port, their causes and the adaptations that resolved them."/>
       </w:tblPr>
       <w:tblGrid>
         <w:gridCol w:w="1215"/>
@@ -5907,7 +5907,7 @@
         <w:t xml:space="preserve"> </w:t>
       </w:r>
       <w:r>
-        <w:t xml:space="preserve">at opset 13, the newest opset that TensorRT 8.2 parses (Fig. 3). Fused scaled-dot-product attention has no opset-13 equivalent, so attention is traced in its explicit</w:t>
+        <w:t xml:space="preserve">at opset 13, the newest opset that TensorRT 8.2 parses (Fig. 3). The blue labels in the figure give the fidelity check passed at each stage, detailed in Section 5.5. Fused scaled-dot-product attention has no opset-13 equivalent, so attention is traced in its explicit</w:t>
       </w:r>
       <w:r>
         <w:t xml:space="preserve"> </w:t>
@@ -6037,7 +6037,7 @@
         <w:pStyle w:val="FirstParagraph"/>
       </w:pPr>
       <w:r>
-        <w:t xml:space="preserve">A whole ViT-L cannot be compiled on the Nano: TensorRT’s ONNX parser alone peaks at 2.75 GB of RAM for a 0.6 GB fp16 graph, before the builder has started (Fig. 4b). Each backbone is therefore exported as four consecutive chunks of six transformer blocks (the first also holding the patch embedding, the last the pooling and projection), converted to fp16 weights with LayerNorm arithmetic kept in fp32, and compiled into a TensorRT engine</w:t>
+        <w:t xml:space="preserve">A whole ViT-L cannot be compiled on the Nano: TensorRT’s ONNX parser alone peaks at 2.75 GB of RAM for a 0.6 GB fp16 graph, before the builder has started (Fig. 4b). Figure 4b compares the memory each step of the port needs with the board’s shared CPU/GPU memory; the grey bars are the steps that did not fit. Each backbone is therefore exported as four consecutive chunks of six transformer blocks (the first also holding the patch embedding, the last the pooling and projection), converted to fp16 weights with LayerNorm arithmetic kept in fp32, and compiled into a TensorRT engine</w:t>
       </w:r>
       <w:r>
         <w:t xml:space="preserve"> </w:t>
@@ -6096,7 +6096,7 @@
           <wp:inline>
             <wp:extent cx="5334000" cy="2538487"/>
             <wp:effectExtent b="0" l="0" r="0" t="0"/>
-            <wp:docPr descr="Figure 4. Why the port takes the shape it does. (a) Largest residual-stream activation per transformer block over 64 test images (fp32 reference): DINOv3 carries activations of about 1.6{\times}10^{5} from its first block onwards, above the largest fp16 value, whereas DINOv2 and CLIP stay below 500. (b) Memory needed at each step of the port against the board’s shared CPU/GPU memory; grey bars did not fit." title="" id="54" name="Picture"/>
+            <wp:docPr descr="Figure 4. Activation ranges and memory requirements of the port. (a) Largest residual-stream activation per transformer block. (b) Memory needed at each step of the port." title="" id="54" name="Picture"/>
             <a:graphic>
               <a:graphicData uri="http://schemas.openxmlformats.org/drawingml/2006/picture">
                 <pic:pic>
@@ -6139,39 +6139,7 @@
         <w:pStyle w:val="ImageCaption"/>
       </w:pPr>
       <w:r>
-        <w:t xml:space="preserve">Figure 4. Why the port takes the shape it does. (a) Largest residual-stream activation per transformer block over 64 test images (fp32 reference): DINOv3 carries activations of about</w:t>
-      </w:r>
-      <w:r>
-        <w:t xml:space="preserve"> </w:t>
-      </w:r>
-      <m:oMath>
-        <m:r>
-          <m:t>1.6</m:t>
-        </m:r>
-        <m:r>
-          <m:rPr>
-            <m:sty m:val="p"/>
-          </m:rPr>
-          <m:t>×</m:t>
-        </m:r>
-        <m:sSup>
-          <m:e>
-            <m:r>
-              <m:t>10</m:t>
-            </m:r>
-          </m:e>
-          <m:sup>
-            <m:r>
-              <m:t>5</m:t>
-            </m:r>
-          </m:sup>
-        </m:sSup>
-      </m:oMath>
-      <w:r>
-        <w:t xml:space="preserve"> </w:t>
-      </w:r>
-      <w:r>
-        <w:t xml:space="preserve">from its first block onwards, above the largest fp16 value, whereas DINOv2 and CLIP stay below 500. (b) Memory needed at each step of the port against the board’s shared CPU/GPU memory; grey bars did not fit.</w:t>
+        <w:t xml:space="preserve">Figure 4. Activation ranges and memory requirements of the port. (a) Largest residual-stream activation per transformer block. (b) Memory needed at each step of the port.</w:t>
       </w:r>
     </w:p>
     <w:bookmarkEnd w:id="56"/>
@@ -6199,7 +6167,7 @@
         <w:pStyle w:val="FirstParagraph"/>
       </w:pPr>
       <w:r>
-        <w:t xml:space="preserve">Half precision halves weights and load time, but it does not suit every backbone. Our first fp16 build of DINOv3 produced NaN features. The natural suspect, LayerNorm overflowing in fp16, was wrong: pinning LayerNorm, and then every non-convolution layer, to fp32 changed nothing. Profiling the reference model (Fig. 4a) located the cause: DINOv3’s residual stream carries activations of up to 158 259 from its first block onwards, beyond the largest fp16 value (65 504), whereas DINOv2 and CLIP peak at 403 and 225. DINOv2 therefore runs in fp16 and DINOv3 in fp32. CLIP was moved to fp32 as well while we investigated a deviation that we later traced to the image library rather than to precision (Section 5.5). A later check confirmed that fp32 is unnecessary for CLIP: fp16 CLIP engines reproduce the fp32 ones to a cosine of at least 0.9998 on the 24 reference images, with the same pipeline agreement, while cutting CLIP’s compute from 1 613 to 1 158 ms per image and its loading from 19 to 10 s. The replay reported here used fp32 CLIP; fp16 is the better choice for new deployments.</w:t>
+        <w:t xml:space="preserve">Half precision halves weights and load time, but it does not suit every backbone. Our first fp16 build of DINOv3 produced NaN features. The natural suspect, LayerNorm overflowing in fp16, was wrong: pinning LayerNorm, and then every non-convolution layer, to fp32 changed nothing. Profiling the reference model (Fig. 4a) on 64 test images located the cause: DINOv3’s residual stream carries activations of up to 158 259 from its first block onwards, beyond the largest fp16 value (65 504), whereas DINOv2 and CLIP peak at 403 and 225. DINOv2 therefore runs in fp16 and DINOv3 in fp32. CLIP was moved to fp32 as well while we investigated a deviation that we later traced to the image library rather than to precision (Section 5.5). A later check confirmed that fp32 is unnecessary for CLIP: fp16 CLIP engines reproduce the fp32 ones to a cosine of at least 0.9998 on the 24 reference images, with the same pipeline agreement, while cutting CLIP’s compute from 1 613 to 1 158 ms per image and its loading from 19 to 10 s. The replay reported here used fp32 CLIP; fp16 is the better choice for new deployments.</w:t>
       </w:r>
     </w:p>
     <w:bookmarkEnd w:id="58"/>
@@ -6265,7 +6233,7 @@
         <w:t xml:space="preserve"> </w:t>
       </w:r>
       <w:r>
-        <w:t xml:space="preserve">about eight times per second (Fig. 5). Memory use never exceeds 2.32 GB of the 3.86 GB (1.97 GB at idle, including the operating system and the idle server): processing a batch adds only about 0.34 GB, the footprint of one chunk engine. The board draws 6.3 W on average while processing a batch (1.2 W at idle, 7.9 W at most), and a batch takes 6.1 min. Each escalated image costs 49 J of board energy including its share of model loading, or 40 J above the idle draw — about 14 Wh per thousand escalated images.</w:t>
+        <w:t xml:space="preserve">about eight times per second (Fig. 5). In the figure, shading marks the backbone being processed; the twelve dips in power are the twelve chunk-engine loads, between which the GPU passes all queued images through the resident chunk. The dashed lines mark the board’s total shared memory and its idle power draw. Memory use never exceeds 2.32 GB of the 3.86 GB (1.97 GB at idle, including the operating system and the idle server): processing a batch adds only about 0.34 GB, the footprint of one chunk engine. The board draws 6.3 W on average while processing a batch (1.2 W at idle, 7.9 W at most), and a batch takes 6.1 min. Each escalated image costs 49 J of board energy including its share of model loading, or 40 J above the idle draw — about 14 Wh per thousand escalated images.</w:t>
       </w:r>
     </w:p>
     <w:bookmarkStart w:id="62" w:name="fig:nano-flush"/>
@@ -6278,7 +6246,7 @@
           <wp:inline>
             <wp:extent cx="5334000" cy="2669911"/>
             <wp:effectExtent b="0" l="0" r="0" t="0"/>
-            <wp:docPr descr="Figure 5. Memory and power of the Jetson Nano during one batch of 48 escalated images, measured with tegrastats. Shading marks the backbone being processed. Each backbone runs as four chunk engines loaded one at a time: the twelve dips in power are the twelve engine loads, between which the GPU processes all queued images through the resident chunk. The dashed line in the upper panel is the board’s total shared memory; in the lower panel, the idle power draw." title="" id="60" name="Picture"/>
+            <wp:docPr descr="Figure 5. Jetson Nano memory and board power during one batch of 48 escalated images." title="" id="60" name="Picture"/>
             <a:graphic>
               <a:graphicData uri="http://schemas.openxmlformats.org/drawingml/2006/picture">
                 <pic:pic>
@@ -6321,19 +6289,7 @@
         <w:pStyle w:val="ImageCaption"/>
       </w:pPr>
       <w:r>
-        <w:t xml:space="preserve">Figure 5. Memory and power of the Jetson Nano during one batch of 48 escalated images, measured with</w:t>
-      </w:r>
-      <w:r>
-        <w:t xml:space="preserve"> </w:t>
-      </w:r>
-      <w:r>
-        <w:rPr>
-          <w:rStyle w:val="VerbatimChar"/>
-        </w:rPr>
-        <w:t xml:space="preserve">tegrastats</w:t>
-      </w:r>
-      <w:r>
-        <w:t xml:space="preserve">. Shading marks the backbone being processed. Each backbone runs as four chunk engines loaded one at a time: the twelve dips in power are the twelve engine loads, between which the GPU processes all queued images through the resident chunk. The dashed line in the upper panel is the board’s total shared memory; in the lower panel, the idle power draw.</w:t>
+        <w:t xml:space="preserve">Figure 5. Jetson Nano memory and board power during one batch of 48 escalated images.</w:t>
       </w:r>
     </w:p>
     <w:bookmarkEnd w:id="62"/>
@@ -6361,7 +6317,7 @@
         <w:pStyle w:val="FirstParagraph"/>
       </w:pPr>
       <w:r>
-        <w:t xml:space="preserve">A port is only useful if it computes the same function, so we verify each stage against the reference pipeline (Table 5). The exported graphs match PyTorch to a cosine similarity of 1.000000, the NumPy preprocessing reproduces the reference tensors exactly, and the NumPy head matches the original to within</w:t>
+        <w:t xml:space="preserve">A port is only useful if it computes the same function, so we verify each stage against the reference pipeline (Table 5). Workstation checks compare against the PyTorch reference; checks on the Nano compare TensorRT outputs with reference features computed on the workstation. The exported graphs match PyTorch to a cosine similarity of 1.000000, the NumPy preprocessing reproduces the reference tensors exactly, and the NumPy head matches the original to within</w:t>
       </w:r>
       <w:r>
         <w:t xml:space="preserve"> </w:t>
@@ -6408,7 +6364,7 @@
         <w:pStyle w:val="TableCaption"/>
       </w:pPr>
       <w:r>
-        <w:t xml:space="preserve">Table 5. Fidelity of the embedded cloud pipeline, verified stage by stage. Desktop checks compare against the PyTorch reference; Nano checks compare TensorRT outputs against reference features computed on the desktop.</w:t>
+        <w:t xml:space="preserve">Table 5. Fidelity of the embedded cloud pipeline, stage by stage.</w:t>
       </w:r>
     </w:p>
     <w:tbl>
@@ -6417,7 +6373,7 @@
         <w:tblW w:type="pct" w:w="4968"/>
         <w:tblLayout w:type="fixed"/>
         <w:tblLook w:firstRow="1" w:lastRow="0" w:firstColumn="0" w:lastColumn="0" w:noHBand="0" w:noVBand="0" w:val="0020"/>
-        <w:tblCaption w:val="Table 5. Fidelity of the embedded cloud pipeline, verified stage by stage. Desktop checks compare against the PyTorch reference; Nano checks compare TensorRT outputs against reference features computed on the desktop."/>
+        <w:tblCaption w:val="Table 5. Fidelity of the embedded cloud pipeline, stage by stage."/>
       </w:tblPr>
       <w:tblGrid>
         <w:gridCol w:w="2211"/>
@@ -7246,7 +7202,7 @@
         <w:pStyle w:val="FirstParagraph"/>
       </w:pPr>
       <w:r>
-        <w:t xml:space="preserve">Table 6 and Fig. 6 compare the three edge models. With MobileNetV3-Small as the edge (61.08 % top-1), the margin rule reaches the 95 % target only at 43.5 % escalation, failing the pre-specified criterion. This failure is not a weakness of the margin rule: a learned router trained on the same edge outputs gained only two points (41.4 % escalation), and adding 1 024-dimensional DINOv2 image features to the router overfitted. For this edge model, every edge-side signal we tried saturated at an AUC of about 0.76–0.79 for predicting useful escalations — the information an edge-side router can see is bounded by the edge model itself.</w:t>
+        <w:t xml:space="preserve">Table 6 and Fig. 6 compare the three edge models. For each model we report the smallest escalation rate at which margin escalation reaches 95 % of always-cloud accuracy (76.17 %), denoted escalation @95 %. In Fig. 6a, dots mark where each model first reaches this target; Fig. 6b plots edge compute against the escalation each model needs, with bubble area proportional to the parameter count, and the dotted lines mark the 30 % escalation budget. With MobileNetV3-Small as the edge (61.08 % top-1), the margin rule reaches the 95 % target only at 43.5 % escalation, failing the pre-specified criterion. This failure is not a weakness of the margin rule: a learned router trained on the same edge outputs gained only two points (41.4 % escalation), and adding 1 024-dimensional DINOv2 image features to the router overfitted. For this edge model, every edge-side signal we tried saturated at an AUC of about 0.76–0.79 for predicting useful escalations — the information an edge-side router can see is bounded by the edge model itself.</w:t>
       </w:r>
     </w:p>
     <w:p>
@@ -7279,25 +7235,13 @@
       <w:r>
         <w:t xml:space="preserve">Table 6. Edge models on the PlantWild test split.</w:t>
       </w:r>
-      <w:r>
-        <w:t xml:space="preserve"> </w:t>
-      </w:r>
-      <w:r>
-        <w:t xml:space="preserve">“Escalation @95 %”</w:t>
-      </w:r>
-      <w:r>
-        <w:t xml:space="preserve"> </w:t>
-      </w:r>
-      <w:r>
-        <w:t xml:space="preserve">is the smallest escalation rate at which margin escalation reaches 95 % of always-cloud accuracy (76.17 %).</w:t>
-      </w:r>
     </w:p>
     <w:tbl>
       <w:tblPr>
         <w:tblStyle w:val="Table"/>
         <w:tblW w:type="auto" w:w="0"/>
         <w:tblLook w:firstRow="1" w:lastRow="0" w:firstColumn="0" w:lastColumn="0" w:noHBand="0" w:noVBand="0" w:val="0020"/>
-        <w:tblCaption w:val="Table 6. Edge models on the PlantWild test split. “Escalation @95 %” is the smallest escalation rate at which margin escalation reaches 95 % of always-cloud accuracy (76.17 %)."/>
+        <w:tblCaption w:val="Table 6. Edge models on the PlantWild test split."/>
       </w:tblPr>
       <w:tblGrid>
         <w:gridCol w:w="1320"/>
@@ -7699,7 +7643,7 @@
           <wp:inline>
             <wp:extent cx="5334000" cy="2455981"/>
             <wp:effectExtent b="0" l="0" r="0" t="0"/>
-            <wp:docPr descr="Figure 6. Edge capacity sets the operating point. (a) Accuracy versus escalation rate under margin escalation for the three edge models; dots mark where each first reaches the 95 % target. (b) Edge compute against the escalation each model needs to reach the target; bubble area is proportional to the parameter count. The dotted lines mark the 30 % escalation budget." title="" id="69" name="Picture"/>
+            <wp:docPr descr="Figure 6. Edge capacity and the escalation it requires. (a) Accuracy versus escalation rate. (b) Edge compute versus escalation needed for the 95 % target." title="" id="69" name="Picture"/>
             <a:graphic>
               <a:graphicData uri="http://schemas.openxmlformats.org/drawingml/2006/picture">
                 <pic:pic>
@@ -7742,7 +7686,7 @@
         <w:pStyle w:val="ImageCaption"/>
       </w:pPr>
       <w:r>
-        <w:t xml:space="preserve">Figure 6. Edge capacity sets the operating point. (a) Accuracy versus escalation rate under margin escalation for the three edge models; dots mark where each first reaches the 95 % target. (b) Edge compute against the escalation each model needs to reach the target; bubble area is proportional to the parameter count. The dotted lines mark the 30 % escalation budget.</w:t>
+        <w:t xml:space="preserve">Figure 6. Edge capacity and the escalation it requires. (a) Accuracy versus escalation rate. (b) Edge compute versus escalation needed for the 95 % target.</w:t>
       </w:r>
     </w:p>
     <w:bookmarkEnd w:id="71"/>
@@ -7794,30 +7738,7 @@
         <w:pStyle w:val="FirstParagraph"/>
       </w:pPr>
       <w:r>
-        <w:t xml:space="preserve">Table 7 and Fig. 7 place the operating points on the bandwidth axis. With the validation-calibrated threshold, margin escalation from MobileNetV3-Large reaches 75.82 % top-1 on the test split — 94.6 % of always-cloud accuracy — while escalating 18.6 % of images: 11.2 KB per diagnosis instead of 60.2 KB, a 5.38-fold reduction. On the validation split, where</w:t>
-      </w:r>
-      <w:r>
-        <w:t xml:space="preserve"> </w:t>
-      </w:r>
-      <m:oMath>
-        <m:r>
-          <m:t>τ</m:t>
-        </m:r>
-      </m:oMath>
-      <w:r>
-        <w:t xml:space="preserve"> </w:t>
-      </w:r>
-      <w:r>
-        <w:t xml:space="preserve">was set, the rule meets the criterion by construction (95.0 % of cloud accuracy at 19.3 % escalation); the 0.4-point shortfall on test is the honest generalisation gap of a threshold fixed in advance. Read directly off the test curve, the 95 % line is crossed at 20.5 % escalation (12.4 KB). The curve is markedly concave: the first escalated images are the most valuable. Escalating 30 % of images already closes 81 % of the gap between edge and cloud accuracy (Table 8), so the last fifth of that gap costs the remaining 70 % of the traffic. Table 8 shows that the three scalar signals are within 1.5 points of each other at every budget; we adopt the margin because it ties for best at the target and is the simplest to interpret.</w:t>
-      </w:r>
-    </w:p>
-    <w:bookmarkStart w:id="73" w:name="tab:headline"/>
-    <w:p>
-      <w:pPr>
-        <w:pStyle w:val="TableCaption"/>
-      </w:pPr>
-      <w:r>
-        <w:t xml:space="preserve">Table 7. Operating points on the PlantWild test split (offline). Absolute bandwidth uses the measured mean payload</w:t>
+        <w:t xml:space="preserve">Table 7 and Fig. 7 place the operating points on the bandwidth axis. Absolute traffic uses the measured mean payload</w:t>
       </w:r>
       <w:r>
         <w:t xml:space="preserve"> </w:t>
@@ -7837,7 +7758,7 @@
         </m:r>
       </m:oMath>
       <w:r>
-        <w:t xml:space="preserve"> KB; the reduction factor does not depend on</w:t>
+        <w:t xml:space="preserve"> KB (Section 3.5); the reduction factor does not depend on</w:t>
       </w:r>
       <w:r>
         <w:t xml:space="preserve"> </w:t>
@@ -7848,7 +7769,30 @@
         </m:r>
       </m:oMath>
       <w:r>
-        <w:t xml:space="preserve">. The lower block reads both routers’ test curves at the same accuracy, for comparison only.</w:t>
+        <w:t xml:space="preserve">. In the figure, the ring marks the operating point with the validation-calibrated threshold, the shaded region the pre-specified success criterion, and the light curve the oracle router, an upper bound for any escalation rule; the lower block of the table reads both routers’ test curves at the same accuracy, for comparison only. With the validation-calibrated threshold, margin escalation from MobileNetV3-Large reaches 75.82 % top-1 on the test split — 94.6 % of always-cloud accuracy — while escalating 18.6 % of images: 11.2 KB per diagnosis instead of 60.2 KB, a 5.38-fold reduction. On the validation split, where</w:t>
+      </w:r>
+      <w:r>
+        <w:t xml:space="preserve"> </w:t>
+      </w:r>
+      <m:oMath>
+        <m:r>
+          <m:t>τ</m:t>
+        </m:r>
+      </m:oMath>
+      <w:r>
+        <w:t xml:space="preserve"> </w:t>
+      </w:r>
+      <w:r>
+        <w:t xml:space="preserve">was set, the rule meets the criterion by construction (95.0 % of cloud accuracy at 19.3 % escalation); the 0.4-point shortfall on test is the honest generalisation gap of a threshold fixed in advance. Read directly off the test curve, the 95 % line is crossed at 20.5 % escalation (12.4 KB). The curve is markedly concave: the first escalated images are the most valuable. Escalating 30 % of images already closes 81 % of the gap between edge and cloud accuracy (Table 8), so the last fifth of that gap costs the remaining 70 % of the traffic. Table 8 shows that the three scalar signals are within 1.5 points of each other at every budget; we adopt the margin because it ties for best at the target and is the simplest to interpret.</w:t>
+      </w:r>
+    </w:p>
+    <w:bookmarkStart w:id="73" w:name="tab:headline"/>
+    <w:p>
+      <w:pPr>
+        <w:pStyle w:val="TableCaption"/>
+      </w:pPr>
+      <w:r>
+        <w:t xml:space="preserve">Table 7. Operating points on the PlantWild test split (offline).</w:t>
       </w:r>
     </w:p>
     <w:tbl>
@@ -7857,7 +7801,7 @@
         <w:tblW w:type="pct" w:w="4883"/>
         <w:tblLayout w:type="fixed"/>
         <w:tblLook w:firstRow="1" w:lastRow="0" w:firstColumn="0" w:lastColumn="0" w:noHBand="0" w:noVBand="0" w:val="0020"/>
-        <w:tblCaption w:val="Table 7. Operating points on the PlantWild test split (offline). Absolute bandwidth uses the measured mean payload S{=}60.2 KB; the reduction factor does not depend on S. The lower block reads both routers’ test curves at the same accuracy, for comparison only."/>
+        <w:tblCaption w:val="Table 7. Operating points on the PlantWild test split (offline)."/>
       </w:tblPr>
       <w:tblGrid>
         <w:gridCol w:w="4021"/>
@@ -8348,7 +8292,7 @@
           <wp:inline>
             <wp:extent cx="5334000" cy="2870810"/>
             <wp:effectExtent b="0" l="0" r="0" t="0"/>
-            <wp:docPr descr="Figure 7. Accuracy versus mean uplink traffic per diagnosis (offline, test split, measured mean payload S{=}60.2 KB). The ring marks the operating point of MobileNetV3-L with the validation-calibrated threshold; the shaded region is the pre-specified success criterion; the light curve is the oracle router, an upper bound for any escalation rule." title="" id="75" name="Picture"/>
+            <wp:docPr descr="Figure 7. Accuracy versus mean uplink per diagnosis (offline, test split)." title="" id="75" name="Picture"/>
             <a:graphic>
               <a:graphicData uri="http://schemas.openxmlformats.org/drawingml/2006/picture">
                 <pic:pic>
@@ -8391,27 +8335,7 @@
         <w:pStyle w:val="ImageCaption"/>
       </w:pPr>
       <w:r>
-        <w:t xml:space="preserve">Figure 7. Accuracy versus mean uplink traffic per diagnosis (offline, test split, measured mean payload</w:t>
-      </w:r>
-      <w:r>
-        <w:t xml:space="preserve"> </w:t>
-      </w:r>
-      <m:oMath>
-        <m:r>
-          <m:t>S</m:t>
-        </m:r>
-        <m:r>
-          <m:rPr>
-            <m:sty m:val="p"/>
-          </m:rPr>
-          <m:t>=</m:t>
-        </m:r>
-        <m:r>
-          <m:t>60.2</m:t>
-        </m:r>
-      </m:oMath>
-      <w:r>
-        <w:t xml:space="preserve"> KB). The ring marks the operating point of MobileNetV3-L with the validation-calibrated threshold; the shaded region is the pre-specified success criterion; the light curve is the oracle router, an upper bound for any escalation rule.</w:t>
+        <w:t xml:space="preserve">Figure 7. Accuracy versus mean uplink per diagnosis (offline, test split).</w:t>
       </w:r>
     </w:p>
     <w:bookmarkEnd w:id="77"/>
@@ -8425,7 +8349,7 @@
           <wp:inline>
             <wp:extent cx="5334000" cy="2327308"/>
             <wp:effectExtent b="0" l="0" r="0" t="0"/>
-            <wp:docPr descr="Figure 8. Where the 3 677 test images go at the calibrated threshold. Band widths are proportional to image counts; blue bands are escalated images. Escalation rescues 289 edge errors and overturns 50 correct edge predictions." title="" id="79" name="Picture"/>
+            <wp:docPr descr="Figure 8. Flow of the 3 677 test images at the calibrated threshold." title="" id="79" name="Picture"/>
             <a:graphic>
               <a:graphicData uri="http://schemas.openxmlformats.org/drawingml/2006/picture">
                 <pic:pic>
@@ -8468,7 +8392,7 @@
         <w:pStyle w:val="ImageCaption"/>
       </w:pPr>
       <w:r>
-        <w:t xml:space="preserve">Figure 8. Where the 3 677 test images go at the calibrated threshold. Band widths are proportional to image counts; blue bands are escalated images. Escalation rescues 289 edge errors and overturns 50 correct edge predictions.</w:t>
+        <w:t xml:space="preserve">Figure 8. Flow of the 3 677 test images at the calibrated threshold.</w:t>
       </w:r>
     </w:p>
     <w:bookmarkEnd w:id="81"/>
@@ -8477,7 +8401,7 @@
         <w:pStyle w:val="BodyText"/>
       </w:pPr>
       <w:r>
-        <w:t xml:space="preserve">Figure 8 follows every test image through the system. Of the 684 escalated images, 468 (68 %) were edge errors, so the margin spends uplink overwhelmingly where it is needed; the cloud rescues 289 of them and overturns 50 correct edge predictions, a net gain of 239 diagnoses. The figure also shows the limit of any edge-side signal: 660 edge errors are made with a confident margin and never leave the farm.</w:t>
+        <w:t xml:space="preserve">Figure 8 follows every test image through the system. Band widths are proportional to image counts, and escalated images are drawn in blue. Of the 684 escalated images, 468 (68 %) were edge errors, so the margin spends uplink overwhelmingly where it is needed; the cloud rescues 289 of them and overturns 50 correct edge predictions, a net gain of 239 diagnoses. The figure also shows the limit of any edge-side signal: 660 edge errors are made with a confident margin and never leave the farm.</w:t>
       </w:r>
     </w:p>
     <w:bookmarkStart w:id="85" w:name="fig:crops"/>
@@ -8490,7 +8414,7 @@
           <wp:inline>
             <wp:extent cx="5334000" cy="5208588"/>
             <wp:effectExtent b="0" l="0" r="0" t="0"/>
-            <wp:docPr descr="Figure 9. Per-crop accuracy before and after escalation (left) and the share of images escalated (right), at the calibrated threshold. Letters give each crop’s farm in the replay (Section 4.4)." title="" id="83" name="Picture"/>
+            <wp:docPr descr="Figure 9. Per-crop accuracy before and after escalation, and per-crop escalation rate." title="" id="83" name="Picture"/>
             <a:graphic>
               <a:graphicData uri="http://schemas.openxmlformats.org/drawingml/2006/picture">
                 <pic:pic>
@@ -8533,7 +8457,7 @@
         <w:pStyle w:val="ImageCaption"/>
       </w:pPr>
       <w:r>
-        <w:t xml:space="preserve">Figure 9. Per-crop accuracy before and after escalation (left) and the share of images escalated (right), at the calibrated threshold. Letters give each crop’s farm in the replay (Section 4.4).</w:t>
+        <w:t xml:space="preserve">Figure 9. Per-crop accuracy before and after escalation, and per-crop escalation rate.</w:t>
       </w:r>
     </w:p>
     <w:bookmarkEnd w:id="85"/>
@@ -8542,7 +8466,7 @@
         <w:pStyle w:val="BodyText"/>
       </w:pPr>
       <w:r>
-        <w:t xml:space="preserve">The rule also adapts across crops without any per-crop tuning (Fig. 9). Escalation ranges from 3 % of raspberry images to 36 % of bean images, and it is strongly anti-correlated with the edge model’s accuracy on the crop (Pearson</w:t>
+        <w:t xml:space="preserve">The rule also adapts across crops without any per-crop tuning (Fig. 9). The figure shows, per crop, accuracy before and after escalation and the share of images escalated; the letters give each crop’s farm in the replay (Section 4.4). Escalation ranges from 3 % of raspberry images to 36 % of bean images, and it is strongly anti-correlated with the edge model’s accuracy on the crop (Pearson</w:t>
       </w:r>
       <w:r>
         <w:t xml:space="preserve"> </w:t>
@@ -9371,7 +9295,7 @@
           <wp:inline>
             <wp:extent cx="5334000" cy="2008544"/>
             <wp:effectExtent b="0" l="0" r="0" t="0"/>
-            <wp:docPr descr="Figure 10. The cloud-supervised verifier against scalar signals. (a) AUC for identifying useful escalations. (b) Uplink per diagnosis at 95 % of cloud accuracy, read off the test curves: the verifier pays a 2.67 KB message for every image and still needs more escalations than the margin." title="" id="90" name="Picture"/>
+            <wp:docPr descr="Figure 10. Cloud-supervised verifier versus scalar signals. (a) Ranking quality (AUC). (b) Uplink per diagnosis at 95 % of cloud accuracy." title="" id="90" name="Picture"/>
             <a:graphic>
               <a:graphicData uri="http://schemas.openxmlformats.org/drawingml/2006/picture">
                 <pic:pic>
@@ -9414,7 +9338,7 @@
         <w:pStyle w:val="ImageCaption"/>
       </w:pPr>
       <w:r>
-        <w:t xml:space="preserve">Figure 10. The cloud-supervised verifier against scalar signals. (a) AUC for identifying useful escalations. (b) Uplink per diagnosis at 95 % of cloud accuracy, read off the test curves: the verifier pays a 2.67 KB message for every image and still needs more escalations than the margin.</w:t>
+        <w:t xml:space="preserve">Figure 10. Cloud-supervised verifier versus scalar signals. (a) Ranking quality (AUC). (b) Uplink per diagnosis at 95 % of cloud accuracy.</w:t>
       </w:r>
     </w:p>
     <w:bookmarkEnd w:id="92"/>
@@ -9442,7 +9366,7 @@
         <w:pStyle w:val="FirstParagraph"/>
       </w:pPr>
       <w:r>
-        <w:t xml:space="preserve">Section 6.1 showed that edge capacity sets the operating point. A more capable edge model need not be a larger one: the cloud ensemble can teach it. We tested this in two ways (Table 10).</w:t>
+        <w:t xml:space="preserve">Section 6.1 showed that edge capacity sets the operating point. A more capable edge model need not be a larger one: the cloud ensemble can teach it. We tested this in two ways (Table 10). Both edge models are evaluated with the same pipeline and with thresholds calibrated on validation; the original model’s figures agree with Table 7 to within 0.1 point.</w:t>
       </w:r>
     </w:p>
     <w:bookmarkStart w:id="94" w:name="distillation-before-deployment"/>
@@ -9532,7 +9456,7 @@
         <w:t xml:space="preserve"> </w:t>
       </w:r>
       <w:r>
-        <w:t xml:space="preserve">of 1 812 images, whose 344 escalated images are used to fine-tune the deployed model (eight short epochs, mixed with replayed training images), and a second week for evaluation. One week of escalations did not improve the edge model, whatever labels the escalated images carried, and the escalation needed for the target rose. A control that fine-tunes on replayed training images alone shows that part of this loss comes from the extra fine-tuning itself; but even farmer-confirmed labels do not help. The 344 images — about four per class, and the hardest the edge sees — are too few to move a model trained on 11 778 images of the same distribution. The value of the loop therefore lies in accumulating escalations over many weeks and in adapting to farms whose images differ from the training data, which an in-distribution benchmark cannot show; distilling the ensemble before deployment is, by contrast, an immediate gain.</w:t>
+        <w:t xml:space="preserve">of 1 812 images, whose 344 escalated images are used to fine-tune the deployed model (eight short epochs, mixed with replayed training images), and a second week for evaluation. Its results are reported on the second week, with escalation @95 % read off the test curve. One week of escalations did not improve the edge model, whatever labels the escalated images carried, and the escalation needed for the target rose. A control that fine-tunes on replayed training images alone shows that part of this loss comes from the extra fine-tuning itself; but even farmer-confirmed labels do not help. The 344 images — about four per class, and the hardest the edge sees — are too few to move a model trained on 11 778 images of the same distribution. The value of the loop therefore lies in accumulating escalations over many weeks and in adapting to farms whose images differ from the training data, which an in-distribution benchmark cannot show; distilling the ensemble before deployment is, by contrast, an immediate gain.</w:t>
       </w:r>
     </w:p>
     <w:bookmarkStart w:id="95" w:name="tab:teacher"/>
@@ -9541,19 +9465,7 @@
         <w:pStyle w:val="TableCaption"/>
       </w:pPr>
       <w:r>
-        <w:t xml:space="preserve">Table 10. The ensemble as a teacher. Upper block: full test split, threshold calibrated on validation for each model (same evaluation pipeline for both; the original model’s figures agree with Table 7 to within 0.1 point). Lower block: one-week loop pilot, evaluated on the second week;</w:t>
-      </w:r>
-      <w:r>
-        <w:t xml:space="preserve"> </w:t>
-      </w:r>
-      <w:r>
-        <w:t xml:space="preserve">“escalation @95 %”</w:t>
-      </w:r>
-      <w:r>
-        <w:t xml:space="preserve"> </w:t>
-      </w:r>
-      <w:r>
-        <w:t xml:space="preserve">is read off the test curve.</w:t>
+        <w:t xml:space="preserve">Table 10. The ensemble as a teacher: distillation and one-week loop pilot.</w:t>
       </w:r>
     </w:p>
     <w:tbl>
@@ -9562,7 +9474,7 @@
         <w:tblW w:type="pct" w:w="4836"/>
         <w:tblLayout w:type="fixed"/>
         <w:tblLook w:firstRow="0" w:lastRow="0" w:firstColumn="0" w:lastColumn="0" w:noHBand="0" w:noVBand="0" w:val="0000"/>
-        <w:tblCaption w:val="Table 10. The ensemble as a teacher. Upper block: full test split, threshold calibrated on validation for each model (same evaluation pipeline for both; the original model’s figures agree with Table 7 to within 0.1 point). Lower block: one-week loop pilot, evaluated on the second week; “escalation @95 %” is read off the test curve."/>
+        <w:tblCaption w:val="Table 10. The ensemble as a teacher: distillation and one-week loop pilot."/>
       </w:tblPr>
       <w:tblGrid>
         <w:gridCol w:w="2207"/>
@@ -10343,7 +10255,7 @@
         <w:pStyle w:val="FirstParagraph"/>
       </w:pPr>
       <w:r>
-        <w:t xml:space="preserve">Table 11 reports latencies measured on the devices. On the Raspberry Pi 5, MobileNetV3-Large runs in 65.5 ms per image (fp32,</w:t>
+        <w:t xml:space="preserve">Table 11 reports latencies measured on the devices. Each measurement is for a single image (batch size 1); replay values are medians over the seven-day replay. On the Raspberry Pi 5, MobileNetV3-Large runs in 65.5 ms per image (fp32,</w:t>
       </w:r>
       <w:r>
         <w:t xml:space="preserve"> </w:t>
@@ -10363,7 +10275,7 @@
         </m:r>
       </m:oMath>
       <w:r>
-        <w:t xml:space="preserve">, mean of 200 runs after warm-up, no thermal throttling). A FLOPs-based projection from the device’s nominal throughput had predicted 32.1 ms; the measured figure is about twice as slow, which illustrates why projected latencies should not stand in for measurements on embedded targets. On the Jetson Nano the three backbones take 2 592, 2 673 and 1 613 ms, so an escalated image costs 6.9 s of cloud computation including preprocessing and the head; loading the three backbones adds 36 s per batch, shared by all images in it. Because escalation is deferred, none of this is on the farmer’s critical path: the farm answers in a median of 77 ms (95 % of images within 164 ms; 139 ms at the median for escalated images, which include the upload to the cloud queue), and the ensemble’s confirmation arrives with the next batch.</w:t>
+        <w:t xml:space="preserve">, mean of 200 runs after warm-up, no thermal throttling). A FLOPs-based projection from the device’s nominal throughput had predicted 32.1 ms; the measured figure is about twice as slow, which illustrates why projected latencies should not stand in for measurements on embedded targets. On the Jetson Nano the three backbones take 2 592, 2 673 and 1 613 ms, so an escalated image costs 6.9 s of cloud computation including preprocessing and the head; loading the three backbones adds 36 s per batch, shared by all images in it. Because escalation is deferred, none of this is on the farmer’s critical path: the farm answers in a median of 77 ms (95 % of images within 164 ms; 139 ms at the median for escalated images, which include the upload to the cloud queue), and the ensemble’s confirmation arrives with the next batch. Figure 12a shows this time to the farmer’s answer for every image of the replay: escalated images are answered by the edge immediately, the upload to the cloud queue included, and confirmed by the cloud at the next batch. Figure 12b breaks the cost of one escalation into edge inference on the Pi, upload and Nano compute, excluding the wait for the next batch and the per-batch model loading.</w:t>
       </w:r>
     </w:p>
     <w:p>
@@ -10380,7 +10292,7 @@
         <w:pStyle w:val="TableCaption"/>
       </w:pPr>
       <w:r>
-        <w:t xml:space="preserve">Table 11. Latency measured on the embedded devices (single image, batch size 1). Replay values are medians over the seven-day replay.</w:t>
+        <w:t xml:space="preserve">Table 11. Latency measured on the embedded devices.</w:t>
       </w:r>
     </w:p>
     <w:tbl>
@@ -10389,7 +10301,7 @@
         <w:tblW w:type="pct" w:w="4880"/>
         <w:tblLayout w:type="fixed"/>
         <w:tblLook w:firstRow="1" w:lastRow="0" w:firstColumn="0" w:lastColumn="0" w:noHBand="0" w:noVBand="0" w:val="0020"/>
-        <w:tblCaption w:val="Table 11. Latency measured on the embedded devices (single image, batch size 1). Replay values are medians over the seven-day replay."/>
+        <w:tblCaption w:val="Table 11. Latency measured on the embedded devices."/>
       </w:tblPr>
       <w:tblGrid>
         <w:gridCol w:w="1622"/>
@@ -10899,7 +10811,7 @@
         <w:pStyle w:val="FirstParagraph"/>
       </w:pPr>
       <w:r>
-        <w:t xml:space="preserve">Over the replayed week the four farms submitted 3 677 images, and the edge escalated 684 of them (18.6 %) — the rate predicted offline for the same images at the same threshold (18.6 %), as expected from the edge node’s agreement with the offline model (Table 5). The farms uploaded 40.4 MB in total, against 216.3 MB had every image been sent with the same payload: a 5.4-fold reduction in the bytes actually uploaded (Fig. 11). The offline model of Eq. (3) predicted 11.2 KB per diagnosis; the devices measured 11.2 KB. The system delivered 76.0 % correct diagnoses, against 69.3 % for the edge alone. On the escalated images, the Nano’s ensemble was correct on 67.4 % of them; the workstation’s offline predictions for the same images reach 66.5 %, and the two agree on 652/684 images (95.3 %): the on-device deviation changes individual diagnoses but not accuracy. The cloud node processed 14 batches of 48 images at the median, never received more than 14 escalations in a simulated hour, and confirmed every escalated image on the day it was captured (at most 6 simulated hours later). The whole replay took 98 minutes of wall-clock time, almost all of it spent on cloud computation.</w:t>
+        <w:t xml:space="preserve">Over the replayed week the four farms submitted 3 677 images, and the edge escalated 684 of them (18.6 %) — the rate predicted offline for the same images at the same threshold (18.6 %), as expected from the edge node’s agreement with the offline model (Table 5). The farms uploaded 40.4 MB in total, against 216.3 MB had every image been sent with the same payload: a 5.4-fold reduction in the bytes actually uploaded (Fig. 11). The figure shows the escalations per simulated hour, by farm, with nights shaded, and the cumulative uploaded bytes against the same images uploaded with the same payload by an always-cloud design; its green curve is the second replay (Section 6.7). The offline model of Eq. (3) predicted 11.2 KB per diagnosis; the devices measured 11.2 KB. The system delivered 76.0 % correct diagnoses, against 69.3 % for the edge alone. On the escalated images, the Nano’s ensemble was correct on 67.4 % of them; the workstation’s offline predictions for the same images reach 66.5 %, and the two agree on 652/684 images (95.3 %): the on-device deviation changes individual diagnoses but not accuracy. The cloud node processed 14 batches of 48 images at the median, never received more than 14 escalations in a simulated hour, and confirmed every escalated image on the day it was captured (at most 6 simulated hours later). The whole replay took 98 minutes of wall-clock time, almost all of it spent on cloud computation.</w:t>
       </w:r>
     </w:p>
     <w:p>
@@ -10907,7 +10819,7 @@
         <w:pStyle w:val="BodyText"/>
       </w:pPr>
       <w:r>
-        <w:t xml:space="preserve">The farms behave differently (Table 12, Fig. 13): farm B (solanaceae) escalated most often (24 %) and farm D (market garden) least (15 %), in line with the per-farm rates predicted offline from the margins of the same images. A single global threshold therefore translates into farm-specific uplink budgets that follow how hard each farm’s crops are for the edge model, which a deployment can monitor and, if needed, tune per farm. Figure 14 shows the operations console at the end of the replay.</w:t>
+        <w:t xml:space="preserve">The farms behave differently (Table 12, Fig. 13): farm B (solanaceae) escalated most often (24 %) and farm D (market garden) least (15 %), in line with the per-farm rates predicted offline from the margins of the same images. A single global threshold therefore translates into farm-specific uplink budgets that follow how hard each farm’s crops are for the edge model, which a deployment can monitor and, if needed, tune per farm. Figure 14 shows the operations console at the end of the replay. It displays the simulated clock and node status, fleet indicators, escalations per simulated hour, per-farm cards, the topology, latency by stage and a feed of the most recent diagnoses.</w:t>
       </w:r>
     </w:p>
     <w:bookmarkStart w:id="100" w:name="tab:fleet"/>
@@ -10916,19 +10828,7 @@
         <w:pStyle w:val="TableCaption"/>
       </w:pPr>
       <w:r>
-        <w:t xml:space="preserve">Table 12. Measured results of the seven-day replay, per farm. Upload volumes are JPEG bytes actually sent;</w:t>
-      </w:r>
-      <w:r>
-        <w:t xml:space="preserve"> </w:t>
-      </w:r>
-      <w:r>
-        <w:t xml:space="preserve">“Always-cloud”</w:t>
-      </w:r>
-      <w:r>
-        <w:t xml:space="preserve"> </w:t>
-      </w:r>
-      <w:r>
-        <w:t xml:space="preserve">is the volume had every image been uploaded with the same payload (448 px shorter side, JPEG q90).</w:t>
+        <w:t xml:space="preserve">Table 12. Per-farm results of the seven-day replay.</w:t>
       </w:r>
     </w:p>
     <w:tbl>
@@ -10936,7 +10836,7 @@
         <w:tblStyle w:val="Table"/>
         <w:tblW w:type="auto" w:w="0"/>
         <w:tblLook w:firstRow="0" w:lastRow="0" w:firstColumn="0" w:lastColumn="0" w:noHBand="0" w:noVBand="0" w:val="0000"/>
-        <w:tblCaption w:val="Table 12. Measured results of the seven-day replay, per farm. Upload volumes are JPEG bytes actually sent; “Always-cloud” is the volume had every image been uploaded with the same payload (448 px shorter side, JPEG q90)."/>
+        <w:tblCaption w:val="Table 12. Per-farm results of the seven-day replay."/>
       </w:tblPr>
       <w:tblGrid>
         <w:gridCol w:w="1131"/>
@@ -11617,7 +11517,7 @@
           <wp:inline>
             <wp:extent cx="5334000" cy="3043151"/>
             <wp:effectExtent b="0" l="0" r="0" t="0"/>
-            <wp:docPr descr="Figure 11. The seven-day replay on the embedded testbed. Top: escalations per simulated hour, by farm (shaded: night, no captures). Bottom: cumulative uploaded bytes, measured image by image, against the same images uploaded with the same payload by an always-cloud design; the green curve is the second replay, with the distilled edge model (Section 6.7)." title="" id="102" name="Picture"/>
+            <wp:docPr descr="Figure 11. Escalations per simulated hour and cumulative uplink over the seven-day replay." title="" id="102" name="Picture"/>
             <a:graphic>
               <a:graphicData uri="http://schemas.openxmlformats.org/drawingml/2006/picture">
                 <pic:pic>
@@ -11660,7 +11560,7 @@
         <w:pStyle w:val="ImageCaption"/>
       </w:pPr>
       <w:r>
-        <w:t xml:space="preserve">Figure 11. The seven-day replay on the embedded testbed. Top: escalations per simulated hour, by farm (shaded: night, no captures). Bottom: cumulative uploaded bytes, measured image by image, against the same images uploaded with the same payload by an always-cloud design; the green curve is the second replay, with the distilled edge model (Section 6.7).</w:t>
+        <w:t xml:space="preserve">Figure 11. Escalations per simulated hour and cumulative uplink over the seven-day replay.</w:t>
       </w:r>
     </w:p>
     <w:bookmarkEnd w:id="104"/>
@@ -11674,7 +11574,7 @@
           <wp:inline>
             <wp:extent cx="5334000" cy="2167646"/>
             <wp:effectExtent b="0" l="0" r="0" t="0"/>
-            <wp:docPr descr="Figure 12. Measured latency during the replay. (a) Time until the farmer receives an answer, per image (log scale); escalated images are answered by the edge immediately (including the upload to the cloud queue) and confirmed by the cloud at the next batch. (b) Median cost of one escalation by stage: edge inference on the Pi, upload, and Nano compute (excluding the wait for the next batch and the per-batch model loading)." title="" id="106" name="Picture"/>
+            <wp:docPr descr="Figure 12. Measured latency during the replay. (a) Time to the farmer’s answer, per image. (b) Median cost of one escalation, by stage." title="" id="106" name="Picture"/>
             <a:graphic>
               <a:graphicData uri="http://schemas.openxmlformats.org/drawingml/2006/picture">
                 <pic:pic>
@@ -11717,7 +11617,7 @@
         <w:pStyle w:val="ImageCaption"/>
       </w:pPr>
       <w:r>
-        <w:t xml:space="preserve">Figure 12. Measured latency during the replay. (a) Time until the farmer receives an answer, per image (log scale); escalated images are answered by the edge immediately (including the upload to the cloud queue) and confirmed by the cloud at the next batch. (b) Median cost of one escalation by stage: edge inference on the Pi, upload, and Nano compute (excluding the wait for the next batch and the per-batch model loading).</w:t>
+        <w:t xml:space="preserve">Figure 12. Measured latency during the replay. (a) Time to the farmer’s answer, per image. (b) Median cost of one escalation, by stage.</w:t>
       </w:r>
     </w:p>
     <w:bookmarkEnd w:id="108"/>
@@ -11731,7 +11631,7 @@
           <wp:inline>
             <wp:extent cx="4036816" cy="2266121"/>
             <wp:effectExtent b="0" l="0" r="0" t="0"/>
-            <wp:docPr descr="Figure 13. Escalation rate per farm: predicted from the offline margins (grey) and measured on the devices (colour)." title="" id="110" name="Picture"/>
+            <wp:docPr descr="Figure 13. Escalation rate per farm: offline prediction and on-device measurement." title="" id="110" name="Picture"/>
             <a:graphic>
               <a:graphicData uri="http://schemas.openxmlformats.org/drawingml/2006/picture">
                 <pic:pic>
@@ -11774,7 +11674,7 @@
         <w:pStyle w:val="ImageCaption"/>
       </w:pPr>
       <w:r>
-        <w:t xml:space="preserve">Figure 13. Escalation rate per farm: predicted from the offline margins (grey) and measured on the devices (colour).</w:t>
+        <w:t xml:space="preserve">Figure 13. Escalation rate per farm: offline prediction and on-device measurement.</w:t>
       </w:r>
     </w:p>
     <w:bookmarkEnd w:id="112"/>
@@ -11788,7 +11688,7 @@
           <wp:inline>
             <wp:extent cx="5334000" cy="4300537"/>
             <wp:effectExtent b="0" l="0" r="0" t="0"/>
-            <wp:docPr descr="Figure 14. Operations console during the replay: simulated clock and node status, fleet indicators, escalations per simulated hour, per-farm cards, topology, latency by stage and a feed of the most recent diagnoses." title="" id="114" name="Picture"/>
+            <wp:docPr descr="Figure 14. Operations console during the replay." title="" id="114" name="Picture"/>
             <a:graphic>
               <a:graphicData uri="http://schemas.openxmlformats.org/drawingml/2006/picture">
                 <pic:pic>
@@ -11831,7 +11731,7 @@
         <w:pStyle w:val="ImageCaption"/>
       </w:pPr>
       <w:r>
-        <w:t xml:space="preserve">Figure 14. Operations console during the replay: simulated clock and node status, fleet indicators, escalations per simulated hour, per-farm cards, topology, latency by stage and a feed of the most recent diagnoses.</w:t>
+        <w:t xml:space="preserve">Figure 14. Operations console during the replay.</w:t>
       </w:r>
     </w:p>
     <w:bookmarkEnd w:id="116"/>
@@ -11876,7 +11776,7 @@
         </m:r>
       </m:oMath>
       <w:r>
-        <w:t xml:space="preserve">), and before the run the deployed edge reproduced the distilled model’s offline predictions on 300 of 300 test images. Table 13 compares the two replays.</w:t>
+        <w:t xml:space="preserve">), and before the run the deployed edge reproduced the distilled model’s offline predictions on 300 of 300 test images. Table 13 compares the two replays. Device energy per diagnosis combines the Pi’s energy per image with the Nano’s energy per escalated image, both measured in replay-sized batches of 48 (Section 5.4).</w:t>
       </w:r>
     </w:p>
     <w:p>
@@ -11893,7 +11793,7 @@
         <w:pStyle w:val="TableCaption"/>
       </w:pPr>
       <w:r>
-        <w:t xml:space="preserve">Table 13. The two seven-day replays on the embedded testbed: identical images, schedule and payload; replay 2 uses the distilled edge model and fp16 CLIP. Device energy per diagnosis combines the Pi’s energy per image with the Nano’s energy per escalated image, measured in replay-sized batches of 48 (Section 5.4).</w:t>
+        <w:t xml:space="preserve">Table 13. The two seven-day replays on the embedded testbed.</w:t>
       </w:r>
     </w:p>
     <w:tbl>
@@ -11902,7 +11802,7 @@
         <w:tblW w:type="pct" w:w="4875"/>
         <w:tblLayout w:type="fixed"/>
         <w:tblLook w:firstRow="1" w:lastRow="0" w:firstColumn="0" w:lastColumn="0" w:noHBand="0" w:noVBand="0" w:val="0020"/>
-        <w:tblCaption w:val="Table 13. The two seven-day replays on the embedded testbed: identical images, schedule and payload; replay 2 uses the distilled edge model and fp16 CLIP. Device energy per diagnosis combines the Pi’s energy per image with the Nano’s energy per escalated image, measured in replay-sized batches of 48 (Section 5.4)."/>
+        <w:tblCaption w:val="Table 13. The two seven-day replays on the embedded testbed."/>
       </w:tblPr>
       <w:tblGrid>
         <w:gridCol w:w="4752"/>

</xml_diff>

<commit_message>
Retarget paper to Smart Agricultural Technology: numbered references
Co-Authored-By: Claude Opus 5.5 <noreply@anthropic.com>
</commit_message>
<xml_diff>
--- a/paper/main.docx
+++ b/paper/main.docx
@@ -302,18 +302,18 @@
         <w:t xml:space="preserve"> </w:t>
       </w:r>
       <w:r>
-        <w:t xml:space="preserve">(</w:t>
+        <w:t xml:space="preserve">[</w:t>
       </w:r>
       <w:hyperlink w:anchor="ref-savary2019global">
         <w:r>
           <w:rPr>
             <w:rStyle w:val="Hyperlink"/>
           </w:rPr>
-          <w:t xml:space="preserve">Savary et al. 2019</w:t>
+          <w:t xml:space="preserve">1</w:t>
         </w:r>
       </w:hyperlink>
       <w:r>
-        <w:t xml:space="preserve">)</w:t>
+        <w:t xml:space="preserve">]</w:t>
       </w:r>
       <w:r>
         <w:t xml:space="preserve">, and early, accurate diagnosis is what allows a grower to respond before an outbreak spreads. Smartphone and camera-based diagnosis has therefore become one of the most studied applications of deep learning in agriculture</w:t>
@@ -322,46 +322,29 @@
         <w:t xml:space="preserve"> </w:t>
       </w:r>
       <w:r>
-        <w:t xml:space="preserve">(</w:t>
+        <w:t xml:space="preserve">[</w:t>
       </w:r>
       <w:hyperlink w:anchor="ref-kamilaris2018survey">
         <w:r>
           <w:rPr>
             <w:rStyle w:val="Hyperlink"/>
           </w:rPr>
-          <w:t xml:space="preserve">Kamilaris and Prenafeta-Boldú 2018</w:t>
+          <w:t xml:space="preserve">2</w:t>
         </w:r>
       </w:hyperlink>
       <w:r>
-        <w:t xml:space="preserve">;</w:t>
-      </w:r>
-      <w:r>
-        <w:t xml:space="preserve"> </w:t>
-      </w:r>
-      <w:hyperlink w:anchor="ref-mohanty2016deeplearning">
-        <w:r>
-          <w:rPr>
-            <w:rStyle w:val="Hyperlink"/>
-          </w:rPr>
-          <w:t xml:space="preserve">Mohanty et al. 2016</w:t>
-        </w:r>
-      </w:hyperlink>
-      <w:r>
-        <w:t xml:space="preserve">;</w:t>
-      </w:r>
-      <w:r>
-        <w:t xml:space="preserve"> </w:t>
+        <w:t xml:space="preserve">–</w:t>
       </w:r>
       <w:hyperlink w:anchor="ref-ferentinos2018deep">
         <w:r>
           <w:rPr>
             <w:rStyle w:val="Hyperlink"/>
           </w:rPr>
-          <w:t xml:space="preserve">Ferentinos 2018</w:t>
+          <w:t xml:space="preserve">4</w:t>
         </w:r>
       </w:hyperlink>
       <w:r>
-        <w:t xml:space="preserve">)</w:t>
+        <w:t xml:space="preserve">]</w:t>
       </w:r>
       <w:r>
         <w:t xml:space="preserve">. Yet the field has long been flattered by laboratory benchmarks: models that exceed 99 % accuracy on curated leaf images such as PlantVillage</w:t>
@@ -370,18 +353,18 @@
         <w:t xml:space="preserve"> </w:t>
       </w:r>
       <w:r>
-        <w:t xml:space="preserve">(</w:t>
+        <w:t xml:space="preserve">[</w:t>
       </w:r>
       <w:hyperlink w:anchor="ref-hughes2015plantvillage">
         <w:r>
           <w:rPr>
             <w:rStyle w:val="Hyperlink"/>
           </w:rPr>
-          <w:t xml:space="preserve">Hughes and Salathé 2015</w:t>
+          <w:t xml:space="preserve">5</w:t>
         </w:r>
       </w:hyperlink>
       <w:r>
-        <w:t xml:space="preserve">)</w:t>
+        <w:t xml:space="preserve">]</w:t>
       </w:r>
       <w:r>
         <w:t xml:space="preserve"> </w:t>
@@ -393,60 +376,29 @@
         <w:t xml:space="preserve"> </w:t>
       </w:r>
       <w:r>
-        <w:t xml:space="preserve">(</w:t>
+        <w:t xml:space="preserve">[</w:t>
       </w:r>
       <w:hyperlink w:anchor="ref-barbedo2018impact">
         <w:r>
           <w:rPr>
             <w:rStyle w:val="Hyperlink"/>
           </w:rPr>
-          <w:t xml:space="preserve">Barbedo 2018</w:t>
+          <w:t xml:space="preserve">6</w:t>
         </w:r>
       </w:hyperlink>
       <w:r>
-        <w:t xml:space="preserve">;</w:t>
-      </w:r>
-      <w:r>
-        <w:t xml:space="preserve"> </w:t>
-      </w:r>
-      <w:hyperlink w:anchor="ref-noyan2022uncovering">
-        <w:r>
-          <w:rPr>
-            <w:rStyle w:val="Hyperlink"/>
-          </w:rPr>
-          <w:t xml:space="preserve">Noyan 2022</w:t>
-        </w:r>
-      </w:hyperlink>
-      <w:r>
-        <w:t xml:space="preserve">;</w:t>
-      </w:r>
-      <w:r>
-        <w:t xml:space="preserve"> </w:t>
-      </w:r>
-      <w:hyperlink w:anchor="ref-ahmad2023toward">
-        <w:r>
-          <w:rPr>
-            <w:rStyle w:val="Hyperlink"/>
-          </w:rPr>
-          <w:t xml:space="preserve">Ahmad et al. 2023</w:t>
-        </w:r>
-      </w:hyperlink>
-      <w:r>
-        <w:t xml:space="preserve">;</w:t>
-      </w:r>
-      <w:r>
-        <w:t xml:space="preserve"> </w:t>
+        <w:t xml:space="preserve">–</w:t>
       </w:r>
       <w:hyperlink w:anchor="ref-wu2023fromlaboratoryto">
         <w:r>
           <w:rPr>
             <w:rStyle w:val="Hyperlink"/>
           </w:rPr>
-          <w:t xml:space="preserve">Wu et al. 2023</w:t>
+          <w:t xml:space="preserve">9</w:t>
         </w:r>
       </w:hyperlink>
       <w:r>
-        <w:t xml:space="preserve">)</w:t>
+        <w:t xml:space="preserve">]</w:t>
       </w:r>
       <w:r>
         <w:t xml:space="preserve">. The PlantWild benchmark</w:t>
@@ -455,18 +407,18 @@
         <w:t xml:space="preserve"> </w:t>
       </w:r>
       <w:r>
-        <w:t xml:space="preserve">(</w:t>
+        <w:t xml:space="preserve">[</w:t>
       </w:r>
       <w:hyperlink w:anchor="ref-wei2024plantwild">
         <w:r>
           <w:rPr>
             <w:rStyle w:val="Hyperlink"/>
           </w:rPr>
-          <w:t xml:space="preserve">Wei et al. 2024b</w:t>
+          <w:t xml:space="preserve">10</w:t>
         </w:r>
       </w:hyperlink>
       <w:r>
-        <w:t xml:space="preserve">)</w:t>
+        <w:t xml:space="preserve">]</w:t>
       </w:r>
       <w:r>
         <w:t xml:space="preserve"> </w:t>
@@ -502,70 +454,29 @@
         <w:t xml:space="preserve"> </w:t>
       </w:r>
       <w:r>
-        <w:t xml:space="preserve">(</w:t>
+        <w:t xml:space="preserve">[</w:t>
       </w:r>
       <w:hyperlink w:anchor="ref-oquab2024dinov2">
         <w:r>
           <w:rPr>
             <w:rStyle w:val="Hyperlink"/>
           </w:rPr>
-          <w:t xml:space="preserve">Oquab et al.</w:t>
-        </w:r>
-        <w:r>
-          <w:rPr>
-            <w:rStyle w:val="Hyperlink"/>
-          </w:rPr>
-          <w:t xml:space="preserve"> </w:t>
-        </w:r>
-        <w:r>
-          <w:rPr>
-            <w:rStyle w:val="Hyperlink"/>
-          </w:rPr>
-          <w:t xml:space="preserve">2024</w:t>
+          <w:t xml:space="preserve">11</w:t>
         </w:r>
       </w:hyperlink>
       <w:r>
-        <w:t xml:space="preserve">;</w:t>
-      </w:r>
-      <w:r>
-        <w:t xml:space="preserve"> </w:t>
-      </w:r>
-      <w:hyperlink w:anchor="ref-simeoni2025dinov3">
-        <w:r>
-          <w:rPr>
-            <w:rStyle w:val="Hyperlink"/>
-          </w:rPr>
-          <w:t xml:space="preserve">Siméoni et al.</w:t>
-        </w:r>
-        <w:r>
-          <w:rPr>
-            <w:rStyle w:val="Hyperlink"/>
-          </w:rPr>
-          <w:t xml:space="preserve"> </w:t>
-        </w:r>
-        <w:r>
-          <w:rPr>
-            <w:rStyle w:val="Hyperlink"/>
-          </w:rPr>
-          <w:t xml:space="preserve">2026</w:t>
-        </w:r>
-      </w:hyperlink>
-      <w:r>
-        <w:t xml:space="preserve">;</w:t>
-      </w:r>
-      <w:r>
-        <w:t xml:space="preserve"> </w:t>
+        <w:t xml:space="preserve">–</w:t>
       </w:r>
       <w:hyperlink w:anchor="ref-radford2021clip">
         <w:r>
           <w:rPr>
             <w:rStyle w:val="Hyperlink"/>
           </w:rPr>
-          <w:t xml:space="preserve">Radford et al. 2021</w:t>
+          <w:t xml:space="preserve">13</w:t>
         </w:r>
       </w:hyperlink>
       <w:r>
-        <w:t xml:space="preserve">)</w:t>
+        <w:t xml:space="preserve">]</w:t>
       </w:r>
       <w:r>
         <w:t xml:space="preserve"> </w:t>
@@ -577,18 +488,18 @@
         <w:t xml:space="preserve"> </w:t>
       </w:r>
       <w:r>
-        <w:t xml:space="preserve">(</w:t>
+        <w:t xml:space="preserve">[</w:t>
       </w:r>
       <w:hyperlink w:anchor="ref-elkarch2026backbone">
         <w:r>
           <w:rPr>
             <w:rStyle w:val="Hyperlink"/>
           </w:rPr>
-          <w:t xml:space="preserve">El Karch et al. 2026</w:t>
+          <w:t xml:space="preserve">14</w:t>
         </w:r>
       </w:hyperlink>
       <w:r>
-        <w:t xml:space="preserve">)</w:t>
+        <w:t xml:space="preserve">]</w:t>
       </w:r>
       <w:r>
         <w:t xml:space="preserve">. Such ensembles, however, total close to a billion parameters and must run on a server. Lightweight convolutional networks such as MobileNetV3</w:t>
@@ -597,18 +508,18 @@
         <w:t xml:space="preserve"> </w:t>
       </w:r>
       <w:r>
-        <w:t xml:space="preserve">(</w:t>
+        <w:t xml:space="preserve">[</w:t>
       </w:r>
       <w:hyperlink w:anchor="ref-howard2019mobilenetv3">
         <w:r>
           <w:rPr>
             <w:rStyle w:val="Hyperlink"/>
           </w:rPr>
-          <w:t xml:space="preserve">Howard et al. 2019</w:t>
+          <w:t xml:space="preserve">15</w:t>
         </w:r>
       </w:hyperlink>
       <w:r>
-        <w:t xml:space="preserve">)</w:t>
+        <w:t xml:space="preserve">]</w:t>
       </w:r>
       <w:r>
         <w:t xml:space="preserve"> </w:t>
@@ -628,32 +539,29 @@
         <w:t xml:space="preserve"> </w:t>
       </w:r>
       <w:r>
-        <w:t xml:space="preserve">(</w:t>
+        <w:t xml:space="preserve">[</w:t>
       </w:r>
       <w:hyperlink w:anchor="ref-wolfert2017bigdata">
         <w:r>
           <w:rPr>
             <w:rStyle w:val="Hyperlink"/>
           </w:rPr>
-          <w:t xml:space="preserve">Wolfert et al. 2017</w:t>
+          <w:t xml:space="preserve">16</w:t>
         </w:r>
       </w:hyperlink>
       <w:r>
-        <w:t xml:space="preserve">;</w:t>
-      </w:r>
-      <w:r>
-        <w:t xml:space="preserve"> </w:t>
+        <w:t xml:space="preserve">,</w:t>
       </w:r>
       <w:hyperlink w:anchor="ref-ogrady2019edge">
         <w:r>
           <w:rPr>
             <w:rStyle w:val="Hyperlink"/>
           </w:rPr>
-          <w:t xml:space="preserve">O’Grady et al. 2019</w:t>
+          <w:t xml:space="preserve">17</w:t>
         </w:r>
       </w:hyperlink>
       <w:r>
-        <w:t xml:space="preserve">)</w:t>
+        <w:t xml:space="preserve">]</w:t>
       </w:r>
       <w:r>
         <w:t xml:space="preserve">, and every photograph sent to a server costs airtime, energy and money. Uploading every image is the most expensive way to use a scarce resource, yet it is the implicit assumption of most cloud-based diagnosis systems. Edge computing</w:t>
@@ -662,18 +570,18 @@
         <w:t xml:space="preserve"> </w:t>
       </w:r>
       <w:r>
-        <w:t xml:space="preserve">(</w:t>
+        <w:t xml:space="preserve">[</w:t>
       </w:r>
       <w:hyperlink w:anchor="ref-shi2016edge">
         <w:r>
           <w:rPr>
             <w:rStyle w:val="Hyperlink"/>
           </w:rPr>
-          <w:t xml:space="preserve">Shi et al. 2016</w:t>
+          <w:t xml:space="preserve">18</w:t>
         </w:r>
       </w:hyperlink>
       <w:r>
-        <w:t xml:space="preserve">)</w:t>
+        <w:t xml:space="preserve">]</w:t>
       </w:r>
       <w:r>
         <w:t xml:space="preserve"> </w:t>
@@ -706,18 +614,18 @@
         <w:t xml:space="preserve"> </w:t>
       </w:r>
       <w:r>
-        <w:t xml:space="preserve">(</w:t>
+        <w:t xml:space="preserve">[</w:t>
       </w:r>
       <w:hyperlink w:anchor="ref-viola2001cascade">
         <w:r>
           <w:rPr>
             <w:rStyle w:val="Hyperlink"/>
           </w:rPr>
-          <w:t xml:space="preserve">Viola and Jones 2001</w:t>
+          <w:t xml:space="preserve">19</w:t>
         </w:r>
       </w:hyperlink>
       <w:r>
-        <w:t xml:space="preserve">)</w:t>
+        <w:t xml:space="preserve">]</w:t>
       </w:r>
       <w:r>
         <w:t xml:space="preserve">, the reject option</w:t>
@@ -726,18 +634,18 @@
         <w:t xml:space="preserve"> </w:t>
       </w:r>
       <w:r>
-        <w:t xml:space="preserve">(</w:t>
+        <w:t xml:space="preserve">[</w:t>
       </w:r>
       <w:hyperlink w:anchor="ref-chow1970reject">
         <w:r>
           <w:rPr>
             <w:rStyle w:val="Hyperlink"/>
           </w:rPr>
-          <w:t xml:space="preserve">Chow 1970</w:t>
+          <w:t xml:space="preserve">20</w:t>
         </w:r>
       </w:hyperlink>
       <w:r>
-        <w:t xml:space="preserve">)</w:t>
+        <w:t xml:space="preserve">]</w:t>
       </w:r>
       <w:r>
         <w:t xml:space="preserve"> </w:t>
@@ -749,18 +657,18 @@
         <w:t xml:space="preserve"> </w:t>
       </w:r>
       <w:r>
-        <w:t xml:space="preserve">(</w:t>
+        <w:t xml:space="preserve">[</w:t>
       </w:r>
       <w:hyperlink w:anchor="ref-teerapittayanon2016branchynet">
         <w:r>
           <w:rPr>
             <w:rStyle w:val="Hyperlink"/>
           </w:rPr>
-          <w:t xml:space="preserve">Teerapittayanon et al. 2016</w:t>
+          <w:t xml:space="preserve">21</w:t>
         </w:r>
       </w:hyperlink>
       <w:r>
-        <w:t xml:space="preserve">)</w:t>
+        <w:t xml:space="preserve">]</w:t>
       </w:r>
       <w:r>
         <w:t xml:space="preserve"> </w:t>
@@ -977,32 +885,29 @@
         <w:t xml:space="preserve"> </w:t>
       </w:r>
       <w:r>
-        <w:t xml:space="preserve">(</w:t>
+        <w:t xml:space="preserve">[</w:t>
       </w:r>
       <w:hyperlink w:anchor="ref-mohanty2016deeplearning">
         <w:r>
           <w:rPr>
             <w:rStyle w:val="Hyperlink"/>
           </w:rPr>
-          <w:t xml:space="preserve">Mohanty et al. 2016</w:t>
+          <w:t xml:space="preserve">3</w:t>
         </w:r>
       </w:hyperlink>
       <w:r>
-        <w:t xml:space="preserve">;</w:t>
-      </w:r>
-      <w:r>
-        <w:t xml:space="preserve"> </w:t>
+        <w:t xml:space="preserve">,</w:t>
       </w:r>
       <w:hyperlink w:anchor="ref-ferentinos2018deep">
         <w:r>
           <w:rPr>
             <w:rStyle w:val="Hyperlink"/>
           </w:rPr>
-          <w:t xml:space="preserve">Ferentinos 2018</w:t>
+          <w:t xml:space="preserve">4</w:t>
         </w:r>
       </w:hyperlink>
       <w:r>
-        <w:t xml:space="preserve">)</w:t>
+        <w:t xml:space="preserve">]</w:t>
       </w:r>
       <w:r>
         <w:t xml:space="preserve">, but subsequent work traced much of that performance to dataset bias and showed sharp drops under field conditions</w:t>
@@ -1011,46 +916,29 @@
         <w:t xml:space="preserve"> </w:t>
       </w:r>
       <w:r>
-        <w:t xml:space="preserve">(</w:t>
+        <w:t xml:space="preserve">[</w:t>
       </w:r>
       <w:hyperlink w:anchor="ref-barbedo2018impact">
         <w:r>
           <w:rPr>
             <w:rStyle w:val="Hyperlink"/>
           </w:rPr>
-          <w:t xml:space="preserve">Barbedo 2018</w:t>
+          <w:t xml:space="preserve">6</w:t>
         </w:r>
       </w:hyperlink>
       <w:r>
-        <w:t xml:space="preserve">;</w:t>
-      </w:r>
-      <w:r>
-        <w:t xml:space="preserve"> </w:t>
-      </w:r>
-      <w:hyperlink w:anchor="ref-noyan2022uncovering">
-        <w:r>
-          <w:rPr>
-            <w:rStyle w:val="Hyperlink"/>
-          </w:rPr>
-          <w:t xml:space="preserve">Noyan 2022</w:t>
-        </w:r>
-      </w:hyperlink>
-      <w:r>
-        <w:t xml:space="preserve">;</w:t>
-      </w:r>
-      <w:r>
-        <w:t xml:space="preserve"> </w:t>
+        <w:t xml:space="preserve">–</w:t>
       </w:r>
       <w:hyperlink w:anchor="ref-ahmad2023toward">
         <w:r>
           <w:rPr>
             <w:rStyle w:val="Hyperlink"/>
           </w:rPr>
-          <w:t xml:space="preserve">Ahmad et al. 2023</w:t>
+          <w:t xml:space="preserve">8</w:t>
         </w:r>
       </w:hyperlink>
       <w:r>
-        <w:t xml:space="preserve">)</w:t>
+        <w:t xml:space="preserve">]</w:t>
       </w:r>
       <w:r>
         <w:t xml:space="preserve">. Field-oriented datasets such as PlantDoc</w:t>
@@ -1059,18 +947,18 @@
         <w:t xml:space="preserve"> </w:t>
       </w:r>
       <w:r>
-        <w:t xml:space="preserve">(</w:t>
+        <w:t xml:space="preserve">[</w:t>
       </w:r>
       <w:hyperlink w:anchor="ref-singh2020plantdoc">
         <w:r>
           <w:rPr>
             <w:rStyle w:val="Hyperlink"/>
           </w:rPr>
-          <w:t xml:space="preserve">Singh et al. 2020</w:t>
+          <w:t xml:space="preserve">22</w:t>
         </w:r>
       </w:hyperlink>
       <w:r>
-        <w:t xml:space="preserve">)</w:t>
+        <w:t xml:space="preserve">]</w:t>
       </w:r>
       <w:r>
         <w:t xml:space="preserve"> </w:t>
@@ -1082,18 +970,18 @@
         <w:t xml:space="preserve"> </w:t>
       </w:r>
       <w:r>
-        <w:t xml:space="preserve">(</w:t>
+        <w:t xml:space="preserve">[</w:t>
       </w:r>
       <w:hyperlink w:anchor="ref-wei2024plantwild">
         <w:r>
           <w:rPr>
             <w:rStyle w:val="Hyperlink"/>
           </w:rPr>
-          <w:t xml:space="preserve">Wei et al. 2024b</w:t>
+          <w:t xml:space="preserve">10</w:t>
         </w:r>
       </w:hyperlink>
       <w:r>
-        <w:t xml:space="preserve">)</w:t>
+        <w:t xml:space="preserve">]</w:t>
       </w:r>
       <w:r>
         <w:t xml:space="preserve"> </w:t>
@@ -1105,18 +993,18 @@
         <w:t xml:space="preserve"> </w:t>
       </w:r>
       <w:r>
-        <w:t xml:space="preserve">(</w:t>
+        <w:t xml:space="preserve">[</w:t>
       </w:r>
       <w:hyperlink w:anchor="ref-wei2024mvpdr">
         <w:r>
           <w:rPr>
             <w:rStyle w:val="Hyperlink"/>
           </w:rPr>
-          <w:t xml:space="preserve">Wei et al. 2024a</w:t>
+          <w:t xml:space="preserve">23</w:t>
         </w:r>
       </w:hyperlink>
       <w:r>
-        <w:t xml:space="preserve">)</w:t>
+        <w:t xml:space="preserve">]</w:t>
       </w:r>
       <w:r>
         <w:t xml:space="preserve">. Recent work combines foundation backbones</w:t>
@@ -1125,32 +1013,29 @@
         <w:t xml:space="preserve"> </w:t>
       </w:r>
       <w:r>
-        <w:t xml:space="preserve">(</w:t>
+        <w:t xml:space="preserve">[</w:t>
       </w:r>
       <w:hyperlink w:anchor="ref-jiang2025plantcafo">
         <w:r>
           <w:rPr>
             <w:rStyle w:val="Hyperlink"/>
           </w:rPr>
-          <w:t xml:space="preserve">Jiang et al. 2025</w:t>
+          <w:t xml:space="preserve">24</w:t>
         </w:r>
       </w:hyperlink>
       <w:r>
-        <w:t xml:space="preserve">;</w:t>
-      </w:r>
-      <w:r>
-        <w:t xml:space="preserve"> </w:t>
+        <w:t xml:space="preserve">,</w:t>
       </w:r>
       <w:hyperlink w:anchor="ref-salman2025plantdisease">
         <w:r>
           <w:rPr>
             <w:rStyle w:val="Hyperlink"/>
           </w:rPr>
-          <w:t xml:space="preserve">Salman et al. 2025</w:t>
+          <w:t xml:space="preserve">25</w:t>
         </w:r>
       </w:hyperlink>
       <w:r>
-        <w:t xml:space="preserve">)</w:t>
+        <w:t xml:space="preserve">]</w:t>
       </w:r>
       <w:r>
         <w:t xml:space="preserve"> </w:t>
@@ -1162,38 +1047,35 @@
         <w:t xml:space="preserve"> </w:t>
       </w:r>
       <w:r>
-        <w:t xml:space="preserve">(</w:t>
+        <w:t xml:space="preserve">[</w:t>
       </w:r>
       <w:hyperlink w:anchor="ref-hasan2025deployable">
         <w:r>
           <w:rPr>
             <w:rStyle w:val="Hyperlink"/>
           </w:rPr>
-          <w:t xml:space="preserve">Hasan et al. 2025</w:t>
+          <w:t xml:space="preserve">26</w:t>
         </w:r>
       </w:hyperlink>
       <w:r>
-        <w:t xml:space="preserve">)</w:t>
-      </w:r>
-      <w:r>
-        <w:t xml:space="preserve">. Our cloud model is the three-backbone QualityGate fusion of</w:t>
-      </w:r>
-      <w:r>
-        <w:t xml:space="preserve"> </w:t>
-      </w:r>
-      <w:r>
-        <w:t xml:space="preserve">El Karch et al. (</w:t>
+        <w:t xml:space="preserve">]</w:t>
+      </w:r>
+      <w:r>
+        <w:t xml:space="preserve">. Our cloud model is the three-backbone QualityGate fusion of El Karch et al. </w:t>
+      </w:r>
+      <w:r>
+        <w:t xml:space="preserve">[</w:t>
       </w:r>
       <w:hyperlink w:anchor="ref-elkarch2026backbone">
         <w:r>
           <w:rPr>
             <w:rStyle w:val="Hyperlink"/>
           </w:rPr>
-          <w:t xml:space="preserve">2026</w:t>
+          <w:t xml:space="preserve">14</w:t>
         </w:r>
       </w:hyperlink>
       <w:r>
-        <w:t xml:space="preserve">)</w:t>
+        <w:t xml:space="preserve">]</w:t>
       </w:r>
       <w:r>
         <w:t xml:space="preserve">; this paper does not propose a new recogniser but asks how to deliver such a recogniser’s accuracy to farms that cannot afford to upload every image.</w:t>
@@ -1229,18 +1111,18 @@
         <w:t xml:space="preserve"> </w:t>
       </w:r>
       <w:r>
-        <w:t xml:space="preserve">(</w:t>
+        <w:t xml:space="preserve">[</w:t>
       </w:r>
       <w:hyperlink w:anchor="ref-kang2017neurosurgeon">
         <w:r>
           <w:rPr>
             <w:rStyle w:val="Hyperlink"/>
           </w:rPr>
-          <w:t xml:space="preserve">Kang et al. 2017</w:t>
+          <w:t xml:space="preserve">27</w:t>
         </w:r>
       </w:hyperlink>
       <w:r>
-        <w:t xml:space="preserve">)</w:t>
+        <w:t xml:space="preserve">]</w:t>
       </w:r>
       <w:r>
         <w:t xml:space="preserve">; distributed DNNs and early-exit networks attach classifiers to intermediate layers so that easy inputs leave early</w:t>
@@ -1249,32 +1131,29 @@
         <w:t xml:space="preserve"> </w:t>
       </w:r>
       <w:r>
-        <w:t xml:space="preserve">(</w:t>
+        <w:t xml:space="preserve">[</w:t>
       </w:r>
       <w:hyperlink w:anchor="ref-teerapittayanon2016branchynet">
         <w:r>
           <w:rPr>
             <w:rStyle w:val="Hyperlink"/>
           </w:rPr>
-          <w:t xml:space="preserve">Teerapittayanon et al. 2016</w:t>
+          <w:t xml:space="preserve">21</w:t>
         </w:r>
       </w:hyperlink>
       <w:r>
         <w:t xml:space="preserve">,</w:t>
-      </w:r>
-      <w:r>
-        <w:t xml:space="preserve"> </w:t>
       </w:r>
       <w:hyperlink w:anchor="ref-teerapittayanon2017ddnn">
         <w:r>
           <w:rPr>
             <w:rStyle w:val="Hyperlink"/>
           </w:rPr>
-          <w:t xml:space="preserve">2017</w:t>
+          <w:t xml:space="preserve">28</w:t>
         </w:r>
       </w:hyperlink>
       <w:r>
-        <w:t xml:space="preserve">)</w:t>
+        <w:t xml:space="preserve">]</w:t>
       </w:r>
       <w:r>
         <w:t xml:space="preserve">; split computing compresses the intermediate tensor sent over the network</w:t>
@@ -1283,18 +1162,18 @@
         <w:t xml:space="preserve"> </w:t>
       </w:r>
       <w:r>
-        <w:t xml:space="preserve">(</w:t>
+        <w:t xml:space="preserve">[</w:t>
       </w:r>
       <w:hyperlink w:anchor="ref-matsubara2022split">
         <w:r>
           <w:rPr>
             <w:rStyle w:val="Hyperlink"/>
           </w:rPr>
-          <w:t xml:space="preserve">Matsubara et al. 2022</w:t>
+          <w:t xml:space="preserve">29</w:t>
         </w:r>
       </w:hyperlink>
       <w:r>
-        <w:t xml:space="preserve">)</w:t>
+        <w:t xml:space="preserve">]</w:t>
       </w:r>
       <w:r>
         <w:t xml:space="preserve">. These methods co-design a single model. We study the complementary</w:t>
@@ -1346,32 +1225,29 @@
         <w:t xml:space="preserve"> </w:t>
       </w:r>
       <w:r>
-        <w:t xml:space="preserve">(</w:t>
+        <w:t xml:space="preserve">[</w:t>
       </w:r>
       <w:hyperlink w:anchor="ref-chow1970reject">
         <w:r>
           <w:rPr>
             <w:rStyle w:val="Hyperlink"/>
           </w:rPr>
-          <w:t xml:space="preserve">Chow 1970</w:t>
+          <w:t xml:space="preserve">20</w:t>
         </w:r>
       </w:hyperlink>
       <w:r>
-        <w:t xml:space="preserve">;</w:t>
-      </w:r>
-      <w:r>
-        <w:t xml:space="preserve"> </w:t>
+        <w:t xml:space="preserve">,</w:t>
       </w:r>
       <w:hyperlink w:anchor="ref-geifman2017selective">
         <w:r>
           <w:rPr>
             <w:rStyle w:val="Hyperlink"/>
           </w:rPr>
-          <w:t xml:space="preserve">Geifman and El-Yaniv 2017</w:t>
+          <w:t xml:space="preserve">30</w:t>
         </w:r>
       </w:hyperlink>
       <w:r>
-        <w:t xml:space="preserve">)</w:t>
+        <w:t xml:space="preserve">]</w:t>
       </w:r>
       <w:r>
         <w:t xml:space="preserve">. The maximum softmax probability is a strong baseline for detecting likely errors</w:t>
@@ -1380,18 +1256,18 @@
         <w:t xml:space="preserve"> </w:t>
       </w:r>
       <w:r>
-        <w:t xml:space="preserve">(</w:t>
+        <w:t xml:space="preserve">[</w:t>
       </w:r>
       <w:hyperlink w:anchor="ref-hendrycks2017baseline">
         <w:r>
           <w:rPr>
             <w:rStyle w:val="Hyperlink"/>
           </w:rPr>
-          <w:t xml:space="preserve">Hendrycks and Gimpel 2017</w:t>
+          <w:t xml:space="preserve">31</w:t>
         </w:r>
       </w:hyperlink>
       <w:r>
-        <w:t xml:space="preserve">)</w:t>
+        <w:t xml:space="preserve">]</w:t>
       </w:r>
       <w:r>
         <w:t xml:space="preserve">, although modern networks are miscalibrated</w:t>
@@ -1400,18 +1276,18 @@
         <w:t xml:space="preserve"> </w:t>
       </w:r>
       <w:r>
-        <w:t xml:space="preserve">(</w:t>
+        <w:t xml:space="preserve">[</w:t>
       </w:r>
       <w:hyperlink w:anchor="ref-guo2017calibration">
         <w:r>
           <w:rPr>
             <w:rStyle w:val="Hyperlink"/>
           </w:rPr>
-          <w:t xml:space="preserve">Guo et al. 2017</w:t>
+          <w:t xml:space="preserve">32</w:t>
         </w:r>
       </w:hyperlink>
       <w:r>
-        <w:t xml:space="preserve">)</w:t>
+        <w:t xml:space="preserve">]</w:t>
       </w:r>
       <w:r>
         <w:t xml:space="preserve">. Learned deferral policies have been proposed for cascades</w:t>
@@ -1420,18 +1296,18 @@
         <w:t xml:space="preserve"> </w:t>
       </w:r>
       <w:r>
-        <w:t xml:space="preserve">(</w:t>
+        <w:t xml:space="preserve">[</w:t>
       </w:r>
       <w:hyperlink w:anchor="ref-wang2018idk">
         <w:r>
           <w:rPr>
             <w:rStyle w:val="Hyperlink"/>
           </w:rPr>
-          <w:t xml:space="preserve">Wang et al. 2018</w:t>
+          <w:t xml:space="preserve">33</w:t>
         </w:r>
       </w:hyperlink>
       <w:r>
-        <w:t xml:space="preserve">)</w:t>
+        <w:t xml:space="preserve">]</w:t>
       </w:r>
       <w:r>
         <w:t xml:space="preserve"> </w:t>
@@ -1443,18 +1319,18 @@
         <w:t xml:space="preserve"> </w:t>
       </w:r>
       <w:r>
-        <w:t xml:space="preserve">(</w:t>
+        <w:t xml:space="preserve">[</w:t>
       </w:r>
       <w:hyperlink w:anchor="ref-kag2023selective">
         <w:r>
           <w:rPr>
             <w:rStyle w:val="Hyperlink"/>
           </w:rPr>
-          <w:t xml:space="preserve">Kag et al. 2023</w:t>
+          <w:t xml:space="preserve">34</w:t>
         </w:r>
       </w:hyperlink>
       <w:r>
-        <w:t xml:space="preserve">)</w:t>
+        <w:t xml:space="preserve">]</w:t>
       </w:r>
       <w:r>
         <w:t xml:space="preserve">. We compare scalar uncertainty signals against both edge-side learned routers and a cloud-supervised verifier, and we account for the bandwidth that a learned verifier itself consumes — a cost that latency-centred evaluations omit.</w:t>
@@ -1490,18 +1366,18 @@
         <w:t xml:space="preserve"> </w:t>
       </w:r>
       <w:r>
-        <w:t xml:space="preserve">(</w:t>
+        <w:t xml:space="preserve">[</w:t>
       </w:r>
       <w:hyperlink w:anchor="ref-kamilaris2018survey">
         <w:r>
           <w:rPr>
             <w:rStyle w:val="Hyperlink"/>
           </w:rPr>
-          <w:t xml:space="preserve">Kamilaris and Prenafeta-Boldú 2018</w:t>
+          <w:t xml:space="preserve">2</w:t>
         </w:r>
       </w:hyperlink>
       <w:r>
-        <w:t xml:space="preserve">)</w:t>
+        <w:t xml:space="preserve">]</w:t>
       </w:r>
       <w:r>
         <w:t xml:space="preserve"> </w:t>
@@ -1513,18 +1389,18 @@
         <w:t xml:space="preserve"> </w:t>
       </w:r>
       <w:r>
-        <w:t xml:space="preserve">(</w:t>
+        <w:t xml:space="preserve">[</w:t>
       </w:r>
       <w:hyperlink w:anchor="ref-wolfert2017bigdata">
         <w:r>
           <w:rPr>
             <w:rStyle w:val="Hyperlink"/>
           </w:rPr>
-          <w:t xml:space="preserve">Wolfert et al. 2017</w:t>
+          <w:t xml:space="preserve">16</w:t>
         </w:r>
       </w:hyperlink>
       <w:r>
-        <w:t xml:space="preserve">)</w:t>
+        <w:t xml:space="preserve">]</w:t>
       </w:r>
       <w:r>
         <w:t xml:space="preserve"> </w:t>
@@ -1536,18 +1412,18 @@
         <w:t xml:space="preserve"> </w:t>
       </w:r>
       <w:r>
-        <w:t xml:space="preserve">(</w:t>
+        <w:t xml:space="preserve">[</w:t>
       </w:r>
       <w:hyperlink w:anchor="ref-ogrady2019edge">
         <w:r>
           <w:rPr>
             <w:rStyle w:val="Hyperlink"/>
           </w:rPr>
-          <w:t xml:space="preserve">O’Grady et al. 2019</w:t>
+          <w:t xml:space="preserve">17</w:t>
         </w:r>
       </w:hyperlink>
       <w:r>
-        <w:t xml:space="preserve">)</w:t>
+        <w:t xml:space="preserve">]</w:t>
       </w:r>
       <w:r>
         <w:t xml:space="preserve">. The disease-recognition studies discussed in Section 2.1, however, evaluate either a server-side or a fully on-device classifier and report accuracy and, at most, computational cost; none of them measures the uplink traffic that a deployment would generate. Our deployment also differs in placing the large model on an embedded node rather than in a data centre.</w:t>
@@ -1602,38 +1478,35 @@
         <w:t xml:space="preserve"> </w:t>
       </w:r>
       <w:r>
-        <w:t xml:space="preserve">(</w:t>
+        <w:t xml:space="preserve">[</w:t>
       </w:r>
       <w:hyperlink w:anchor="ref-wei2024plantwild">
         <w:r>
           <w:rPr>
             <w:rStyle w:val="Hyperlink"/>
           </w:rPr>
-          <w:t xml:space="preserve">Wei et al. 2024b</w:t>
+          <w:t xml:space="preserve">10</w:t>
         </w:r>
       </w:hyperlink>
       <w:r>
-        <w:t xml:space="preserve">)</w:t>
-      </w:r>
-      <w:r>
-        <w:t xml:space="preserve">: 18 542 field photographs of 89 classes spanning healthy and diseased leaves of more than thirty plant species. We follow the official split procedure of</w:t>
-      </w:r>
-      <w:r>
-        <w:t xml:space="preserve"> </w:t>
-      </w:r>
-      <w:r>
-        <w:t xml:space="preserve">Wei et al. (</w:t>
+        <w:t xml:space="preserve">]</w:t>
+      </w:r>
+      <w:r>
+        <w:t xml:space="preserve">: 18 542 field photographs of 89 classes spanning healthy and diseased leaves of more than thirty plant species. We follow the official split procedure of Wei et al. </w:t>
+      </w:r>
+      <w:r>
+        <w:t xml:space="preserve">[</w:t>
       </w:r>
       <w:hyperlink w:anchor="ref-wei2024mvpdr">
         <w:r>
           <w:rPr>
             <w:rStyle w:val="Hyperlink"/>
           </w:rPr>
-          <w:t xml:space="preserve">2024a</w:t>
+          <w:t xml:space="preserve">23</w:t>
         </w:r>
       </w:hyperlink>
       <w:r>
-        <w:t xml:space="preserve">)</w:t>
+        <w:t xml:space="preserve">]</w:t>
       </w:r>
       <w:r>
         <w:t xml:space="preserve"> </w:t>
@@ -1666,24 +1539,21 @@
         <w:pStyle w:val="FirstParagraph"/>
       </w:pPr>
       <w:r>
-        <w:t xml:space="preserve">The cloud model is the QualityGate fusion of</w:t>
-      </w:r>
-      <w:r>
-        <w:t xml:space="preserve"> </w:t>
-      </w:r>
-      <w:r>
-        <w:t xml:space="preserve">El Karch et al. (</w:t>
+        <w:t xml:space="preserve">The cloud model is the QualityGate fusion of El Karch et al. </w:t>
+      </w:r>
+      <w:r>
+        <w:t xml:space="preserve">[</w:t>
       </w:r>
       <w:hyperlink w:anchor="ref-elkarch2026backbone">
         <w:r>
           <w:rPr>
             <w:rStyle w:val="Hyperlink"/>
           </w:rPr>
-          <w:t xml:space="preserve">2026</w:t>
+          <w:t xml:space="preserve">14</w:t>
         </w:r>
       </w:hyperlink>
       <w:r>
-        <w:t xml:space="preserve">)</w:t>
+        <w:t xml:space="preserve">]</w:t>
       </w:r>
       <w:r>
         <w:t xml:space="preserve"> </w:t>
@@ -1695,30 +1565,18 @@
         <w:t xml:space="preserve"> </w:t>
       </w:r>
       <w:r>
-        <w:t xml:space="preserve">(</w:t>
+        <w:t xml:space="preserve">[</w:t>
       </w:r>
       <w:hyperlink w:anchor="ref-oquab2024dinov2">
         <w:r>
           <w:rPr>
             <w:rStyle w:val="Hyperlink"/>
           </w:rPr>
-          <w:t xml:space="preserve">Oquab et al.</w:t>
-        </w:r>
-        <w:r>
-          <w:rPr>
-            <w:rStyle w:val="Hyperlink"/>
-          </w:rPr>
-          <w:t xml:space="preserve"> </w:t>
-        </w:r>
-        <w:r>
-          <w:rPr>
-            <w:rStyle w:val="Hyperlink"/>
-          </w:rPr>
-          <w:t xml:space="preserve">2024</w:t>
+          <w:t xml:space="preserve">11</w:t>
         </w:r>
       </w:hyperlink>
       <w:r>
-        <w:t xml:space="preserve">)</w:t>
+        <w:t xml:space="preserve">]</w:t>
       </w:r>
       <w:r>
         <w:t xml:space="preserve">, DINOv3 ViT-L/16 at 336 px</w:t>
@@ -1727,30 +1585,18 @@
         <w:t xml:space="preserve"> </w:t>
       </w:r>
       <w:r>
-        <w:t xml:space="preserve">(</w:t>
+        <w:t xml:space="preserve">[</w:t>
       </w:r>
       <w:hyperlink w:anchor="ref-simeoni2025dinov3">
         <w:r>
           <w:rPr>
             <w:rStyle w:val="Hyperlink"/>
           </w:rPr>
-          <w:t xml:space="preserve">Siméoni et al.</w:t>
-        </w:r>
-        <w:r>
-          <w:rPr>
-            <w:rStyle w:val="Hyperlink"/>
-          </w:rPr>
-          <w:t xml:space="preserve"> </w:t>
-        </w:r>
-        <w:r>
-          <w:rPr>
-            <w:rStyle w:val="Hyperlink"/>
-          </w:rPr>
-          <w:t xml:space="preserve">2026</w:t>
+          <w:t xml:space="preserve">12</w:t>
         </w:r>
       </w:hyperlink>
       <w:r>
-        <w:t xml:space="preserve">)</w:t>
+        <w:t xml:space="preserve">]</w:t>
       </w:r>
       <w:r>
         <w:t xml:space="preserve">, and the CLIP ViT-L/14 image encoder at 224 px</w:t>
@@ -1759,18 +1605,18 @@
         <w:t xml:space="preserve"> </w:t>
       </w:r>
       <w:r>
-        <w:t xml:space="preserve">(</w:t>
+        <w:t xml:space="preserve">[</w:t>
       </w:r>
       <w:hyperlink w:anchor="ref-radford2021clip">
         <w:r>
           <w:rPr>
             <w:rStyle w:val="Hyperlink"/>
           </w:rPr>
-          <w:t xml:space="preserve">Radford et al. 2021</w:t>
+          <w:t xml:space="preserve">13</w:t>
         </w:r>
       </w:hyperlink>
       <w:r>
-        <w:t xml:space="preserve">)</w:t>
+        <w:t xml:space="preserve">]</w:t>
       </w:r>
       <w:r>
         <w:t xml:space="preserve">. Each descriptor is</w:t>
@@ -2240,18 +2086,18 @@
         <w:t xml:space="preserve"> </w:t>
       </w:r>
       <w:r>
-        <w:t xml:space="preserve">(</w:t>
+        <w:t xml:space="preserve">[</w:t>
       </w:r>
       <w:hyperlink w:anchor="ref-howard2019mobilenetv3">
         <w:r>
           <w:rPr>
             <w:rStyle w:val="Hyperlink"/>
           </w:rPr>
-          <w:t xml:space="preserve">Howard et al. 2019</w:t>
+          <w:t xml:space="preserve">15</w:t>
         </w:r>
       </w:hyperlink>
       <w:r>
-        <w:t xml:space="preserve">)</w:t>
+        <w:t xml:space="preserve">]</w:t>
       </w:r>
       <w:r>
         <w:t xml:space="preserve"> </w:t>
@@ -2263,18 +2109,18 @@
         <w:t xml:space="preserve"> </w:t>
       </w:r>
       <w:r>
-        <w:t xml:space="preserve">(</w:t>
+        <w:t xml:space="preserve">[</w:t>
       </w:r>
       <w:hyperlink w:anchor="ref-tan2019efficientnet">
         <w:r>
           <w:rPr>
             <w:rStyle w:val="Hyperlink"/>
           </w:rPr>
-          <w:t xml:space="preserve">Tan and Le 2019</w:t>
+          <w:t xml:space="preserve">35</w:t>
         </w:r>
       </w:hyperlink>
       <w:r>
-        <w:t xml:space="preserve">)</w:t>
+        <w:t xml:space="preserve">]</w:t>
       </w:r>
       <w:r>
         <w:t xml:space="preserve">. Each is fine-tuned end to end at</w:t>
@@ -2306,18 +2152,18 @@
         <w:t xml:space="preserve"> </w:t>
       </w:r>
       <w:r>
-        <w:t xml:space="preserve">(</w:t>
+        <w:t xml:space="preserve">[</w:t>
       </w:r>
       <w:hyperlink w:anchor="ref-loshchilov2019adamw">
         <w:r>
           <w:rPr>
             <w:rStyle w:val="Hyperlink"/>
           </w:rPr>
-          <w:t xml:space="preserve">Loshchilov and Hutter 2019</w:t>
+          <w:t xml:space="preserve">36</w:t>
         </w:r>
       </w:hyperlink>
       <w:r>
-        <w:t xml:space="preserve">)</w:t>
+        <w:t xml:space="preserve">]</w:t>
       </w:r>
       <w:r>
         <w:t xml:space="preserve"> </w:t>
@@ -2390,18 +2236,18 @@
         <w:t xml:space="preserve"> </w:t>
       </w:r>
       <w:r>
-        <w:t xml:space="preserve">(</w:t>
+        <w:t xml:space="preserve">[</w:t>
       </w:r>
       <w:hyperlink w:anchor="ref-lin2017focal">
         <w:r>
           <w:rPr>
             <w:rStyle w:val="Hyperlink"/>
           </w:rPr>
-          <w:t xml:space="preserve">Lin et al. 2017</w:t>
+          <w:t xml:space="preserve">37</w:t>
         </w:r>
       </w:hyperlink>
       <w:r>
-        <w:t xml:space="preserve">)</w:t>
+        <w:t xml:space="preserve">]</w:t>
       </w:r>
       <w:r>
         <w:t xml:space="preserve"> </w:t>
@@ -3892,7 +3738,7 @@
       <w:r>
         <w:drawing>
           <wp:inline>
-            <wp:extent cx="5006263" cy="2871644"/>
+            <wp:extent cx="5006263" cy="2868585"/>
             <wp:effectExtent b="0" l="0" r="0" t="0"/>
             <wp:docPr descr="Figure 2. System architecture as deployed." title="" id="32" name="Picture"/>
             <a:graphic>
@@ -3913,7 +3759,7 @@
                   <pic:spPr bwMode="auto">
                     <a:xfrm>
                       <a:off x="0" y="0"/>
-                      <a:ext cx="5006263" cy="2871644"/>
+                      <a:ext cx="5006263" cy="2868585"/>
                     </a:xfrm>
                     <a:prstGeom prst="rect">
                       <a:avLst/>
@@ -3983,18 +3829,18 @@
         <w:t xml:space="preserve"> </w:t>
       </w:r>
       <w:r>
-        <w:t xml:space="preserve">(</w:t>
+        <w:t xml:space="preserve">[</w:t>
       </w:r>
       <w:hyperlink w:anchor="ref-donenfeld2017wireguard">
         <w:r>
           <w:rPr>
             <w:rStyle w:val="Hyperlink"/>
           </w:rPr>
-          <w:t xml:space="preserve">Donenfeld 2017</w:t>
+          <w:t xml:space="preserve">38</w:t>
         </w:r>
       </w:hyperlink>
       <w:r>
-        <w:t xml:space="preserve">)</w:t>
+        <w:t xml:space="preserve">]</w:t>
       </w:r>
       <w:r>
         <w:t xml:space="preserve"> </w:t>
@@ -6136,30 +5982,18 @@
         <w:t xml:space="preserve"> </w:t>
       </w:r>
       <w:r>
-        <w:t xml:space="preserve">(</w:t>
+        <w:t xml:space="preserve">[</w:t>
       </w:r>
       <w:hyperlink w:anchor="ref-onnx2019">
         <w:r>
           <w:rPr>
             <w:rStyle w:val="Hyperlink"/>
           </w:rPr>
-          <w:t xml:space="preserve">Bai et al.</w:t>
-        </w:r>
-        <w:r>
-          <w:rPr>
-            <w:rStyle w:val="Hyperlink"/>
-          </w:rPr>
-          <w:t xml:space="preserve"> </w:t>
-        </w:r>
-        <w:r>
-          <w:rPr>
-            <w:rStyle w:val="Hyperlink"/>
-          </w:rPr>
-          <w:t xml:space="preserve">2019</w:t>
+          <w:t xml:space="preserve">39</w:t>
         </w:r>
       </w:hyperlink>
       <w:r>
-        <w:t xml:space="preserve">)</w:t>
+        <w:t xml:space="preserve">]</w:t>
       </w:r>
       <w:r>
         <w:t xml:space="preserve"> </w:t>
@@ -6301,18 +6135,18 @@
         <w:t xml:space="preserve"> </w:t>
       </w:r>
       <w:r>
-        <w:t xml:space="preserve">(</w:t>
+        <w:t xml:space="preserve">[</w:t>
       </w:r>
       <w:hyperlink w:anchor="ref-nvidia2022tensorrt">
         <w:r>
           <w:rPr>
             <w:rStyle w:val="Hyperlink"/>
           </w:rPr>
-          <w:t xml:space="preserve">NVIDIA Corporation 2022</w:t>
+          <w:t xml:space="preserve">40</w:t>
         </w:r>
       </w:hyperlink>
       <w:r>
-        <w:t xml:space="preserve">)</w:t>
+        <w:t xml:space="preserve">]</w:t>
       </w:r>
       <w:r>
         <w:t xml:space="preserve"> </w:t>
@@ -7703,7 +7537,7 @@
                 <w:b/>
                 <w:bCs/>
               </w:rPr>
-              <w:t xml:space="preserve">(</w:t>
+              <w:t xml:space="preserve">[</w:t>
             </w:r>
             <w:hyperlink w:anchor="ref-95">
               <w:r>
@@ -7722,7 +7556,7 @@
                 <w:b/>
                 <w:bCs/>
               </w:rPr>
-              <w:t xml:space="preserve">)</w:t>
+              <w:t xml:space="preserve">]</w:t>
             </w:r>
             <w:r>
               <w:rPr>
@@ -9497,18 +9331,18 @@
         <w:t xml:space="preserve"> </w:t>
       </w:r>
       <w:r>
-        <w:t xml:space="preserve">(</w:t>
+        <w:t xml:space="preserve">[</w:t>
       </w:r>
       <w:hyperlink w:anchor="ref-guo2017calibration">
         <w:r>
           <w:rPr>
             <w:rStyle w:val="Hyperlink"/>
           </w:rPr>
-          <w:t xml:space="preserve">Guo et al. 2017</w:t>
+          <w:t xml:space="preserve">32</w:t>
         </w:r>
       </w:hyperlink>
       <w:r>
-        <w:t xml:space="preserve">)</w:t>
+        <w:t xml:space="preserve">]</w:t>
       </w:r>
       <w:r>
         <w:t xml:space="preserve"> </w:t>
@@ -9665,7 +9499,7 @@
                 <w:b/>
                 <w:bCs/>
               </w:rPr>
-              <w:t xml:space="preserve">(</w:t>
+              <w:t xml:space="preserve">[</w:t>
             </w:r>
             <w:hyperlink w:anchor="ref-95">
               <w:r>
@@ -9684,7 +9518,7 @@
                 <w:b/>
                 <w:bCs/>
               </w:rPr>
-              <w:t xml:space="preserve">)</w:t>
+              <w:t xml:space="preserve">]</w:t>
             </w:r>
             <w:r>
               <w:rPr>
@@ -9730,7 +9564,7 @@
                 <w:b/>
                 <w:bCs/>
               </w:rPr>
-              <w:t xml:space="preserve">(</w:t>
+              <w:t xml:space="preserve">[</w:t>
             </w:r>
             <w:hyperlink w:anchor="ref-95">
               <w:r>
@@ -9749,7 +9583,7 @@
                 <w:b/>
                 <w:bCs/>
               </w:rPr>
-              <w:t xml:space="preserve">)</w:t>
+              <w:t xml:space="preserve">]</w:t>
             </w:r>
             <w:r>
               <w:rPr>
@@ -10395,18 +10229,18 @@
         <w:t xml:space="preserve"> </w:t>
       </w:r>
       <w:r>
-        <w:t xml:space="preserve">(</w:t>
+        <w:t xml:space="preserve">[</w:t>
       </w:r>
       <w:hyperlink w:anchor="ref-hinton2015distilling">
         <w:r>
           <w:rPr>
             <w:rStyle w:val="Hyperlink"/>
           </w:rPr>
-          <w:t xml:space="preserve">Hinton et al. 2015</w:t>
+          <w:t xml:space="preserve">41</w:t>
         </w:r>
       </w:hyperlink>
       <w:r>
-        <w:t xml:space="preserve">)</w:t>
+        <w:t xml:space="preserve">]</w:t>
       </w:r>
       <w:r>
         <w:t xml:space="preserve"> </w:t>
@@ -14266,18 +14100,18 @@
         <w:t xml:space="preserve"> </w:t>
       </w:r>
       <w:r>
-        <w:t xml:space="preserve">(</w:t>
+        <w:t xml:space="preserve">[</w:t>
       </w:r>
       <w:hyperlink w:anchor="ref-wei2024plantwild">
         <w:r>
           <w:rPr>
             <w:rStyle w:val="Hyperlink"/>
           </w:rPr>
-          <w:t xml:space="preserve">Wei et al. 2024b</w:t>
+          <w:t xml:space="preserve">10</w:t>
         </w:r>
       </w:hyperlink>
       <w:r>
-        <w:t xml:space="preserve">)</w:t>
+        <w:t xml:space="preserve">]</w:t>
       </w:r>
       <w:r>
         <w:t xml:space="preserve"> </w:t>
@@ -14329,40 +14163,270 @@
       </w:r>
     </w:p>
     <w:bookmarkStart w:id="209" w:name="refs"/>
-    <w:bookmarkStart w:id="137" w:name="ref-ahmad2023toward"/>
+    <w:bookmarkStart w:id="137" w:name="ref-savary2019global"/>
     <w:p>
       <w:pPr>
         <w:pStyle w:val="Bibliography"/>
       </w:pPr>
       <w:r>
-        <w:t xml:space="preserve">Ahmad, Aanis, Aly El Gamal, and Dharmendra Saraswat. 2023.</w:t>
-      </w:r>
-      <w:r>
-        <w:t xml:space="preserve"> </w:t>
-      </w:r>
-      <w:r>
-        <w:t xml:space="preserve">“Toward Generalization of Deep Learning-Based Plant Disease Identification Under Controlled and Field Conditions.”</w:t>
-      </w:r>
-      <w:r>
-        <w:t xml:space="preserve"> </w:t>
-      </w:r>
-      <w:r>
-        <w:rPr>
-          <w:i/>
-          <w:iCs/>
-        </w:rPr>
-        <w:t xml:space="preserve">IEEE Access</w:t>
-      </w:r>
-      <w:r>
-        <w:t xml:space="preserve"> </w:t>
-      </w:r>
-      <w:r>
-        <w:t xml:space="preserve">11: 9042–57.</w:t>
+        <w:t xml:space="preserve">[1]</w:t>
+      </w:r>
+      <w:r>
+        <w:t xml:space="preserve"> </w:t>
+      </w:r>
+      <w:r>
+        <w:t xml:space="preserve">	</w:t>
+      </w:r>
+      <w:r>
+        <w:t xml:space="preserve">S. Savary, L. Willocquet, S.J. Pethybridge, P. Esker, N. McRoberts, A. Nelson, The global burden of pathogens and pests on major food crops, Nature Ecology &amp; Evolution 3 (2019) 430–439,</w:t>
       </w:r>
       <w:r>
         <w:t xml:space="preserve"> </w:t>
       </w:r>
       <w:hyperlink r:id="rId136">
+        <w:r>
+          <w:rPr>
+            <w:rStyle w:val="Hyperlink"/>
+          </w:rPr>
+          <w:t xml:space="preserve">https://doi.org/10.1038/s41559-018-0793-y</w:t>
+        </w:r>
+      </w:hyperlink>
+      <w:r>
+        <w:t xml:space="preserve">.</w:t>
+      </w:r>
+    </w:p>
+    <w:bookmarkEnd w:id="137"/>
+    <w:bookmarkStart w:id="139" w:name="ref-kamilaris2018survey"/>
+    <w:p>
+      <w:pPr>
+        <w:pStyle w:val="Bibliography"/>
+      </w:pPr>
+      <w:r>
+        <w:t xml:space="preserve">[2]</w:t>
+      </w:r>
+      <w:r>
+        <w:t xml:space="preserve"> </w:t>
+      </w:r>
+      <w:r>
+        <w:t xml:space="preserve">	</w:t>
+      </w:r>
+      <w:r>
+        <w:t xml:space="preserve">A. Kamilaris, F.X. Prenafeta-Boldú, Deep learning in agriculture: A survey, Computers and Electronics in Agriculture 147 (2018) 70–90,</w:t>
+      </w:r>
+      <w:r>
+        <w:t xml:space="preserve"> </w:t>
+      </w:r>
+      <w:hyperlink r:id="rId138">
+        <w:r>
+          <w:rPr>
+            <w:rStyle w:val="Hyperlink"/>
+          </w:rPr>
+          <w:t xml:space="preserve">https://doi.org/10.1016/j.compag.2018.02.016</w:t>
+        </w:r>
+      </w:hyperlink>
+      <w:r>
+        <w:t xml:space="preserve">.</w:t>
+      </w:r>
+    </w:p>
+    <w:bookmarkEnd w:id="139"/>
+    <w:bookmarkStart w:id="141" w:name="ref-mohanty2016deeplearning"/>
+    <w:p>
+      <w:pPr>
+        <w:pStyle w:val="Bibliography"/>
+      </w:pPr>
+      <w:r>
+        <w:t xml:space="preserve">[3]</w:t>
+      </w:r>
+      <w:r>
+        <w:t xml:space="preserve"> </w:t>
+      </w:r>
+      <w:r>
+        <w:t xml:space="preserve">	</w:t>
+      </w:r>
+      <w:r>
+        <w:t xml:space="preserve">S.P. Mohanty, D.P. Hughes, M. Salathé, Using deep learning for image-based plant disease detection, Frontiers in Plant Science 7 (2016) 1419,</w:t>
+      </w:r>
+      <w:r>
+        <w:t xml:space="preserve"> </w:t>
+      </w:r>
+      <w:hyperlink r:id="rId140">
+        <w:r>
+          <w:rPr>
+            <w:rStyle w:val="Hyperlink"/>
+          </w:rPr>
+          <w:t xml:space="preserve">https://doi.org/10.3389/fpls.2016.01419</w:t>
+        </w:r>
+      </w:hyperlink>
+      <w:r>
+        <w:t xml:space="preserve">.</w:t>
+      </w:r>
+    </w:p>
+    <w:bookmarkEnd w:id="141"/>
+    <w:bookmarkStart w:id="143" w:name="ref-ferentinos2018deep"/>
+    <w:p>
+      <w:pPr>
+        <w:pStyle w:val="Bibliography"/>
+      </w:pPr>
+      <w:r>
+        <w:t xml:space="preserve">[4]</w:t>
+      </w:r>
+      <w:r>
+        <w:t xml:space="preserve"> </w:t>
+      </w:r>
+      <w:r>
+        <w:t xml:space="preserve">	</w:t>
+      </w:r>
+      <w:r>
+        <w:t xml:space="preserve">K.P. Ferentinos, Deep learning models for plant disease detection and diagnosis, Computers and Electronics in Agriculture 145 (2018) 311–318,</w:t>
+      </w:r>
+      <w:r>
+        <w:t xml:space="preserve"> </w:t>
+      </w:r>
+      <w:hyperlink r:id="rId142">
+        <w:r>
+          <w:rPr>
+            <w:rStyle w:val="Hyperlink"/>
+          </w:rPr>
+          <w:t xml:space="preserve">https://doi.org/10.1016/j.compag.2018.01.009</w:t>
+        </w:r>
+      </w:hyperlink>
+      <w:r>
+        <w:t xml:space="preserve">.</w:t>
+      </w:r>
+    </w:p>
+    <w:bookmarkEnd w:id="143"/>
+    <w:bookmarkStart w:id="145" w:name="ref-hughes2015plantvillage"/>
+    <w:p>
+      <w:pPr>
+        <w:pStyle w:val="Bibliography"/>
+      </w:pPr>
+      <w:r>
+        <w:t xml:space="preserve">[5]</w:t>
+      </w:r>
+      <w:r>
+        <w:t xml:space="preserve"> </w:t>
+      </w:r>
+      <w:r>
+        <w:t xml:space="preserve">	</w:t>
+      </w:r>
+      <w:r>
+        <w:t xml:space="preserve">D.P. Hughes, M. Salathé, An open access repository of images on plant health to enable the development of mobile disease diagnostics, 2015,</w:t>
+      </w:r>
+      <w:r>
+        <w:t xml:space="preserve"> </w:t>
+      </w:r>
+      <w:hyperlink r:id="rId144">
+        <w:r>
+          <w:rPr>
+            <w:rStyle w:val="Hyperlink"/>
+          </w:rPr>
+          <w:t xml:space="preserve">https://doi.org/10.48550/arXiv.1511.08060</w:t>
+        </w:r>
+      </w:hyperlink>
+      <w:r>
+        <w:t xml:space="preserve">.</w:t>
+      </w:r>
+    </w:p>
+    <w:bookmarkEnd w:id="145"/>
+    <w:bookmarkStart w:id="147" w:name="ref-barbedo2018impact"/>
+    <w:p>
+      <w:pPr>
+        <w:pStyle w:val="Bibliography"/>
+      </w:pPr>
+      <w:r>
+        <w:t xml:space="preserve">[6]</w:t>
+      </w:r>
+      <w:r>
+        <w:t xml:space="preserve"> </w:t>
+      </w:r>
+      <w:r>
+        <w:t xml:space="preserve">	</w:t>
+      </w:r>
+      <w:r>
+        <w:t xml:space="preserve">J.G.A. Barbedo, Impact of dataset size and variety on the effectiveness of deep learning and transfer learning for plant disease classification, Computers and Electronics in Agriculture 153 (2018) 46–53,</w:t>
+      </w:r>
+      <w:r>
+        <w:t xml:space="preserve"> </w:t>
+      </w:r>
+      <w:hyperlink r:id="rId146">
+        <w:r>
+          <w:rPr>
+            <w:rStyle w:val="Hyperlink"/>
+          </w:rPr>
+          <w:t xml:space="preserve">https://doi.org/10.1016/j.compag.2018.08.013</w:t>
+        </w:r>
+      </w:hyperlink>
+      <w:r>
+        <w:t xml:space="preserve">.</w:t>
+      </w:r>
+    </w:p>
+    <w:bookmarkEnd w:id="147"/>
+    <w:bookmarkStart w:id="149" w:name="ref-noyan2022uncovering"/>
+    <w:p>
+      <w:pPr>
+        <w:pStyle w:val="Bibliography"/>
+      </w:pPr>
+      <w:r>
+        <w:t xml:space="preserve">[7]</w:t>
+      </w:r>
+      <w:r>
+        <w:t xml:space="preserve"> </w:t>
+      </w:r>
+      <w:r>
+        <w:t xml:space="preserve">	</w:t>
+      </w:r>
+      <w:r>
+        <w:t xml:space="preserve">M.A. Noyan, Uncovering bias in the</w:t>
+      </w:r>
+      <w:r>
+        <w:t xml:space="preserve"> </w:t>
+      </w:r>
+      <w:r>
+        <w:t xml:space="preserve">PlantVillage</w:t>
+      </w:r>
+      <w:r>
+        <w:t xml:space="preserve"> </w:t>
+      </w:r>
+      <w:r>
+        <w:t xml:space="preserve">dataset, 2022,</w:t>
+      </w:r>
+      <w:r>
+        <w:t xml:space="preserve"> </w:t>
+      </w:r>
+      <w:hyperlink r:id="rId148">
+        <w:r>
+          <w:rPr>
+            <w:rStyle w:val="Hyperlink"/>
+          </w:rPr>
+          <w:t xml:space="preserve">https://doi.org/10.48550/arXiv.2206.04374</w:t>
+        </w:r>
+      </w:hyperlink>
+      <w:r>
+        <w:t xml:space="preserve">.</w:t>
+      </w:r>
+    </w:p>
+    <w:bookmarkEnd w:id="149"/>
+    <w:bookmarkStart w:id="151" w:name="ref-ahmad2023toward"/>
+    <w:p>
+      <w:pPr>
+        <w:pStyle w:val="Bibliography"/>
+      </w:pPr>
+      <w:r>
+        <w:t xml:space="preserve">[8]</w:t>
+      </w:r>
+      <w:r>
+        <w:t xml:space="preserve"> </w:t>
+      </w:r>
+      <w:r>
+        <w:t xml:space="preserve">	</w:t>
+      </w:r>
+      <w:r>
+        <w:t xml:space="preserve">A. Ahmad, A.E. Gamal, D. Saraswat, Toward generalization of deep learning-based plant disease identification under controlled and field conditions, IEEE Access 11 (2023) 9042–9057,</w:t>
+      </w:r>
+      <w:r>
+        <w:t xml:space="preserve"> </w:t>
+      </w:r>
+      <w:hyperlink r:id="rId150">
         <w:r>
           <w:rPr>
             <w:rStyle w:val="Hyperlink"/>
@@ -14374,134 +14438,396 @@
         <w:t xml:space="preserve">.</w:t>
       </w:r>
     </w:p>
-    <w:bookmarkEnd w:id="137"/>
-    <w:bookmarkStart w:id="139" w:name="ref-onnx2019"/>
+    <w:bookmarkEnd w:id="151"/>
+    <w:bookmarkStart w:id="153" w:name="ref-wu2023fromlaboratoryto"/>
     <w:p>
       <w:pPr>
         <w:pStyle w:val="Bibliography"/>
       </w:pPr>
       <w:r>
-        <w:t xml:space="preserve">Bai, Junjie, Fang Lu, Ke Zhang, et al.</w:t>
-      </w:r>
-      <w:r>
-        <w:t xml:space="preserve"> 2019.</w:t>
-      </w:r>
-      <w:r>
-        <w:t xml:space="preserve"> </w:t>
-      </w:r>
-      <w:r>
-        <w:rPr>
-          <w:i/>
-          <w:iCs/>
-        </w:rPr>
-        <w:t xml:space="preserve">ONNX</w:t>
-      </w:r>
-      <w:r>
-        <w:rPr>
-          <w:i/>
-          <w:iCs/>
-        </w:rPr>
-        <w:t xml:space="preserve">: Open Neural Network Exchange</w:t>
-      </w:r>
-      <w:r>
-        <w:t xml:space="preserve">.</w:t>
-      </w:r>
-      <w:r>
-        <w:t xml:space="preserve"> </w:t>
-      </w:r>
-      <w:hyperlink r:id="rId138">
+        <w:t xml:space="preserve">[9]</w:t>
+      </w:r>
+      <w:r>
+        <w:t xml:space="preserve"> </w:t>
+      </w:r>
+      <w:r>
+        <w:t xml:space="preserve">	</w:t>
+      </w:r>
+      <w:r>
+        <w:t xml:space="preserve">X. Wu, X. Fan, P. Luo, S.D. Choudhury, T. Tjahjadi, C. Hu, From laboratory to field: Unsupervised domain adaptation for plant disease recognition in the wild, Plant Phenomics 5 (2023) 0038,</w:t>
+      </w:r>
+      <w:r>
+        <w:t xml:space="preserve"> </w:t>
+      </w:r>
+      <w:hyperlink r:id="rId152">
         <w:r>
           <w:rPr>
             <w:rStyle w:val="Hyperlink"/>
           </w:rPr>
-          <w:t xml:space="preserve">Https://github.com/onnx/onnx</w:t>
+          <w:t xml:space="preserve">https://doi.org/10.34133/plantphenomics.0038</w:t>
         </w:r>
       </w:hyperlink>
       <w:r>
         <w:t xml:space="preserve">.</w:t>
       </w:r>
     </w:p>
-    <w:bookmarkEnd w:id="139"/>
-    <w:bookmarkStart w:id="141" w:name="ref-barbedo2018impact"/>
+    <w:bookmarkEnd w:id="153"/>
+    <w:bookmarkStart w:id="155" w:name="ref-wei2024plantwild"/>
     <w:p>
       <w:pPr>
         <w:pStyle w:val="Bibliography"/>
       </w:pPr>
       <w:r>
-        <w:t xml:space="preserve">Barbedo, Jayme G. A. 2018.</w:t>
-      </w:r>
-      <w:r>
-        <w:t xml:space="preserve"> </w:t>
-      </w:r>
-      <w:r>
-        <w:t xml:space="preserve">“Impact of Dataset Size and Variety on the Effectiveness of Deep Learning and Transfer Learning for Plant Disease Classification.”</w:t>
-      </w:r>
-      <w:r>
-        <w:t xml:space="preserve"> </w:t>
-      </w:r>
-      <w:r>
-        <w:rPr>
-          <w:i/>
-          <w:iCs/>
-        </w:rPr>
-        <w:t xml:space="preserve">Computers and Electronics in Agriculture</w:t>
-      </w:r>
-      <w:r>
-        <w:t xml:space="preserve"> </w:t>
-      </w:r>
-      <w:r>
-        <w:t xml:space="preserve">153: 46–53.</w:t>
-      </w:r>
-      <w:r>
-        <w:t xml:space="preserve"> </w:t>
-      </w:r>
-      <w:hyperlink r:id="rId140">
+        <w:t xml:space="preserve">[10]</w:t>
+      </w:r>
+      <w:r>
+        <w:t xml:space="preserve"> </w:t>
+      </w:r>
+      <w:r>
+        <w:t xml:space="preserve">	</w:t>
+      </w:r>
+      <w:r>
+        <w:t xml:space="preserve">T. Wei, Z. Chen, Z. Huang, X. Yu, Plant disease recognition in the wild, in: Proceedings of the 32nd ACM international conference on multimedia (MM ’24), 2024,</w:t>
+      </w:r>
+      <w:r>
+        <w:t xml:space="preserve"> </w:t>
+      </w:r>
+      <w:hyperlink r:id="rId154">
         <w:r>
           <w:rPr>
             <w:rStyle w:val="Hyperlink"/>
           </w:rPr>
-          <w:t xml:space="preserve">https://doi.org/10.1016/j.compag.2018.08.013</w:t>
+          <w:t xml:space="preserve">https://doi.org/10.1145/3664647.3681614</w:t>
         </w:r>
       </w:hyperlink>
       <w:r>
         <w:t xml:space="preserve">.</w:t>
       </w:r>
     </w:p>
-    <w:bookmarkEnd w:id="141"/>
-    <w:bookmarkStart w:id="143" w:name="ref-chow1970reject"/>
+    <w:bookmarkEnd w:id="155"/>
+    <w:bookmarkStart w:id="156" w:name="ref-oquab2024dinov2"/>
     <w:p>
       <w:pPr>
         <w:pStyle w:val="Bibliography"/>
       </w:pPr>
       <w:r>
-        <w:t xml:space="preserve">Chow, C. K. 1970.</w:t>
-      </w:r>
-      <w:r>
-        <w:t xml:space="preserve"> </w:t>
-      </w:r>
-      <w:r>
-        <w:t xml:space="preserve">“On Optimum Recognition Error and Reject Tradeoff.”</w:t>
-      </w:r>
-      <w:r>
-        <w:t xml:space="preserve"> </w:t>
-      </w:r>
-      <w:r>
-        <w:rPr>
-          <w:i/>
-          <w:iCs/>
-        </w:rPr>
-        <w:t xml:space="preserve">IEEE Transactions on Information Theory</w:t>
-      </w:r>
-      <w:r>
-        <w:t xml:space="preserve"> </w:t>
-      </w:r>
-      <w:r>
-        <w:t xml:space="preserve">16 (1): 41–46.</w:t>
-      </w:r>
-      <w:r>
-        <w:t xml:space="preserve"> </w:t>
-      </w:r>
-      <w:hyperlink r:id="rId142">
+        <w:t xml:space="preserve">[11]</w:t>
+      </w:r>
+      <w:r>
+        <w:t xml:space="preserve"> </w:t>
+      </w:r>
+      <w:r>
+        <w:t xml:space="preserve">	</w:t>
+      </w:r>
+      <w:r>
+        <w:t xml:space="preserve">M. Oquab, T. Darcet, T. Moutakanni, H.V. Vo, M. Szafraniec, V. Khalidov, P. Fernandez, D. Haziza, F. Massa, A. El-Nouby, others</w:t>
+      </w:r>
+      <w:r>
+        <w:t xml:space="preserve">,</w:t>
+      </w:r>
+      <w:r>
+        <w:t xml:space="preserve"> </w:t>
+      </w:r>
+      <w:r>
+        <w:t xml:space="preserve">DINOv2</w:t>
+      </w:r>
+      <w:r>
+        <w:t xml:space="preserve">: Learning robust visual features without supervision, Transactions on Machine Learning Research (TMLR), 2024.</w:t>
+      </w:r>
+    </w:p>
+    <w:bookmarkEnd w:id="156"/>
+    <w:bookmarkStart w:id="158" w:name="ref-simeoni2025dinov3"/>
+    <w:p>
+      <w:pPr>
+        <w:pStyle w:val="Bibliography"/>
+      </w:pPr>
+      <w:r>
+        <w:t xml:space="preserve">[12]</w:t>
+      </w:r>
+      <w:r>
+        <w:t xml:space="preserve"> </w:t>
+      </w:r>
+      <w:r>
+        <w:t xml:space="preserve">	</w:t>
+      </w:r>
+      <w:r>
+        <w:t xml:space="preserve">O. Siméoni, H.V. Vo, M. Seitzer, F. Baldassarre, M. Oquab, others</w:t>
+      </w:r>
+      <w:r>
+        <w:t xml:space="preserve">,</w:t>
+      </w:r>
+      <w:r>
+        <w:t xml:space="preserve"> </w:t>
+      </w:r>
+      <w:r>
+        <w:t xml:space="preserve">DINOv3</w:t>
+      </w:r>
+      <w:r>
+        <w:t xml:space="preserve">: A versatile vision foundation model, Transactions on Machine Learning Research (TMLR), 2026,</w:t>
+      </w:r>
+      <w:r>
+        <w:t xml:space="preserve"> </w:t>
+      </w:r>
+      <w:hyperlink r:id="rId157">
+        <w:r>
+          <w:rPr>
+            <w:rStyle w:val="Hyperlink"/>
+          </w:rPr>
+          <w:t xml:space="preserve">https://openreview.net/forum?id=2NlGyqNjns</w:t>
+        </w:r>
+      </w:hyperlink>
+      <w:r>
+        <w:t xml:space="preserve">.</w:t>
+      </w:r>
+    </w:p>
+    <w:bookmarkEnd w:id="158"/>
+    <w:bookmarkStart w:id="159" w:name="ref-radford2021clip"/>
+    <w:p>
+      <w:pPr>
+        <w:pStyle w:val="Bibliography"/>
+      </w:pPr>
+      <w:r>
+        <w:t xml:space="preserve">[13]</w:t>
+      </w:r>
+      <w:r>
+        <w:t xml:space="preserve"> </w:t>
+      </w:r>
+      <w:r>
+        <w:t xml:space="preserve">	</w:t>
+      </w:r>
+      <w:r>
+        <w:t xml:space="preserve">A. Radford, J.W. Kim, C. Hallacy, A. Ramesh, G. Goh, S. Agarwal, G. Sastry, A. Askell, P. Mishkin, J. Clark, G. Krueger, I. Sutskever, Learning transferable visual models from natural language supervision, in: International conference on machine learning (ICML), 2021, pp. 8748–8763.</w:t>
+      </w:r>
+    </w:p>
+    <w:bookmarkEnd w:id="159"/>
+    <w:bookmarkStart w:id="161" w:name="ref-elkarch2026backbone"/>
+    <w:p>
+      <w:pPr>
+        <w:pStyle w:val="Bibliography"/>
+      </w:pPr>
+      <w:r>
+        <w:t xml:space="preserve">[14]</w:t>
+      </w:r>
+      <w:r>
+        <w:t xml:space="preserve"> </w:t>
+      </w:r>
+      <w:r>
+        <w:t xml:space="preserve">	</w:t>
+      </w:r>
+      <w:r>
+        <w:t xml:space="preserve">H. El Karch, Y. Natij, M. Benaly, R. El Gouri, A. Mezouari, Backbone diversity beats text supervision: A systematic study of frozen multi-foundation model fusion for in-the-wild plant disease recognition, Frontiers in Plant Science 17 (2026) 1860665,</w:t>
+      </w:r>
+      <w:r>
+        <w:t xml:space="preserve"> </w:t>
+      </w:r>
+      <w:hyperlink r:id="rId160">
+        <w:r>
+          <w:rPr>
+            <w:rStyle w:val="Hyperlink"/>
+          </w:rPr>
+          <w:t xml:space="preserve">https://doi.org/10.3389/fpls.2026.1860665</w:t>
+        </w:r>
+      </w:hyperlink>
+      <w:r>
+        <w:t xml:space="preserve">.</w:t>
+      </w:r>
+    </w:p>
+    <w:bookmarkEnd w:id="161"/>
+    <w:bookmarkStart w:id="163" w:name="ref-howard2019mobilenetv3"/>
+    <w:p>
+      <w:pPr>
+        <w:pStyle w:val="Bibliography"/>
+      </w:pPr>
+      <w:r>
+        <w:t xml:space="preserve">[15]</w:t>
+      </w:r>
+      <w:r>
+        <w:t xml:space="preserve"> </w:t>
+      </w:r>
+      <w:r>
+        <w:t xml:space="preserve">	</w:t>
+      </w:r>
+      <w:r>
+        <w:t xml:space="preserve">A. Howard, M. Sandler, G. Chu, L.-C. Chen, B. Chen, M. Tan, W. Wang, Y. Zhu, R. Pang, V. Vasudevan, Q.V. Le, H. Adam, Searching for</w:t>
+      </w:r>
+      <w:r>
+        <w:t xml:space="preserve"> </w:t>
+      </w:r>
+      <w:r>
+        <w:t xml:space="preserve">MobileNetV3</w:t>
+      </w:r>
+      <w:r>
+        <w:t xml:space="preserve">, in: IEEE/CVF international conference on computer vision (ICCV), 2019, pp. 1314–1324,</w:t>
+      </w:r>
+      <w:r>
+        <w:t xml:space="preserve"> </w:t>
+      </w:r>
+      <w:hyperlink r:id="rId162">
+        <w:r>
+          <w:rPr>
+            <w:rStyle w:val="Hyperlink"/>
+          </w:rPr>
+          <w:t xml:space="preserve">https://doi.org/10.1109/ICCV.2019.00140</w:t>
+        </w:r>
+      </w:hyperlink>
+      <w:r>
+        <w:t xml:space="preserve">.</w:t>
+      </w:r>
+    </w:p>
+    <w:bookmarkEnd w:id="163"/>
+    <w:bookmarkStart w:id="165" w:name="ref-wolfert2017bigdata"/>
+    <w:p>
+      <w:pPr>
+        <w:pStyle w:val="Bibliography"/>
+      </w:pPr>
+      <w:r>
+        <w:t xml:space="preserve">[16]</w:t>
+      </w:r>
+      <w:r>
+        <w:t xml:space="preserve"> </w:t>
+      </w:r>
+      <w:r>
+        <w:t xml:space="preserve">	</w:t>
+      </w:r>
+      <w:r>
+        <w:t xml:space="preserve">S. Wolfert, L. Ge, C. Verdouw, M.-J. Bogaardt, Big data in smart farming – a review, Agricultural Systems 153 (2017) 69–80,</w:t>
+      </w:r>
+      <w:r>
+        <w:t xml:space="preserve"> </w:t>
+      </w:r>
+      <w:hyperlink r:id="rId164">
+        <w:r>
+          <w:rPr>
+            <w:rStyle w:val="Hyperlink"/>
+          </w:rPr>
+          <w:t xml:space="preserve">https://doi.org/10.1016/j.agsy.2017.01.023</w:t>
+        </w:r>
+      </w:hyperlink>
+      <w:r>
+        <w:t xml:space="preserve">.</w:t>
+      </w:r>
+    </w:p>
+    <w:bookmarkEnd w:id="165"/>
+    <w:bookmarkStart w:id="167" w:name="ref-ogrady2019edge"/>
+    <w:p>
+      <w:pPr>
+        <w:pStyle w:val="Bibliography"/>
+      </w:pPr>
+      <w:r>
+        <w:t xml:space="preserve">[17]</w:t>
+      </w:r>
+      <w:r>
+        <w:t xml:space="preserve"> </w:t>
+      </w:r>
+      <w:r>
+        <w:t xml:space="preserve">	</w:t>
+      </w:r>
+      <w:r>
+        <w:t xml:space="preserve">M.J. O’Grady, D. Langton, G.M.P. O’Hare, Edge computing: A tractable model for smart agriculture?, Artificial Intelligence in Agriculture 3 (2019) 42–51,</w:t>
+      </w:r>
+      <w:r>
+        <w:t xml:space="preserve"> </w:t>
+      </w:r>
+      <w:hyperlink r:id="rId166">
+        <w:r>
+          <w:rPr>
+            <w:rStyle w:val="Hyperlink"/>
+          </w:rPr>
+          <w:t xml:space="preserve">https://doi.org/10.1016/j.aiia.2019.12.001</w:t>
+        </w:r>
+      </w:hyperlink>
+      <w:r>
+        <w:t xml:space="preserve">.</w:t>
+      </w:r>
+    </w:p>
+    <w:bookmarkEnd w:id="167"/>
+    <w:bookmarkStart w:id="169" w:name="ref-shi2016edge"/>
+    <w:p>
+      <w:pPr>
+        <w:pStyle w:val="Bibliography"/>
+      </w:pPr>
+      <w:r>
+        <w:t xml:space="preserve">[18]</w:t>
+      </w:r>
+      <w:r>
+        <w:t xml:space="preserve"> </w:t>
+      </w:r>
+      <w:r>
+        <w:t xml:space="preserve">	</w:t>
+      </w:r>
+      <w:r>
+        <w:t xml:space="preserve">W. Shi, J. Cao, Q. Zhang, Y. Li, L. Xu, Edge computing: Vision and challenges, IEEE Internet of Things Journal 3 (2016) 637–646,</w:t>
+      </w:r>
+      <w:r>
+        <w:t xml:space="preserve"> </w:t>
+      </w:r>
+      <w:hyperlink r:id="rId168">
+        <w:r>
+          <w:rPr>
+            <w:rStyle w:val="Hyperlink"/>
+          </w:rPr>
+          <w:t xml:space="preserve">https://doi.org/10.1109/JIOT.2016.2579198</w:t>
+        </w:r>
+      </w:hyperlink>
+      <w:r>
+        <w:t xml:space="preserve">.</w:t>
+      </w:r>
+    </w:p>
+    <w:bookmarkEnd w:id="169"/>
+    <w:bookmarkStart w:id="171" w:name="ref-viola2001cascade"/>
+    <w:p>
+      <w:pPr>
+        <w:pStyle w:val="Bibliography"/>
+      </w:pPr>
+      <w:r>
+        <w:t xml:space="preserve">[19]</w:t>
+      </w:r>
+      <w:r>
+        <w:t xml:space="preserve"> </w:t>
+      </w:r>
+      <w:r>
+        <w:t xml:space="preserve">	</w:t>
+      </w:r>
+      <w:r>
+        <w:t xml:space="preserve">P. Viola, M. Jones, Rapid object detection using a boosted cascade of simple features, in: Proceedings of the IEEE computer society conference on computer vision and pattern recognition (CVPR), 2001, pp. I-511-I-518,</w:t>
+      </w:r>
+      <w:r>
+        <w:t xml:space="preserve"> </w:t>
+      </w:r>
+      <w:hyperlink r:id="rId170">
+        <w:r>
+          <w:rPr>
+            <w:rStyle w:val="Hyperlink"/>
+          </w:rPr>
+          <w:t xml:space="preserve">https://doi.org/10.1109/CVPR.2001.990517</w:t>
+        </w:r>
+      </w:hyperlink>
+      <w:r>
+        <w:t xml:space="preserve">.</w:t>
+      </w:r>
+    </w:p>
+    <w:bookmarkEnd w:id="171"/>
+    <w:bookmarkStart w:id="173" w:name="ref-chow1970reject"/>
+    <w:p>
+      <w:pPr>
+        <w:pStyle w:val="Bibliography"/>
+      </w:pPr>
+      <w:r>
+        <w:t xml:space="preserve">[20]</w:t>
+      </w:r>
+      <w:r>
+        <w:t xml:space="preserve"> </w:t>
+      </w:r>
+      <w:r>
+        <w:t xml:space="preserve">	</w:t>
+      </w:r>
+      <w:r>
+        <w:t xml:space="preserve">C.K. Chow, On optimum recognition error and reject tradeoff, IEEE Transactions on Information Theory 16 (1970) 41–46,</w:t>
+      </w:r>
+      <w:r>
+        <w:t xml:space="preserve"> </w:t>
+      </w:r>
+      <w:hyperlink r:id="rId172">
         <w:r>
           <w:rPr>
             <w:rStyle w:val="Hyperlink"/>
@@ -14513,44 +14839,548 @@
         <w:t xml:space="preserve">.</w:t>
       </w:r>
     </w:p>
-    <w:bookmarkEnd w:id="143"/>
-    <w:bookmarkStart w:id="145" w:name="ref-donenfeld2017wireguard"/>
+    <w:bookmarkEnd w:id="173"/>
+    <w:bookmarkStart w:id="175" w:name="ref-teerapittayanon2016branchynet"/>
     <w:p>
       <w:pPr>
         <w:pStyle w:val="Bibliography"/>
       </w:pPr>
       <w:r>
-        <w:t xml:space="preserve">Donenfeld, Jason A. 2017.</w:t>
-      </w:r>
-      <w:r>
-        <w:t xml:space="preserve"> </w:t>
-      </w:r>
-      <w:r>
-        <w:t xml:space="preserve">“</w:t>
+        <w:t xml:space="preserve">[21]</w:t>
+      </w:r>
+      <w:r>
+        <w:t xml:space="preserve"> </w:t>
+      </w:r>
+      <w:r>
+        <w:t xml:space="preserve">	</w:t>
+      </w:r>
+      <w:r>
+        <w:t xml:space="preserve">S. Teerapittayanon, B. McDanel, H.T. Kung,</w:t>
+      </w:r>
+      <w:r>
+        <w:t xml:space="preserve"> </w:t>
+      </w:r>
+      <w:r>
+        <w:t xml:space="preserve">BranchyNet</w:t>
+      </w:r>
+      <w:r>
+        <w:t xml:space="preserve">: Fast inference via early exiting from deep neural networks, in: 23rd international conference on pattern recognition (ICPR), 2016, pp. 2464–2469,</w:t>
+      </w:r>
+      <w:r>
+        <w:t xml:space="preserve"> </w:t>
+      </w:r>
+      <w:hyperlink r:id="rId174">
+        <w:r>
+          <w:rPr>
+            <w:rStyle w:val="Hyperlink"/>
+          </w:rPr>
+          <w:t xml:space="preserve">https://doi.org/10.1109/ICPR.2016.7900006</w:t>
+        </w:r>
+      </w:hyperlink>
+      <w:r>
+        <w:t xml:space="preserve">.</w:t>
+      </w:r>
+    </w:p>
+    <w:bookmarkEnd w:id="175"/>
+    <w:bookmarkStart w:id="177" w:name="ref-singh2020plantdoc"/>
+    <w:p>
+      <w:pPr>
+        <w:pStyle w:val="Bibliography"/>
+      </w:pPr>
+      <w:r>
+        <w:t xml:space="preserve">[22]</w:t>
+      </w:r>
+      <w:r>
+        <w:t xml:space="preserve"> </w:t>
+      </w:r>
+      <w:r>
+        <w:t xml:space="preserve">	</w:t>
+      </w:r>
+      <w:r>
+        <w:t xml:space="preserve">D. Singh, N. Jain, P. Jain, P. Kayal, S. Kumawat, N. Batra,</w:t>
+      </w:r>
+      <w:r>
+        <w:t xml:space="preserve"> </w:t>
+      </w:r>
+      <w:r>
+        <w:t xml:space="preserve">PlantDoc</w:t>
+      </w:r>
+      <w:r>
+        <w:t xml:space="preserve">: A dataset for visual plant disease detection, in: Proceedings of the 7th ACM IKDD CoDS and 25th COMAD, 2020, pp. 249–253,</w:t>
+      </w:r>
+      <w:r>
+        <w:t xml:space="preserve"> </w:t>
+      </w:r>
+      <w:hyperlink r:id="rId176">
+        <w:r>
+          <w:rPr>
+            <w:rStyle w:val="Hyperlink"/>
+          </w:rPr>
+          <w:t xml:space="preserve">https://doi.org/10.1145/3371158.3371196</w:t>
+        </w:r>
+      </w:hyperlink>
+      <w:r>
+        <w:t xml:space="preserve">.</w:t>
+      </w:r>
+    </w:p>
+    <w:bookmarkEnd w:id="177"/>
+    <w:bookmarkStart w:id="179" w:name="ref-wei2024mvpdr"/>
+    <w:p>
+      <w:pPr>
+        <w:pStyle w:val="Bibliography"/>
+      </w:pPr>
+      <w:r>
+        <w:t xml:space="preserve">[23]</w:t>
+      </w:r>
+      <w:r>
+        <w:t xml:space="preserve"> </w:t>
+      </w:r>
+      <w:r>
+        <w:t xml:space="preserve">	</w:t>
+      </w:r>
+      <w:r>
+        <w:t xml:space="preserve">T. Wei, Z. Chen, Z. Huang, X. Yu, Benchmarking in-the-wild multimodal disease recognition and a versatile baseline, in: Proceedings of the 32nd ACM international conference on multimedia (MM ’24), 2024, pp. 1593–1601,</w:t>
+      </w:r>
+      <w:r>
+        <w:t xml:space="preserve"> </w:t>
+      </w:r>
+      <w:hyperlink r:id="rId178">
+        <w:r>
+          <w:rPr>
+            <w:rStyle w:val="Hyperlink"/>
+          </w:rPr>
+          <w:t xml:space="preserve">https://doi.org/10.1145/3664647.3680599</w:t>
+        </w:r>
+      </w:hyperlink>
+      <w:r>
+        <w:t xml:space="preserve">.</w:t>
+      </w:r>
+    </w:p>
+    <w:bookmarkEnd w:id="179"/>
+    <w:bookmarkStart w:id="181" w:name="ref-jiang2025plantcafo"/>
+    <w:p>
+      <w:pPr>
+        <w:pStyle w:val="Bibliography"/>
+      </w:pPr>
+      <w:r>
+        <w:t xml:space="preserve">[24]</w:t>
+      </w:r>
+      <w:r>
+        <w:t xml:space="preserve"> </w:t>
+      </w:r>
+      <w:r>
+        <w:t xml:space="preserve">	</w:t>
+      </w:r>
+      <w:r>
+        <w:t xml:space="preserve">X. Jiang, J. Wang, K. Xie, C. Cui, A. Du, X. Shi, W. Yang, R. Zhai,</w:t>
+      </w:r>
+      <w:r>
+        <w:t xml:space="preserve"> </w:t>
+      </w:r>
+      <w:r>
+        <w:t xml:space="preserve">PlantCaFo</w:t>
+      </w:r>
+      <w:r>
+        <w:t xml:space="preserve">: An efficient few-shot plant disease recognition method based on foundation models, Plant Phenomics 7 (2025) 100024,</w:t>
+      </w:r>
+      <w:r>
+        <w:t xml:space="preserve"> </w:t>
+      </w:r>
+      <w:hyperlink r:id="rId180">
+        <w:r>
+          <w:rPr>
+            <w:rStyle w:val="Hyperlink"/>
+          </w:rPr>
+          <w:t xml:space="preserve">https://doi.org/10.1016/j.plaphe.2025.100024</w:t>
+        </w:r>
+      </w:hyperlink>
+      <w:r>
+        <w:t xml:space="preserve">.</w:t>
+      </w:r>
+    </w:p>
+    <w:bookmarkEnd w:id="181"/>
+    <w:bookmarkStart w:id="183" w:name="ref-salman2025plantdisease"/>
+    <w:p>
+      <w:pPr>
+        <w:pStyle w:val="Bibliography"/>
+      </w:pPr>
+      <w:r>
+        <w:t xml:space="preserve">[25]</w:t>
+      </w:r>
+      <w:r>
+        <w:t xml:space="preserve"> </w:t>
+      </w:r>
+      <w:r>
+        <w:t xml:space="preserve">	</w:t>
+      </w:r>
+      <w:r>
+        <w:t xml:space="preserve">Z. Salman, A. Muhammad, D. Han, Plant disease classification in the wild using vision transformers and mixture of experts, Frontiers in Plant Science 16 (2025),</w:t>
+      </w:r>
+      <w:r>
+        <w:t xml:space="preserve"> </w:t>
+      </w:r>
+      <w:hyperlink r:id="rId182">
+        <w:r>
+          <w:rPr>
+            <w:rStyle w:val="Hyperlink"/>
+          </w:rPr>
+          <w:t xml:space="preserve">https://doi.org/10.3389/fpls.2025.1522985</w:t>
+        </w:r>
+      </w:hyperlink>
+      <w:r>
+        <w:t xml:space="preserve">.</w:t>
+      </w:r>
+    </w:p>
+    <w:bookmarkEnd w:id="183"/>
+    <w:bookmarkStart w:id="185" w:name="ref-hasan2025deployable"/>
+    <w:p>
+      <w:pPr>
+        <w:pStyle w:val="Bibliography"/>
+      </w:pPr>
+      <w:r>
+        <w:t xml:space="preserve">[26]</w:t>
+      </w:r>
+      <w:r>
+        <w:t xml:space="preserve"> </w:t>
+      </w:r>
+      <w:r>
+        <w:t xml:space="preserve">	</w:t>
+      </w:r>
+      <w:r>
+        <w:t xml:space="preserve">M.J. Hasan, S. Mazumdar, S. Momen, Deployable deep learning for cross-domain plant leaf disease detection via ensemble learning, knowledge distillation, and quantization, IEEE Access 13 (2025) 140313–140336,</w:t>
+      </w:r>
+      <w:r>
+        <w:t xml:space="preserve"> </w:t>
+      </w:r>
+      <w:hyperlink r:id="rId184">
+        <w:r>
+          <w:rPr>
+            <w:rStyle w:val="Hyperlink"/>
+          </w:rPr>
+          <w:t xml:space="preserve">https://doi.org/10.1109/ACCESS.2025.3595390</w:t>
+        </w:r>
+      </w:hyperlink>
+      <w:r>
+        <w:t xml:space="preserve">.</w:t>
+      </w:r>
+    </w:p>
+    <w:bookmarkEnd w:id="185"/>
+    <w:bookmarkStart w:id="187" w:name="ref-kang2017neurosurgeon"/>
+    <w:p>
+      <w:pPr>
+        <w:pStyle w:val="Bibliography"/>
+      </w:pPr>
+      <w:r>
+        <w:t xml:space="preserve">[27]</w:t>
+      </w:r>
+      <w:r>
+        <w:t xml:space="preserve"> </w:t>
+      </w:r>
+      <w:r>
+        <w:t xml:space="preserve">	</w:t>
+      </w:r>
+      <w:r>
+        <w:t xml:space="preserve">Y. Kang, J. Hauswald, C. Gao, A. Rovinski, T. Mudge, J. Mars, L. Tang, Neurosurgeon: Collaborative intelligence between the cloud and mobile edge, in: Proceedings of the 22nd international conference on architectural support for programming languages and operating systems (ASPLOS), 2017, pp. 615–629,</w:t>
+      </w:r>
+      <w:r>
+        <w:t xml:space="preserve"> </w:t>
+      </w:r>
+      <w:hyperlink r:id="rId186">
+        <w:r>
+          <w:rPr>
+            <w:rStyle w:val="Hyperlink"/>
+          </w:rPr>
+          <w:t xml:space="preserve">https://doi.org/10.1145/3037697.3037698</w:t>
+        </w:r>
+      </w:hyperlink>
+      <w:r>
+        <w:t xml:space="preserve">.</w:t>
+      </w:r>
+    </w:p>
+    <w:bookmarkEnd w:id="187"/>
+    <w:bookmarkStart w:id="189" w:name="ref-teerapittayanon2017ddnn"/>
+    <w:p>
+      <w:pPr>
+        <w:pStyle w:val="Bibliography"/>
+      </w:pPr>
+      <w:r>
+        <w:t xml:space="preserve">[28]</w:t>
+      </w:r>
+      <w:r>
+        <w:t xml:space="preserve"> </w:t>
+      </w:r>
+      <w:r>
+        <w:t xml:space="preserve">	</w:t>
+      </w:r>
+      <w:r>
+        <w:t xml:space="preserve">S. Teerapittayanon, B. McDanel, H.T. Kung, Distributed deep neural networks over the cloud, the edge and end devices, in: IEEE 37th international conference on distributed computing systems (ICDCS), 2017, pp. 328–339,</w:t>
+      </w:r>
+      <w:r>
+        <w:t xml:space="preserve"> </w:t>
+      </w:r>
+      <w:hyperlink r:id="rId188">
+        <w:r>
+          <w:rPr>
+            <w:rStyle w:val="Hyperlink"/>
+          </w:rPr>
+          <w:t xml:space="preserve">https://doi.org/10.1109/ICDCS.2017.226</w:t>
+        </w:r>
+      </w:hyperlink>
+      <w:r>
+        <w:t xml:space="preserve">.</w:t>
+      </w:r>
+    </w:p>
+    <w:bookmarkEnd w:id="189"/>
+    <w:bookmarkStart w:id="191" w:name="ref-matsubara2022split"/>
+    <w:p>
+      <w:pPr>
+        <w:pStyle w:val="Bibliography"/>
+      </w:pPr>
+      <w:r>
+        <w:t xml:space="preserve">[29]</w:t>
+      </w:r>
+      <w:r>
+        <w:t xml:space="preserve"> </w:t>
+      </w:r>
+      <w:r>
+        <w:t xml:space="preserve">	</w:t>
+      </w:r>
+      <w:r>
+        <w:t xml:space="preserve">Y. Matsubara, M. Levorato, F. Restuccia, Split computing and early exiting for deep learning applications: Survey and research challenges, ACM Computing Surveys 55 (2022) 1–30,</w:t>
+      </w:r>
+      <w:r>
+        <w:t xml:space="preserve"> </w:t>
+      </w:r>
+      <w:hyperlink r:id="rId190">
+        <w:r>
+          <w:rPr>
+            <w:rStyle w:val="Hyperlink"/>
+          </w:rPr>
+          <w:t xml:space="preserve">https://doi.org/10.1145/3527155</w:t>
+        </w:r>
+      </w:hyperlink>
+      <w:r>
+        <w:t xml:space="preserve">.</w:t>
+      </w:r>
+    </w:p>
+    <w:bookmarkEnd w:id="191"/>
+    <w:bookmarkStart w:id="192" w:name="ref-geifman2017selective"/>
+    <w:p>
+      <w:pPr>
+        <w:pStyle w:val="Bibliography"/>
+      </w:pPr>
+      <w:r>
+        <w:t xml:space="preserve">[30]</w:t>
+      </w:r>
+      <w:r>
+        <w:t xml:space="preserve"> </w:t>
+      </w:r>
+      <w:r>
+        <w:t xml:space="preserve">	</w:t>
+      </w:r>
+      <w:r>
+        <w:t xml:space="preserve">Y. Geifman, R. El-Yaniv, Selective classification for deep neural networks, in: Advances in neural information processing systems (NeurIPS), 2017.</w:t>
+      </w:r>
+    </w:p>
+    <w:bookmarkEnd w:id="192"/>
+    <w:bookmarkStart w:id="193" w:name="ref-hendrycks2017baseline"/>
+    <w:p>
+      <w:pPr>
+        <w:pStyle w:val="Bibliography"/>
+      </w:pPr>
+      <w:r>
+        <w:t xml:space="preserve">[31]</w:t>
+      </w:r>
+      <w:r>
+        <w:t xml:space="preserve"> </w:t>
+      </w:r>
+      <w:r>
+        <w:t xml:space="preserve">	</w:t>
+      </w:r>
+      <w:r>
+        <w:t xml:space="preserve">D. Hendrycks, K. Gimpel, A baseline for detecting misclassified and out-of-distribution examples in neural networks, in: International conference on learning representations (ICLR), 2017.</w:t>
+      </w:r>
+    </w:p>
+    <w:bookmarkEnd w:id="193"/>
+    <w:bookmarkStart w:id="194" w:name="ref-guo2017calibration"/>
+    <w:p>
+      <w:pPr>
+        <w:pStyle w:val="Bibliography"/>
+      </w:pPr>
+      <w:r>
+        <w:t xml:space="preserve">[32]</w:t>
+      </w:r>
+      <w:r>
+        <w:t xml:space="preserve"> </w:t>
+      </w:r>
+      <w:r>
+        <w:t xml:space="preserve">	</w:t>
+      </w:r>
+      <w:r>
+        <w:t xml:space="preserve">C. Guo, G. Pleiss, Y. Sun, K.Q. Weinberger, On calibration of modern neural networks, in: Proceedings of the 34th international conference on machine learning (ICML), 2017, pp. 1321–1330.</w:t>
+      </w:r>
+    </w:p>
+    <w:bookmarkEnd w:id="194"/>
+    <w:bookmarkStart w:id="195" w:name="ref-wang2018idk"/>
+    <w:p>
+      <w:pPr>
+        <w:pStyle w:val="Bibliography"/>
+      </w:pPr>
+      <w:r>
+        <w:t xml:space="preserve">[33]</w:t>
+      </w:r>
+      <w:r>
+        <w:t xml:space="preserve"> </w:t>
+      </w:r>
+      <w:r>
+        <w:t xml:space="preserve">	</w:t>
+      </w:r>
+      <w:r>
+        <w:t xml:space="preserve">X. Wang, Y. Luo, D. Crankshaw, A. Tumanov, F. Yu, J.E. Gonzalez,</w:t>
+      </w:r>
+      <w:r>
+        <w:t xml:space="preserve"> </w:t>
+      </w:r>
+      <w:r>
+        <w:t xml:space="preserve">IDK</w:t>
+      </w:r>
+      <w:r>
+        <w:t xml:space="preserve"> </w:t>
+      </w:r>
+      <w:r>
+        <w:t xml:space="preserve">cascades: Fast deep learning by learning not to overthink, in: Proceedings of the conference on uncertainty in artificial intelligence (UAI), 2018.</w:t>
+      </w:r>
+    </w:p>
+    <w:bookmarkEnd w:id="195"/>
+    <w:bookmarkStart w:id="196" w:name="ref-kag2023selective"/>
+    <w:p>
+      <w:pPr>
+        <w:pStyle w:val="Bibliography"/>
+      </w:pPr>
+      <w:r>
+        <w:t xml:space="preserve">[34]</w:t>
+      </w:r>
+      <w:r>
+        <w:t xml:space="preserve"> </w:t>
+      </w:r>
+      <w:r>
+        <w:t xml:space="preserve">	</w:t>
+      </w:r>
+      <w:r>
+        <w:t xml:space="preserve">A. Kag, I. Fedorov, A. Gangrade, P. Whatmough, V. Saligrama, Efficient edge inference by selective query, in: International conference on learning representations (ICLR), 2023.</w:t>
+      </w:r>
+    </w:p>
+    <w:bookmarkEnd w:id="196"/>
+    <w:bookmarkStart w:id="197" w:name="ref-tan2019efficientnet"/>
+    <w:p>
+      <w:pPr>
+        <w:pStyle w:val="Bibliography"/>
+      </w:pPr>
+      <w:r>
+        <w:t xml:space="preserve">[35]</w:t>
+      </w:r>
+      <w:r>
+        <w:t xml:space="preserve"> </w:t>
+      </w:r>
+      <w:r>
+        <w:t xml:space="preserve">	</w:t>
+      </w:r>
+      <w:r>
+        <w:t xml:space="preserve">M. Tan, Q.V. Le,</w:t>
+      </w:r>
+      <w:r>
+        <w:t xml:space="preserve"> </w:t>
+      </w:r>
+      <w:r>
+        <w:t xml:space="preserve">EfficientNet</w:t>
+      </w:r>
+      <w:r>
+        <w:t xml:space="preserve">: Rethinking model scaling for convolutional neural networks, in: International conference on machine learning (ICML), 2019, pp. 6105–6114.</w:t>
+      </w:r>
+    </w:p>
+    <w:bookmarkEnd w:id="197"/>
+    <w:bookmarkStart w:id="198" w:name="ref-loshchilov2019adamw"/>
+    <w:p>
+      <w:pPr>
+        <w:pStyle w:val="Bibliography"/>
+      </w:pPr>
+      <w:r>
+        <w:t xml:space="preserve">[36]</w:t>
+      </w:r>
+      <w:r>
+        <w:t xml:space="preserve"> </w:t>
+      </w:r>
+      <w:r>
+        <w:t xml:space="preserve">	</w:t>
+      </w:r>
+      <w:r>
+        <w:t xml:space="preserve">I. Loshchilov, F. Hutter, Decoupled weight decay regularization, in: International conference on learning representations (ICLR), 2019.</w:t>
+      </w:r>
+    </w:p>
+    <w:bookmarkEnd w:id="198"/>
+    <w:bookmarkStart w:id="200" w:name="ref-lin2017focal"/>
+    <w:p>
+      <w:pPr>
+        <w:pStyle w:val="Bibliography"/>
+      </w:pPr>
+      <w:r>
+        <w:t xml:space="preserve">[37]</w:t>
+      </w:r>
+      <w:r>
+        <w:t xml:space="preserve"> </w:t>
+      </w:r>
+      <w:r>
+        <w:t xml:space="preserve">	</w:t>
+      </w:r>
+      <w:r>
+        <w:t xml:space="preserve">T.-Y. Lin, P. Goyal, R. Girshick, K. He, P. Dollár, Focal loss for dense object detection, in: IEEE international conference on computer vision (ICCV), 2017, pp. 2999–3007,</w:t>
+      </w:r>
+      <w:r>
+        <w:t xml:space="preserve"> </w:t>
+      </w:r>
+      <w:hyperlink r:id="rId199">
+        <w:r>
+          <w:rPr>
+            <w:rStyle w:val="Hyperlink"/>
+          </w:rPr>
+          <w:t xml:space="preserve">https://doi.org/10.1109/ICCV.2017.324</w:t>
+        </w:r>
+      </w:hyperlink>
+      <w:r>
+        <w:t xml:space="preserve">.</w:t>
+      </w:r>
+    </w:p>
+    <w:bookmarkEnd w:id="200"/>
+    <w:bookmarkStart w:id="202" w:name="ref-donenfeld2017wireguard"/>
+    <w:p>
+      <w:pPr>
+        <w:pStyle w:val="Bibliography"/>
+      </w:pPr>
+      <w:r>
+        <w:t xml:space="preserve">[38]</w:t>
+      </w:r>
+      <w:r>
+        <w:t xml:space="preserve"> </w:t>
+      </w:r>
+      <w:r>
+        <w:t xml:space="preserve">	</w:t>
+      </w:r>
+      <w:r>
+        <w:t xml:space="preserve">J.A. Donenfeld,</w:t>
+      </w:r>
+      <w:r>
+        <w:t xml:space="preserve"> </w:t>
       </w:r>
       <w:r>
         <w:t xml:space="preserve">WireGuard</w:t>
       </w:r>
       <w:r>
-        <w:t xml:space="preserve">: Next Generation Kernel Network Tunnel.”</w:t>
-      </w:r>
-      <w:r>
-        <w:t xml:space="preserve"> </w:t>
-      </w:r>
-      <w:r>
-        <w:rPr>
-          <w:i/>
-          <w:iCs/>
-        </w:rPr>
-        <w:t xml:space="preserve">Network and Distributed System Security Symposium (NDSS)</w:t>
-      </w:r>
-      <w:r>
-        <w:t xml:space="preserve">.</w:t>
-      </w:r>
-      <w:r>
-        <w:t xml:space="preserve"> </w:t>
-      </w:r>
-      <w:hyperlink r:id="rId144">
+        <w:t xml:space="preserve">: Next generation kernel network tunnel, in: Network and distributed system security symposium (NDSS), 2017,</w:t>
+      </w:r>
+      <w:r>
+        <w:t xml:space="preserve"> </w:t>
+      </w:r>
+      <w:hyperlink r:id="rId201">
         <w:r>
           <w:rPr>
             <w:rStyle w:val="Hyperlink"/>
@@ -14562,1532 +15392,123 @@
         <w:t xml:space="preserve">.</w:t>
       </w:r>
     </w:p>
-    <w:bookmarkEnd w:id="145"/>
-    <w:bookmarkStart w:id="147" w:name="ref-elkarch2026backbone"/>
+    <w:bookmarkEnd w:id="202"/>
+    <w:bookmarkStart w:id="204" w:name="ref-onnx2019"/>
     <w:p>
       <w:pPr>
         <w:pStyle w:val="Bibliography"/>
       </w:pPr>
       <w:r>
-        <w:t xml:space="preserve">El Karch, Hajar, Youssef Natij, Mohamed Benaly, Rachid El Gouri, and Abdelkader Mezouari. 2026.</w:t>
-      </w:r>
-      <w:r>
-        <w:t xml:space="preserve"> </w:t>
-      </w:r>
-      <w:r>
-        <w:t xml:space="preserve">“Backbone Diversity Beats Text Supervision: A Systematic Study of Frozen Multi-Foundation Model Fusion for in-the-Wild Plant Disease Recognition.”</w:t>
-      </w:r>
-      <w:r>
-        <w:t xml:space="preserve"> </w:t>
-      </w:r>
-      <w:r>
-        <w:rPr>
-          <w:i/>
-          <w:iCs/>
-        </w:rPr>
-        <w:t xml:space="preserve">Frontiers in Plant Science</w:t>
-      </w:r>
-      <w:r>
-        <w:t xml:space="preserve"> </w:t>
-      </w:r>
-      <w:r>
-        <w:t xml:space="preserve">17: 1860665.</w:t>
-      </w:r>
-      <w:r>
-        <w:t xml:space="preserve"> </w:t>
-      </w:r>
-      <w:hyperlink r:id="rId146">
+        <w:t xml:space="preserve">[39]</w:t>
+      </w:r>
+      <w:r>
+        <w:t xml:space="preserve"> </w:t>
+      </w:r>
+      <w:r>
+        <w:t xml:space="preserve">	</w:t>
+      </w:r>
+      <w:r>
+        <w:t xml:space="preserve">J. Bai, F. Lu, K. Zhang, others</w:t>
+      </w:r>
+      <w:r>
+        <w:t xml:space="preserve">,</w:t>
+      </w:r>
+      <w:r>
+        <w:t xml:space="preserve"> </w:t>
+      </w:r>
+      <w:r>
+        <w:t xml:space="preserve">ONNX</w:t>
+      </w:r>
+      <w:r>
+        <w:t xml:space="preserve">: Open neural network exchange,</w:t>
+      </w:r>
+      <w:r>
+        <w:t xml:space="preserve"> </w:t>
+      </w:r>
+      <w:hyperlink r:id="rId203">
         <w:r>
           <w:rPr>
             <w:rStyle w:val="Hyperlink"/>
           </w:rPr>
-          <w:t xml:space="preserve">https://doi.org/10.3389/fpls.2026.1860665</w:t>
+          <w:t xml:space="preserve">https://github.com/onnx/onnx</w:t>
         </w:r>
       </w:hyperlink>
       <w:r>
-        <w:t xml:space="preserve">.</w:t>
-      </w:r>
-    </w:p>
-    <w:bookmarkEnd w:id="147"/>
-    <w:bookmarkStart w:id="149" w:name="ref-ferentinos2018deep"/>
+        <w:t xml:space="preserve">, 2019.</w:t>
+      </w:r>
+    </w:p>
+    <w:bookmarkEnd w:id="204"/>
+    <w:bookmarkStart w:id="206" w:name="ref-nvidia2022tensorrt"/>
     <w:p>
       <w:pPr>
         <w:pStyle w:val="Bibliography"/>
       </w:pPr>
       <w:r>
-        <w:t xml:space="preserve">Ferentinos, Konstantinos P. 2018.</w:t>
-      </w:r>
-      <w:r>
-        <w:t xml:space="preserve"> </w:t>
-      </w:r>
-      <w:r>
-        <w:t xml:space="preserve">“Deep Learning Models for Plant Disease Detection and Diagnosis.”</w:t>
-      </w:r>
-      <w:r>
-        <w:t xml:space="preserve"> </w:t>
-      </w:r>
-      <w:r>
-        <w:rPr>
-          <w:i/>
-          <w:iCs/>
-        </w:rPr>
-        <w:t xml:space="preserve">Computers and Electronics in Agriculture</w:t>
-      </w:r>
-      <w:r>
-        <w:t xml:space="preserve"> </w:t>
-      </w:r>
-      <w:r>
-        <w:t xml:space="preserve">145: 311–18.</w:t>
-      </w:r>
-      <w:r>
-        <w:t xml:space="preserve"> </w:t>
-      </w:r>
-      <w:hyperlink r:id="rId148">
+        <w:t xml:space="preserve">[40]</w:t>
+      </w:r>
+      <w:r>
+        <w:t xml:space="preserve"> </w:t>
+      </w:r>
+      <w:r>
+        <w:t xml:space="preserve">	</w:t>
+      </w:r>
+      <w:r>
+        <w:t xml:space="preserve">NVIDIA Corporation,</w:t>
+      </w:r>
+      <w:r>
+        <w:t xml:space="preserve"> </w:t>
+      </w:r>
+      <w:r>
+        <w:t xml:space="preserve">NVIDIA TensorRT</w:t>
+      </w:r>
+      <w:r>
+        <w:t xml:space="preserve"> </w:t>
+      </w:r>
+      <w:r>
+        <w:t xml:space="preserve">8.2 developer guide,</w:t>
+      </w:r>
+      <w:r>
+        <w:t xml:space="preserve"> </w:t>
+      </w:r>
+      <w:hyperlink r:id="rId205">
         <w:r>
           <w:rPr>
             <w:rStyle w:val="Hyperlink"/>
           </w:rPr>
-          <w:t xml:space="preserve">https://doi.org/10.1016/j.compag.2018.01.009</w:t>
+          <w:t xml:space="preserve">https://docs.nvidia.com/deeplearning/tensorrt/archives/</w:t>
         </w:r>
       </w:hyperlink>
       <w:r>
-        <w:t xml:space="preserve">.</w:t>
-      </w:r>
-    </w:p>
-    <w:bookmarkEnd w:id="149"/>
-    <w:bookmarkStart w:id="150" w:name="ref-geifman2017selective"/>
+        <w:t xml:space="preserve">, 2022.</w:t>
+      </w:r>
+    </w:p>
+    <w:bookmarkEnd w:id="206"/>
+    <w:bookmarkStart w:id="208" w:name="ref-hinton2015distilling"/>
     <w:p>
       <w:pPr>
         <w:pStyle w:val="Bibliography"/>
       </w:pPr>
       <w:r>
-        <w:t xml:space="preserve">Geifman, Yonatan, and Ran El-Yaniv. 2017.</w:t>
-      </w:r>
-      <w:r>
-        <w:t xml:space="preserve"> </w:t>
-      </w:r>
-      <w:r>
-        <w:t xml:space="preserve">“Selective Classification for Deep Neural Networks.”</w:t>
-      </w:r>
-      <w:r>
-        <w:t xml:space="preserve"> </w:t>
-      </w:r>
-      <w:r>
-        <w:rPr>
-          <w:i/>
-          <w:iCs/>
-        </w:rPr>
-        <w:t xml:space="preserve">Advances in Neural Information Processing Systems (NeurIPS)</w:t>
-      </w:r>
-      <w:r>
-        <w:t xml:space="preserve">.</w:t>
-      </w:r>
-    </w:p>
-    <w:bookmarkEnd w:id="150"/>
-    <w:bookmarkStart w:id="151" w:name="ref-guo2017calibration"/>
-    <w:p>
-      <w:pPr>
-        <w:pStyle w:val="Bibliography"/>
-      </w:pPr>
-      <w:r>
-        <w:t xml:space="preserve">Guo, Chuan, Geoff Pleiss, Yu Sun, and Kilian Q. Weinberger. 2017.</w:t>
-      </w:r>
-      <w:r>
-        <w:t xml:space="preserve"> </w:t>
-      </w:r>
-      <w:r>
-        <w:t xml:space="preserve">“On Calibration of Modern Neural Networks.”</w:t>
-      </w:r>
-      <w:r>
-        <w:t xml:space="preserve"> </w:t>
-      </w:r>
-      <w:r>
-        <w:rPr>
-          <w:i/>
-          <w:iCs/>
-        </w:rPr>
-        <w:t xml:space="preserve">Proceedings of the 34th International Conference on Machine Learning (ICML)</w:t>
-      </w:r>
-      <w:r>
-        <w:t xml:space="preserve">, Proceedings of machine learning research, vol. 70: 1321–30.</w:t>
-      </w:r>
-    </w:p>
-    <w:bookmarkEnd w:id="151"/>
-    <w:bookmarkStart w:id="153" w:name="ref-hasan2025deployable"/>
-    <w:p>
-      <w:pPr>
-        <w:pStyle w:val="Bibliography"/>
-      </w:pPr>
-      <w:r>
-        <w:t xml:space="preserve">Hasan, Mohammad Junayed, Suvodeep Mazumdar, and Sifat Momen. 2025.</w:t>
-      </w:r>
-      <w:r>
-        <w:t xml:space="preserve"> </w:t>
-      </w:r>
-      <w:r>
-        <w:t xml:space="preserve">“Deployable Deep Learning for Cross-Domain Plant Leaf Disease Detection via Ensemble Learning, Knowledge Distillation, and Quantization.”</w:t>
-      </w:r>
-      <w:r>
-        <w:t xml:space="preserve"> </w:t>
-      </w:r>
-      <w:r>
-        <w:rPr>
-          <w:i/>
-          <w:iCs/>
-        </w:rPr>
-        <w:t xml:space="preserve">IEEE Access</w:t>
-      </w:r>
-      <w:r>
-        <w:t xml:space="preserve"> </w:t>
-      </w:r>
-      <w:r>
-        <w:t xml:space="preserve">13: 140313–36.</w:t>
-      </w:r>
-      <w:r>
-        <w:t xml:space="preserve"> </w:t>
-      </w:r>
-      <w:hyperlink r:id="rId152">
-        <w:r>
-          <w:rPr>
-            <w:rStyle w:val="Hyperlink"/>
-          </w:rPr>
-          <w:t xml:space="preserve">https://doi.org/10.1109/ACCESS.2025.3595390</w:t>
-        </w:r>
-      </w:hyperlink>
-      <w:r>
-        <w:t xml:space="preserve">.</w:t>
-      </w:r>
-    </w:p>
-    <w:bookmarkEnd w:id="153"/>
-    <w:bookmarkStart w:id="154" w:name="ref-hendrycks2017baseline"/>
-    <w:p>
-      <w:pPr>
-        <w:pStyle w:val="Bibliography"/>
-      </w:pPr>
-      <w:r>
-        <w:t xml:space="preserve">Hendrycks, Dan, and Kevin Gimpel. 2017.</w:t>
-      </w:r>
-      <w:r>
-        <w:t xml:space="preserve"> </w:t>
-      </w:r>
-      <w:r>
-        <w:t xml:space="preserve">“A Baseline for Detecting Misclassified and Out-of-Distribution Examples in Neural Networks.”</w:t>
-      </w:r>
-      <w:r>
-        <w:t xml:space="preserve"> </w:t>
-      </w:r>
-      <w:r>
-        <w:rPr>
-          <w:i/>
-          <w:iCs/>
-        </w:rPr>
-        <w:t xml:space="preserve">International Conference on Learning Representations (ICLR)</w:t>
-      </w:r>
-      <w:r>
-        <w:t xml:space="preserve">.</w:t>
-      </w:r>
-    </w:p>
-    <w:bookmarkEnd w:id="154"/>
-    <w:bookmarkStart w:id="156" w:name="ref-hinton2015distilling"/>
-    <w:p>
-      <w:pPr>
-        <w:pStyle w:val="Bibliography"/>
-      </w:pPr>
-      <w:r>
-        <w:t xml:space="preserve">Hinton, Geoffrey, Oriol Vinyals, and Jeff Dean. 2015.</w:t>
-      </w:r>
-      <w:r>
-        <w:t xml:space="preserve"> </w:t>
-      </w:r>
-      <w:r>
-        <w:rPr>
-          <w:i/>
-          <w:iCs/>
-        </w:rPr>
-        <w:t xml:space="preserve">Distilling the Knowledge in a Neural Network</w:t>
-      </w:r>
-      <w:r>
-        <w:t xml:space="preserve">.</w:t>
-      </w:r>
-      <w:r>
-        <w:t xml:space="preserve"> </w:t>
-      </w:r>
-      <w:hyperlink r:id="rId155">
+        <w:t xml:space="preserve">[41]</w:t>
+      </w:r>
+      <w:r>
+        <w:t xml:space="preserve"> </w:t>
+      </w:r>
+      <w:r>
+        <w:t xml:space="preserve">	</w:t>
+      </w:r>
+      <w:r>
+        <w:t xml:space="preserve">G. Hinton, O. Vinyals, J. Dean, Distilling the knowledge in a neural network, 2015,</w:t>
+      </w:r>
+      <w:r>
+        <w:t xml:space="preserve"> </w:t>
+      </w:r>
+      <w:hyperlink r:id="rId207">
         <w:r>
           <w:rPr>
             <w:rStyle w:val="Hyperlink"/>
           </w:rPr>
           <w:t xml:space="preserve">https://doi.org/10.48550/arXiv.1503.02531</w:t>
-        </w:r>
-      </w:hyperlink>
-      <w:r>
-        <w:t xml:space="preserve">.</w:t>
-      </w:r>
-    </w:p>
-    <w:bookmarkEnd w:id="156"/>
-    <w:bookmarkStart w:id="158" w:name="ref-howard2019mobilenetv3"/>
-    <w:p>
-      <w:pPr>
-        <w:pStyle w:val="Bibliography"/>
-      </w:pPr>
-      <w:r>
-        <w:t xml:space="preserve">Howard, Andrew, Mark Sandler, Grace Chu, et al. 2019.</w:t>
-      </w:r>
-      <w:r>
-        <w:t xml:space="preserve"> </w:t>
-      </w:r>
-      <w:r>
-        <w:t xml:space="preserve">“Searching for</w:t>
-      </w:r>
-      <w:r>
-        <w:t xml:space="preserve"> </w:t>
-      </w:r>
-      <w:r>
-        <w:t xml:space="preserve">MobileNetV3</w:t>
-      </w:r>
-      <w:r>
-        <w:t xml:space="preserve">.”</w:t>
-      </w:r>
-      <w:r>
-        <w:t xml:space="preserve"> </w:t>
-      </w:r>
-      <w:r>
-        <w:rPr>
-          <w:i/>
-          <w:iCs/>
-        </w:rPr>
-        <w:t xml:space="preserve">IEEE/CVF International Conference on Computer Vision (ICCV)</w:t>
-      </w:r>
-      <w:r>
-        <w:t xml:space="preserve">, 1314–24.</w:t>
-      </w:r>
-      <w:r>
-        <w:t xml:space="preserve"> </w:t>
-      </w:r>
-      <w:hyperlink r:id="rId157">
-        <w:r>
-          <w:rPr>
-            <w:rStyle w:val="Hyperlink"/>
-          </w:rPr>
-          <w:t xml:space="preserve">https://doi.org/10.1109/ICCV.2019.00140</w:t>
-        </w:r>
-      </w:hyperlink>
-      <w:r>
-        <w:t xml:space="preserve">.</w:t>
-      </w:r>
-    </w:p>
-    <w:bookmarkEnd w:id="158"/>
-    <w:bookmarkStart w:id="160" w:name="ref-hughes2015plantvillage"/>
-    <w:p>
-      <w:pPr>
-        <w:pStyle w:val="Bibliography"/>
-      </w:pPr>
-      <w:r>
-        <w:t xml:space="preserve">Hughes, David P., and Marcel Salathé. 2015.</w:t>
-      </w:r>
-      <w:r>
-        <w:t xml:space="preserve"> </w:t>
-      </w:r>
-      <w:r>
-        <w:rPr>
-          <w:i/>
-          <w:iCs/>
-        </w:rPr>
-        <w:t xml:space="preserve">An Open Access Repository of Images on Plant Health to Enable the Development of Mobile Disease Diagnostics</w:t>
-      </w:r>
-      <w:r>
-        <w:t xml:space="preserve">.</w:t>
-      </w:r>
-      <w:r>
-        <w:t xml:space="preserve"> </w:t>
-      </w:r>
-      <w:hyperlink r:id="rId159">
-        <w:r>
-          <w:rPr>
-            <w:rStyle w:val="Hyperlink"/>
-          </w:rPr>
-          <w:t xml:space="preserve">https://doi.org/10.48550/arXiv.1511.08060</w:t>
-        </w:r>
-      </w:hyperlink>
-      <w:r>
-        <w:t xml:space="preserve">.</w:t>
-      </w:r>
-    </w:p>
-    <w:bookmarkEnd w:id="160"/>
-    <w:bookmarkStart w:id="162" w:name="ref-jiang2025plantcafo"/>
-    <w:p>
-      <w:pPr>
-        <w:pStyle w:val="Bibliography"/>
-      </w:pPr>
-      <w:r>
-        <w:t xml:space="preserve">Jiang, Xue, Jiashi Wang, Kai Xie, et al. 2025.</w:t>
-      </w:r>
-      <w:r>
-        <w:t xml:space="preserve"> </w:t>
-      </w:r>
-      <w:r>
-        <w:t xml:space="preserve">“</w:t>
-      </w:r>
-      <w:r>
-        <w:t xml:space="preserve">PlantCaFo</w:t>
-      </w:r>
-      <w:r>
-        <w:t xml:space="preserve">: An Efficient Few-Shot Plant Disease Recognition Method Based on Foundation Models.”</w:t>
-      </w:r>
-      <w:r>
-        <w:t xml:space="preserve"> </w:t>
-      </w:r>
-      <w:r>
-        <w:rPr>
-          <w:i/>
-          <w:iCs/>
-        </w:rPr>
-        <w:t xml:space="preserve">Plant Phenomics</w:t>
-      </w:r>
-      <w:r>
-        <w:t xml:space="preserve"> </w:t>
-      </w:r>
-      <w:r>
-        <w:t xml:space="preserve">7: 100024.</w:t>
-      </w:r>
-      <w:r>
-        <w:t xml:space="preserve"> </w:t>
-      </w:r>
-      <w:hyperlink r:id="rId161">
-        <w:r>
-          <w:rPr>
-            <w:rStyle w:val="Hyperlink"/>
-          </w:rPr>
-          <w:t xml:space="preserve">https://doi.org/10.1016/j.plaphe.2025.100024</w:t>
-        </w:r>
-      </w:hyperlink>
-      <w:r>
-        <w:t xml:space="preserve">.</w:t>
-      </w:r>
-    </w:p>
-    <w:bookmarkEnd w:id="162"/>
-    <w:bookmarkStart w:id="163" w:name="ref-kag2023selective"/>
-    <w:p>
-      <w:pPr>
-        <w:pStyle w:val="Bibliography"/>
-      </w:pPr>
-      <w:r>
-        <w:t xml:space="preserve">Kag, Anil, Igor Fedorov, Aditya Gangrade, Paul Whatmough, and Venkatesh Saligrama. 2023.</w:t>
-      </w:r>
-      <w:r>
-        <w:t xml:space="preserve"> </w:t>
-      </w:r>
-      <w:r>
-        <w:t xml:space="preserve">“Efficient Edge Inference by Selective Query.”</w:t>
-      </w:r>
-      <w:r>
-        <w:t xml:space="preserve"> </w:t>
-      </w:r>
-      <w:r>
-        <w:rPr>
-          <w:i/>
-          <w:iCs/>
-        </w:rPr>
-        <w:t xml:space="preserve">International Conference on Learning Representations (ICLR)</w:t>
-      </w:r>
-      <w:r>
-        <w:t xml:space="preserve">.</w:t>
-      </w:r>
-    </w:p>
-    <w:bookmarkEnd w:id="163"/>
-    <w:bookmarkStart w:id="165" w:name="ref-kamilaris2018survey"/>
-    <w:p>
-      <w:pPr>
-        <w:pStyle w:val="Bibliography"/>
-      </w:pPr>
-      <w:r>
-        <w:t xml:space="preserve">Kamilaris, Andreas, and Francesc X. Prenafeta-Boldú. 2018.</w:t>
-      </w:r>
-      <w:r>
-        <w:t xml:space="preserve"> </w:t>
-      </w:r>
-      <w:r>
-        <w:t xml:space="preserve">“Deep Learning in Agriculture: A Survey.”</w:t>
-      </w:r>
-      <w:r>
-        <w:t xml:space="preserve"> </w:t>
-      </w:r>
-      <w:r>
-        <w:rPr>
-          <w:i/>
-          <w:iCs/>
-        </w:rPr>
-        <w:t xml:space="preserve">Computers and Electronics in Agriculture</w:t>
-      </w:r>
-      <w:r>
-        <w:t xml:space="preserve"> </w:t>
-      </w:r>
-      <w:r>
-        <w:t xml:space="preserve">147: 70–90.</w:t>
-      </w:r>
-      <w:r>
-        <w:t xml:space="preserve"> </w:t>
-      </w:r>
-      <w:hyperlink r:id="rId164">
-        <w:r>
-          <w:rPr>
-            <w:rStyle w:val="Hyperlink"/>
-          </w:rPr>
-          <w:t xml:space="preserve">https://doi.org/10.1016/j.compag.2018.02.016</w:t>
-        </w:r>
-      </w:hyperlink>
-      <w:r>
-        <w:t xml:space="preserve">.</w:t>
-      </w:r>
-    </w:p>
-    <w:bookmarkEnd w:id="165"/>
-    <w:bookmarkStart w:id="167" w:name="ref-kang2017neurosurgeon"/>
-    <w:p>
-      <w:pPr>
-        <w:pStyle w:val="Bibliography"/>
-      </w:pPr>
-      <w:r>
-        <w:t xml:space="preserve">Kang, Yiping, Johann Hauswald, Cao Gao, et al. 2017.</w:t>
-      </w:r>
-      <w:r>
-        <w:t xml:space="preserve"> </w:t>
-      </w:r>
-      <w:r>
-        <w:t xml:space="preserve">“Neurosurgeon: Collaborative Intelligence Between the Cloud and Mobile Edge.”</w:t>
-      </w:r>
-      <w:r>
-        <w:t xml:space="preserve"> </w:t>
-      </w:r>
-      <w:r>
-        <w:rPr>
-          <w:i/>
-          <w:iCs/>
-        </w:rPr>
-        <w:t xml:space="preserve">Proceedings of the 22nd International Conference on Architectural Support for Programming Languages and Operating Systems (ASPLOS)</w:t>
-      </w:r>
-      <w:r>
-        <w:t xml:space="preserve">, 615–29.</w:t>
-      </w:r>
-      <w:r>
-        <w:t xml:space="preserve"> </w:t>
-      </w:r>
-      <w:hyperlink r:id="rId166">
-        <w:r>
-          <w:rPr>
-            <w:rStyle w:val="Hyperlink"/>
-          </w:rPr>
-          <w:t xml:space="preserve">https://doi.org/10.1145/3037697.3037698</w:t>
-        </w:r>
-      </w:hyperlink>
-      <w:r>
-        <w:t xml:space="preserve">.</w:t>
-      </w:r>
-    </w:p>
-    <w:bookmarkEnd w:id="167"/>
-    <w:bookmarkStart w:id="169" w:name="ref-lin2017focal"/>
-    <w:p>
-      <w:pPr>
-        <w:pStyle w:val="Bibliography"/>
-      </w:pPr>
-      <w:r>
-        <w:t xml:space="preserve">Lin, Tsung-Yi, Priya Goyal, Ross Girshick, Kaiming He, and Piotr Dollár. 2017.</w:t>
-      </w:r>
-      <w:r>
-        <w:t xml:space="preserve"> </w:t>
-      </w:r>
-      <w:r>
-        <w:t xml:space="preserve">“Focal Loss for Dense Object Detection.”</w:t>
-      </w:r>
-      <w:r>
-        <w:t xml:space="preserve"> </w:t>
-      </w:r>
-      <w:r>
-        <w:rPr>
-          <w:i/>
-          <w:iCs/>
-        </w:rPr>
-        <w:t xml:space="preserve">IEEE International Conference on Computer Vision (ICCV)</w:t>
-      </w:r>
-      <w:r>
-        <w:t xml:space="preserve">, 2999–3007.</w:t>
-      </w:r>
-      <w:r>
-        <w:t xml:space="preserve"> </w:t>
-      </w:r>
-      <w:hyperlink r:id="rId168">
-        <w:r>
-          <w:rPr>
-            <w:rStyle w:val="Hyperlink"/>
-          </w:rPr>
-          <w:t xml:space="preserve">https://doi.org/10.1109/ICCV.2017.324</w:t>
-        </w:r>
-      </w:hyperlink>
-      <w:r>
-        <w:t xml:space="preserve">.</w:t>
-      </w:r>
-    </w:p>
-    <w:bookmarkEnd w:id="169"/>
-    <w:bookmarkStart w:id="170" w:name="ref-loshchilov2019adamw"/>
-    <w:p>
-      <w:pPr>
-        <w:pStyle w:val="Bibliography"/>
-      </w:pPr>
-      <w:r>
-        <w:t xml:space="preserve">Loshchilov, Ilya, and Frank Hutter. 2019.</w:t>
-      </w:r>
-      <w:r>
-        <w:t xml:space="preserve"> </w:t>
-      </w:r>
-      <w:r>
-        <w:t xml:space="preserve">“Decoupled Weight Decay Regularization.”</w:t>
-      </w:r>
-      <w:r>
-        <w:t xml:space="preserve"> </w:t>
-      </w:r>
-      <w:r>
-        <w:rPr>
-          <w:i/>
-          <w:iCs/>
-        </w:rPr>
-        <w:t xml:space="preserve">International Conference on Learning Representations (ICLR)</w:t>
-      </w:r>
-      <w:r>
-        <w:t xml:space="preserve">.</w:t>
-      </w:r>
-    </w:p>
-    <w:bookmarkEnd w:id="170"/>
-    <w:bookmarkStart w:id="172" w:name="ref-matsubara2022split"/>
-    <w:p>
-      <w:pPr>
-        <w:pStyle w:val="Bibliography"/>
-      </w:pPr>
-      <w:r>
-        <w:t xml:space="preserve">Matsubara, Yoshitomo, Marco Levorato, and Francesco Restuccia. 2022.</w:t>
-      </w:r>
-      <w:r>
-        <w:t xml:space="preserve"> </w:t>
-      </w:r>
-      <w:r>
-        <w:t xml:space="preserve">“Split Computing and Early Exiting for Deep Learning Applications: Survey and Research Challenges.”</w:t>
-      </w:r>
-      <w:r>
-        <w:t xml:space="preserve"> </w:t>
-      </w:r>
-      <w:r>
-        <w:rPr>
-          <w:i/>
-          <w:iCs/>
-        </w:rPr>
-        <w:t xml:space="preserve">ACM Computing Surveys</w:t>
-      </w:r>
-      <w:r>
-        <w:t xml:space="preserve"> </w:t>
-      </w:r>
-      <w:r>
-        <w:t xml:space="preserve">55 (5): 1–30.</w:t>
-      </w:r>
-      <w:r>
-        <w:t xml:space="preserve"> </w:t>
-      </w:r>
-      <w:hyperlink r:id="rId171">
-        <w:r>
-          <w:rPr>
-            <w:rStyle w:val="Hyperlink"/>
-          </w:rPr>
-          <w:t xml:space="preserve">https://doi.org/10.1145/3527155</w:t>
-        </w:r>
-      </w:hyperlink>
-      <w:r>
-        <w:t xml:space="preserve">.</w:t>
-      </w:r>
-    </w:p>
-    <w:bookmarkEnd w:id="172"/>
-    <w:bookmarkStart w:id="174" w:name="ref-mohanty2016deeplearning"/>
-    <w:p>
-      <w:pPr>
-        <w:pStyle w:val="Bibliography"/>
-      </w:pPr>
-      <w:r>
-        <w:t xml:space="preserve">Mohanty, Sharada P., David P. Hughes, and Marcel Salathé. 2016.</w:t>
-      </w:r>
-      <w:r>
-        <w:t xml:space="preserve"> </w:t>
-      </w:r>
-      <w:r>
-        <w:t xml:space="preserve">“Using Deep Learning for Image-Based Plant Disease Detection.”</w:t>
-      </w:r>
-      <w:r>
-        <w:t xml:space="preserve"> </w:t>
-      </w:r>
-      <w:r>
-        <w:rPr>
-          <w:i/>
-          <w:iCs/>
-        </w:rPr>
-        <w:t xml:space="preserve">Frontiers in Plant Science</w:t>
-      </w:r>
-      <w:r>
-        <w:t xml:space="preserve"> </w:t>
-      </w:r>
-      <w:r>
-        <w:t xml:space="preserve">7: 1419.</w:t>
-      </w:r>
-      <w:r>
-        <w:t xml:space="preserve"> </w:t>
-      </w:r>
-      <w:hyperlink r:id="rId173">
-        <w:r>
-          <w:rPr>
-            <w:rStyle w:val="Hyperlink"/>
-          </w:rPr>
-          <w:t xml:space="preserve">https://doi.org/10.3389/fpls.2016.01419</w:t>
-        </w:r>
-      </w:hyperlink>
-      <w:r>
-        <w:t xml:space="preserve">.</w:t>
-      </w:r>
-    </w:p>
-    <w:bookmarkEnd w:id="174"/>
-    <w:bookmarkStart w:id="176" w:name="ref-noyan2022uncovering"/>
-    <w:p>
-      <w:pPr>
-        <w:pStyle w:val="Bibliography"/>
-      </w:pPr>
-      <w:r>
-        <w:t xml:space="preserve">Noyan, Mehmet Alican. 2022.</w:t>
-      </w:r>
-      <w:r>
-        <w:t xml:space="preserve"> </w:t>
-      </w:r>
-      <w:r>
-        <w:rPr>
-          <w:i/>
-          <w:iCs/>
-        </w:rPr>
-        <w:t xml:space="preserve">Uncovering Bias in the</w:t>
-      </w:r>
-      <w:r>
-        <w:rPr>
-          <w:i/>
-          <w:iCs/>
-        </w:rPr>
-        <w:t xml:space="preserve"> </w:t>
-      </w:r>
-      <w:r>
-        <w:rPr>
-          <w:i/>
-          <w:iCs/>
-        </w:rPr>
-        <w:t xml:space="preserve">PlantVillage</w:t>
-      </w:r>
-      <w:r>
-        <w:rPr>
-          <w:i/>
-          <w:iCs/>
-        </w:rPr>
-        <w:t xml:space="preserve"> </w:t>
-      </w:r>
-      <w:r>
-        <w:rPr>
-          <w:i/>
-          <w:iCs/>
-        </w:rPr>
-        <w:t xml:space="preserve">Dataset</w:t>
-      </w:r>
-      <w:r>
-        <w:t xml:space="preserve">.</w:t>
-      </w:r>
-      <w:r>
-        <w:t xml:space="preserve"> </w:t>
-      </w:r>
-      <w:hyperlink r:id="rId175">
-        <w:r>
-          <w:rPr>
-            <w:rStyle w:val="Hyperlink"/>
-          </w:rPr>
-          <w:t xml:space="preserve">https://doi.org/10.48550/arXiv.2206.04374</w:t>
-        </w:r>
-      </w:hyperlink>
-      <w:r>
-        <w:t xml:space="preserve">.</w:t>
-      </w:r>
-    </w:p>
-    <w:bookmarkEnd w:id="176"/>
-    <w:bookmarkStart w:id="178" w:name="ref-nvidia2022tensorrt"/>
-    <w:p>
-      <w:pPr>
-        <w:pStyle w:val="Bibliography"/>
-      </w:pPr>
-      <w:r>
-        <w:t xml:space="preserve">NVIDIA Corporation. 2022.</w:t>
-      </w:r>
-      <w:r>
-        <w:t xml:space="preserve"> </w:t>
-      </w:r>
-      <w:r>
-        <w:rPr>
-          <w:i/>
-          <w:iCs/>
-        </w:rPr>
-        <w:t xml:space="preserve">NVIDIA TensorRT</w:t>
-      </w:r>
-      <w:r>
-        <w:rPr>
-          <w:i/>
-          <w:iCs/>
-        </w:rPr>
-        <w:t xml:space="preserve"> </w:t>
-      </w:r>
-      <w:r>
-        <w:rPr>
-          <w:i/>
-          <w:iCs/>
-        </w:rPr>
-        <w:t xml:space="preserve">8.2 Developer Guide</w:t>
-      </w:r>
-      <w:r>
-        <w:t xml:space="preserve">.</w:t>
-      </w:r>
-      <w:r>
-        <w:t xml:space="preserve"> </w:t>
-      </w:r>
-      <w:hyperlink r:id="rId177">
-        <w:r>
-          <w:rPr>
-            <w:rStyle w:val="Hyperlink"/>
-          </w:rPr>
-          <w:t xml:space="preserve">Https://docs.nvidia.com/deeplearning/tensorrt/archives/</w:t>
-        </w:r>
-      </w:hyperlink>
-      <w:r>
-        <w:t xml:space="preserve">.</w:t>
-      </w:r>
-    </w:p>
-    <w:bookmarkEnd w:id="178"/>
-    <w:bookmarkStart w:id="180" w:name="ref-ogrady2019edge"/>
-    <w:p>
-      <w:pPr>
-        <w:pStyle w:val="Bibliography"/>
-      </w:pPr>
-      <w:r>
-        <w:t xml:space="preserve">O’Grady, M. J., D. Langton, and G. M. P. O’Hare. 2019.</w:t>
-      </w:r>
-      <w:r>
-        <w:t xml:space="preserve"> </w:t>
-      </w:r>
-      <w:r>
-        <w:t xml:space="preserve">“Edge Computing: A Tractable Model for Smart Agriculture?”</w:t>
-      </w:r>
-      <w:r>
-        <w:t xml:space="preserve"> </w:t>
-      </w:r>
-      <w:r>
-        <w:rPr>
-          <w:i/>
-          <w:iCs/>
-        </w:rPr>
-        <w:t xml:space="preserve">Artificial Intelligence in Agriculture</w:t>
-      </w:r>
-      <w:r>
-        <w:t xml:space="preserve"> </w:t>
-      </w:r>
-      <w:r>
-        <w:t xml:space="preserve">3: 42–51.</w:t>
-      </w:r>
-      <w:r>
-        <w:t xml:space="preserve"> </w:t>
-      </w:r>
-      <w:hyperlink r:id="rId179">
-        <w:r>
-          <w:rPr>
-            <w:rStyle w:val="Hyperlink"/>
-          </w:rPr>
-          <w:t xml:space="preserve">https://doi.org/10.1016/j.aiia.2019.12.001</w:t>
-        </w:r>
-      </w:hyperlink>
-      <w:r>
-        <w:t xml:space="preserve">.</w:t>
-      </w:r>
-    </w:p>
-    <w:bookmarkEnd w:id="180"/>
-    <w:bookmarkStart w:id="181" w:name="ref-oquab2024dinov2"/>
-    <w:p>
-      <w:pPr>
-        <w:pStyle w:val="Bibliography"/>
-      </w:pPr>
-      <w:r>
-        <w:t xml:space="preserve">Oquab, Maxime, Timothée Darcet, Théo Moutakanni, et al.</w:t>
-      </w:r>
-      <w:r>
-        <w:t xml:space="preserve"> 2024.</w:t>
-      </w:r>
-      <w:r>
-        <w:t xml:space="preserve"> </w:t>
-      </w:r>
-      <w:r>
-        <w:rPr>
-          <w:i/>
-          <w:iCs/>
-        </w:rPr>
-        <w:t xml:space="preserve">DINOv2</w:t>
-      </w:r>
-      <w:r>
-        <w:rPr>
-          <w:i/>
-          <w:iCs/>
-        </w:rPr>
-        <w:t xml:space="preserve">: Learning Robust Visual Features Without Supervision</w:t>
-      </w:r>
-      <w:r>
-        <w:t xml:space="preserve">. Transactions on Machine Learning Research (TMLR).</w:t>
-      </w:r>
-    </w:p>
-    <w:bookmarkEnd w:id="181"/>
-    <w:bookmarkStart w:id="182" w:name="ref-radford2021clip"/>
-    <w:p>
-      <w:pPr>
-        <w:pStyle w:val="Bibliography"/>
-      </w:pPr>
-      <w:r>
-        <w:t xml:space="preserve">Radford, Alec, Jong Wook Kim, Chris Hallacy, et al. 2021.</w:t>
-      </w:r>
-      <w:r>
-        <w:t xml:space="preserve"> </w:t>
-      </w:r>
-      <w:r>
-        <w:t xml:space="preserve">“Learning Transferable Visual Models from Natural Language Supervision.”</w:t>
-      </w:r>
-      <w:r>
-        <w:t xml:space="preserve"> </w:t>
-      </w:r>
-      <w:r>
-        <w:rPr>
-          <w:i/>
-          <w:iCs/>
-        </w:rPr>
-        <w:t xml:space="preserve">International Conference on Machine Learning (ICML)</w:t>
-      </w:r>
-      <w:r>
-        <w:t xml:space="preserve">, 8748–63.</w:t>
-      </w:r>
-    </w:p>
-    <w:bookmarkEnd w:id="182"/>
-    <w:bookmarkStart w:id="184" w:name="ref-salman2025plantdisease"/>
-    <w:p>
-      <w:pPr>
-        <w:pStyle w:val="Bibliography"/>
-      </w:pPr>
-      <w:r>
-        <w:t xml:space="preserve">Salman, Zafar, Abdullah Muhammad, and Dongil Han. 2025.</w:t>
-      </w:r>
-      <w:r>
-        <w:t xml:space="preserve"> </w:t>
-      </w:r>
-      <w:r>
-        <w:t xml:space="preserve">“Plant Disease Classification in the Wild Using Vision Transformers and Mixture of Experts.”</w:t>
-      </w:r>
-      <w:r>
-        <w:t xml:space="preserve"> </w:t>
-      </w:r>
-      <w:r>
-        <w:rPr>
-          <w:i/>
-          <w:iCs/>
-        </w:rPr>
-        <w:t xml:space="preserve">Frontiers in Plant Science</w:t>
-      </w:r>
-      <w:r>
-        <w:t xml:space="preserve"> </w:t>
-      </w:r>
-      <w:r>
-        <w:t xml:space="preserve">16.</w:t>
-      </w:r>
-      <w:r>
-        <w:t xml:space="preserve"> </w:t>
-      </w:r>
-      <w:hyperlink r:id="rId183">
-        <w:r>
-          <w:rPr>
-            <w:rStyle w:val="Hyperlink"/>
-          </w:rPr>
-          <w:t xml:space="preserve">https://doi.org/10.3389/fpls.2025.1522985</w:t>
-        </w:r>
-      </w:hyperlink>
-      <w:r>
-        <w:t xml:space="preserve">.</w:t>
-      </w:r>
-    </w:p>
-    <w:bookmarkEnd w:id="184"/>
-    <w:bookmarkStart w:id="186" w:name="ref-savary2019global"/>
-    <w:p>
-      <w:pPr>
-        <w:pStyle w:val="Bibliography"/>
-      </w:pPr>
-      <w:r>
-        <w:t xml:space="preserve">Savary, Serge, Laetitia Willocquet, Sarah Jane Pethybridge, Paul Esker, Neil McRoberts, and Andy Nelson. 2019.</w:t>
-      </w:r>
-      <w:r>
-        <w:t xml:space="preserve"> </w:t>
-      </w:r>
-      <w:r>
-        <w:t xml:space="preserve">“The Global Burden of Pathogens and Pests on Major Food Crops.”</w:t>
-      </w:r>
-      <w:r>
-        <w:t xml:space="preserve"> </w:t>
-      </w:r>
-      <w:r>
-        <w:rPr>
-          <w:i/>
-          <w:iCs/>
-        </w:rPr>
-        <w:t xml:space="preserve">Nature Ecology &amp; Evolution</w:t>
-      </w:r>
-      <w:r>
-        <w:t xml:space="preserve"> </w:t>
-      </w:r>
-      <w:r>
-        <w:t xml:space="preserve">3 (3): 430–39.</w:t>
-      </w:r>
-      <w:r>
-        <w:t xml:space="preserve"> </w:t>
-      </w:r>
-      <w:hyperlink r:id="rId185">
-        <w:r>
-          <w:rPr>
-            <w:rStyle w:val="Hyperlink"/>
-          </w:rPr>
-          <w:t xml:space="preserve">https://doi.org/10.1038/s41559-018-0793-y</w:t>
-        </w:r>
-      </w:hyperlink>
-      <w:r>
-        <w:t xml:space="preserve">.</w:t>
-      </w:r>
-    </w:p>
-    <w:bookmarkEnd w:id="186"/>
-    <w:bookmarkStart w:id="188" w:name="ref-shi2016edge"/>
-    <w:p>
-      <w:pPr>
-        <w:pStyle w:val="Bibliography"/>
-      </w:pPr>
-      <w:r>
-        <w:t xml:space="preserve">Shi, Weisong, Jie Cao, Quan Zhang, Youhuizi Li, and Lanyu Xu. 2016.</w:t>
-      </w:r>
-      <w:r>
-        <w:t xml:space="preserve"> </w:t>
-      </w:r>
-      <w:r>
-        <w:t xml:space="preserve">“Edge Computing: Vision and Challenges.”</w:t>
-      </w:r>
-      <w:r>
-        <w:t xml:space="preserve"> </w:t>
-      </w:r>
-      <w:r>
-        <w:rPr>
-          <w:i/>
-          <w:iCs/>
-        </w:rPr>
-        <w:t xml:space="preserve">IEEE Internet of Things Journal</w:t>
-      </w:r>
-      <w:r>
-        <w:t xml:space="preserve"> </w:t>
-      </w:r>
-      <w:r>
-        <w:t xml:space="preserve">3 (5): 637–46.</w:t>
-      </w:r>
-      <w:r>
-        <w:t xml:space="preserve"> </w:t>
-      </w:r>
-      <w:hyperlink r:id="rId187">
-        <w:r>
-          <w:rPr>
-            <w:rStyle w:val="Hyperlink"/>
-          </w:rPr>
-          <w:t xml:space="preserve">https://doi.org/10.1109/JIOT.2016.2579198</w:t>
-        </w:r>
-      </w:hyperlink>
-      <w:r>
-        <w:t xml:space="preserve">.</w:t>
-      </w:r>
-    </w:p>
-    <w:bookmarkEnd w:id="188"/>
-    <w:bookmarkStart w:id="190" w:name="ref-simeoni2025dinov3"/>
-    <w:p>
-      <w:pPr>
-        <w:pStyle w:val="Bibliography"/>
-      </w:pPr>
-      <w:r>
-        <w:t xml:space="preserve">Siméoni, Oriane, Huy V. Vo, Maximilian Seitzer, Federico Baldassarre, Maxime Oquab, et al.</w:t>
-      </w:r>
-      <w:r>
-        <w:t xml:space="preserve"> 2026.</w:t>
-      </w:r>
-      <w:r>
-        <w:t xml:space="preserve"> </w:t>
-      </w:r>
-      <w:r>
-        <w:rPr>
-          <w:i/>
-          <w:iCs/>
-        </w:rPr>
-        <w:t xml:space="preserve">DINOv3</w:t>
-      </w:r>
-      <w:r>
-        <w:rPr>
-          <w:i/>
-          <w:iCs/>
-        </w:rPr>
-        <w:t xml:space="preserve">: A Versatile Vision Foundation Model</w:t>
-      </w:r>
-      <w:r>
-        <w:t xml:space="preserve">. Transactions on Machine Learning Research (TMLR).</w:t>
-      </w:r>
-      <w:r>
-        <w:t xml:space="preserve"> </w:t>
-      </w:r>
-      <w:hyperlink r:id="rId189">
-        <w:r>
-          <w:rPr>
-            <w:rStyle w:val="Hyperlink"/>
-          </w:rPr>
-          <w:t xml:space="preserve">https://openreview.net/forum?id=2NlGyqNjns</w:t>
-        </w:r>
-      </w:hyperlink>
-      <w:r>
-        <w:t xml:space="preserve">.</w:t>
-      </w:r>
-    </w:p>
-    <w:bookmarkEnd w:id="190"/>
-    <w:bookmarkStart w:id="192" w:name="ref-singh2020plantdoc"/>
-    <w:p>
-      <w:pPr>
-        <w:pStyle w:val="Bibliography"/>
-      </w:pPr>
-      <w:r>
-        <w:t xml:space="preserve">Singh, Davinder, Naman Jain, Pranjali Jain, Pratik Kayal, Sudhakar Kumawat, and Nipun Batra. 2020.</w:t>
-      </w:r>
-      <w:r>
-        <w:t xml:space="preserve"> </w:t>
-      </w:r>
-      <w:r>
-        <w:t xml:space="preserve">“</w:t>
-      </w:r>
-      <w:r>
-        <w:t xml:space="preserve">PlantDoc</w:t>
-      </w:r>
-      <w:r>
-        <w:t xml:space="preserve">: A Dataset for Visual Plant Disease Detection.”</w:t>
-      </w:r>
-      <w:r>
-        <w:t xml:space="preserve"> </w:t>
-      </w:r>
-      <w:r>
-        <w:rPr>
-          <w:i/>
-          <w:iCs/>
-        </w:rPr>
-        <w:t xml:space="preserve">Proceedings of the 7th ACM IKDD CoDS and 25th COMAD</w:t>
-      </w:r>
-      <w:r>
-        <w:t xml:space="preserve">, 249–53.</w:t>
-      </w:r>
-      <w:r>
-        <w:t xml:space="preserve"> </w:t>
-      </w:r>
-      <w:hyperlink r:id="rId191">
-        <w:r>
-          <w:rPr>
-            <w:rStyle w:val="Hyperlink"/>
-          </w:rPr>
-          <w:t xml:space="preserve">https://doi.org/10.1145/3371158.3371196</w:t>
-        </w:r>
-      </w:hyperlink>
-      <w:r>
-        <w:t xml:space="preserve">.</w:t>
-      </w:r>
-    </w:p>
-    <w:bookmarkEnd w:id="192"/>
-    <w:bookmarkStart w:id="193" w:name="ref-tan2019efficientnet"/>
-    <w:p>
-      <w:pPr>
-        <w:pStyle w:val="Bibliography"/>
-      </w:pPr>
-      <w:r>
-        <w:t xml:space="preserve">Tan, Mingxing, and Quoc V. Le. 2019.</w:t>
-      </w:r>
-      <w:r>
-        <w:t xml:space="preserve"> </w:t>
-      </w:r>
-      <w:r>
-        <w:t xml:space="preserve">“</w:t>
-      </w:r>
-      <w:r>
-        <w:t xml:space="preserve">EfficientNet</w:t>
-      </w:r>
-      <w:r>
-        <w:t xml:space="preserve">: Rethinking Model Scaling for Convolutional Neural Networks.”</w:t>
-      </w:r>
-      <w:r>
-        <w:t xml:space="preserve"> </w:t>
-      </w:r>
-      <w:r>
-        <w:rPr>
-          <w:i/>
-          <w:iCs/>
-        </w:rPr>
-        <w:t xml:space="preserve">International Conference on Machine Learning (ICML)</w:t>
-      </w:r>
-      <w:r>
-        <w:t xml:space="preserve">, 6105–14.</w:t>
-      </w:r>
-    </w:p>
-    <w:bookmarkEnd w:id="193"/>
-    <w:bookmarkStart w:id="195" w:name="ref-teerapittayanon2016branchynet"/>
-    <w:p>
-      <w:pPr>
-        <w:pStyle w:val="Bibliography"/>
-      </w:pPr>
-      <w:r>
-        <w:t xml:space="preserve">Teerapittayanon, Surat, Bradley McDanel, and H. T. Kung. 2016.</w:t>
-      </w:r>
-      <w:r>
-        <w:t xml:space="preserve"> </w:t>
-      </w:r>
-      <w:r>
-        <w:t xml:space="preserve">“</w:t>
-      </w:r>
-      <w:r>
-        <w:t xml:space="preserve">BranchyNet</w:t>
-      </w:r>
-      <w:r>
-        <w:t xml:space="preserve">: Fast Inference via Early Exiting from Deep Neural Networks.”</w:t>
-      </w:r>
-      <w:r>
-        <w:t xml:space="preserve"> </w:t>
-      </w:r>
-      <w:r>
-        <w:rPr>
-          <w:i/>
-          <w:iCs/>
-        </w:rPr>
-        <w:t xml:space="preserve">23rd International Conference on Pattern Recognition (ICPR)</w:t>
-      </w:r>
-      <w:r>
-        <w:t xml:space="preserve">, 2464–69.</w:t>
-      </w:r>
-      <w:r>
-        <w:t xml:space="preserve"> </w:t>
-      </w:r>
-      <w:hyperlink r:id="rId194">
-        <w:r>
-          <w:rPr>
-            <w:rStyle w:val="Hyperlink"/>
-          </w:rPr>
-          <w:t xml:space="preserve">https://doi.org/10.1109/ICPR.2016.7900006</w:t>
-        </w:r>
-      </w:hyperlink>
-      <w:r>
-        <w:t xml:space="preserve">.</w:t>
-      </w:r>
-    </w:p>
-    <w:bookmarkEnd w:id="195"/>
-    <w:bookmarkStart w:id="197" w:name="ref-teerapittayanon2017ddnn"/>
-    <w:p>
-      <w:pPr>
-        <w:pStyle w:val="Bibliography"/>
-      </w:pPr>
-      <w:r>
-        <w:t xml:space="preserve">Teerapittayanon, Surat, Bradley McDanel, and H. T. Kung. 2017.</w:t>
-      </w:r>
-      <w:r>
-        <w:t xml:space="preserve"> </w:t>
-      </w:r>
-      <w:r>
-        <w:t xml:space="preserve">“Distributed Deep Neural Networks over the Cloud, the Edge and End Devices.”</w:t>
-      </w:r>
-      <w:r>
-        <w:t xml:space="preserve"> </w:t>
-      </w:r>
-      <w:r>
-        <w:rPr>
-          <w:i/>
-          <w:iCs/>
-        </w:rPr>
-        <w:t xml:space="preserve">IEEE 37th International Conference on Distributed Computing Systems (ICDCS)</w:t>
-      </w:r>
-      <w:r>
-        <w:t xml:space="preserve">, 328–39.</w:t>
-      </w:r>
-      <w:r>
-        <w:t xml:space="preserve"> </w:t>
-      </w:r>
-      <w:hyperlink r:id="rId196">
-        <w:r>
-          <w:rPr>
-            <w:rStyle w:val="Hyperlink"/>
-          </w:rPr>
-          <w:t xml:space="preserve">https://doi.org/10.1109/ICDCS.2017.226</w:t>
-        </w:r>
-      </w:hyperlink>
-      <w:r>
-        <w:t xml:space="preserve">.</w:t>
-      </w:r>
-    </w:p>
-    <w:bookmarkEnd w:id="197"/>
-    <w:bookmarkStart w:id="199" w:name="ref-viola2001cascade"/>
-    <w:p>
-      <w:pPr>
-        <w:pStyle w:val="Bibliography"/>
-      </w:pPr>
-      <w:r>
-        <w:t xml:space="preserve">Viola, Paul, and Michael Jones. 2001.</w:t>
-      </w:r>
-      <w:r>
-        <w:t xml:space="preserve"> </w:t>
-      </w:r>
-      <w:r>
-        <w:t xml:space="preserve">“Rapid Object Detection Using a Boosted Cascade of Simple Features.”</w:t>
-      </w:r>
-      <w:r>
-        <w:t xml:space="preserve"> </w:t>
-      </w:r>
-      <w:r>
-        <w:rPr>
-          <w:i/>
-          <w:iCs/>
-        </w:rPr>
-        <w:t xml:space="preserve">Proceedings of the IEEE Computer Society Conference on Computer Vision and Pattern Recognition (CVPR)</w:t>
-      </w:r>
-      <w:r>
-        <w:t xml:space="preserve"> </w:t>
-      </w:r>
-      <w:r>
-        <w:t xml:space="preserve">1: I-511-I-518.</w:t>
-      </w:r>
-      <w:r>
-        <w:t xml:space="preserve"> </w:t>
-      </w:r>
-      <w:hyperlink r:id="rId198">
-        <w:r>
-          <w:rPr>
-            <w:rStyle w:val="Hyperlink"/>
-          </w:rPr>
-          <w:t xml:space="preserve">https://doi.org/10.1109/CVPR.2001.990517</w:t>
-        </w:r>
-      </w:hyperlink>
-      <w:r>
-        <w:t xml:space="preserve">.</w:t>
-      </w:r>
-    </w:p>
-    <w:bookmarkEnd w:id="199"/>
-    <w:bookmarkStart w:id="200" w:name="ref-wang2018idk"/>
-    <w:p>
-      <w:pPr>
-        <w:pStyle w:val="Bibliography"/>
-      </w:pPr>
-      <w:r>
-        <w:t xml:space="preserve">Wang, Xin, Yujia Luo, Daniel Crankshaw, Alexey Tumanov, Fisher Yu, and Joseph E. Gonzalez. 2018.</w:t>
-      </w:r>
-      <w:r>
-        <w:t xml:space="preserve"> </w:t>
-      </w:r>
-      <w:r>
-        <w:t xml:space="preserve">“</w:t>
-      </w:r>
-      <w:r>
-        <w:t xml:space="preserve">IDK</w:t>
-      </w:r>
-      <w:r>
-        <w:t xml:space="preserve"> </w:t>
-      </w:r>
-      <w:r>
-        <w:t xml:space="preserve">Cascades: Fast Deep Learning by Learning Not to Overthink.”</w:t>
-      </w:r>
-      <w:r>
-        <w:t xml:space="preserve"> </w:t>
-      </w:r>
-      <w:r>
-        <w:rPr>
-          <w:i/>
-          <w:iCs/>
-        </w:rPr>
-        <w:t xml:space="preserve">Proceedings of the Conference on Uncertainty in Artificial Intelligence (UAI)</w:t>
-      </w:r>
-      <w:r>
-        <w:t xml:space="preserve">.</w:t>
-      </w:r>
-    </w:p>
-    <w:bookmarkEnd w:id="200"/>
-    <w:bookmarkStart w:id="202" w:name="ref-wei2024mvpdr"/>
-    <w:p>
-      <w:pPr>
-        <w:pStyle w:val="Bibliography"/>
-      </w:pPr>
-      <w:r>
-        <w:t xml:space="preserve">Wei, Tianqi, Zhi Chen, Zi Huang, and Xin Yu. 2024a.</w:t>
-      </w:r>
-      <w:r>
-        <w:t xml:space="preserve"> </w:t>
-      </w:r>
-      <w:r>
-        <w:t xml:space="preserve">“Benchmarking in-the-Wild Multimodal Disease Recognition and a Versatile Baseline.”</w:t>
-      </w:r>
-      <w:r>
-        <w:t xml:space="preserve"> </w:t>
-      </w:r>
-      <w:r>
-        <w:rPr>
-          <w:i/>
-          <w:iCs/>
-        </w:rPr>
-        <w:t xml:space="preserve">Proceedings of the 32nd ACM International Conference on Multimedia (MM ’24)</w:t>
-      </w:r>
-      <w:r>
-        <w:t xml:space="preserve">, 1593–601.</w:t>
-      </w:r>
-      <w:r>
-        <w:t xml:space="preserve"> </w:t>
-      </w:r>
-      <w:hyperlink r:id="rId201">
-        <w:r>
-          <w:rPr>
-            <w:rStyle w:val="Hyperlink"/>
-          </w:rPr>
-          <w:t xml:space="preserve">https://doi.org/10.1145/3664647.3680599</w:t>
-        </w:r>
-      </w:hyperlink>
-      <w:r>
-        <w:t xml:space="preserve">.</w:t>
-      </w:r>
-    </w:p>
-    <w:bookmarkEnd w:id="202"/>
-    <w:bookmarkStart w:id="204" w:name="ref-wei2024plantwild"/>
-    <w:p>
-      <w:pPr>
-        <w:pStyle w:val="Bibliography"/>
-      </w:pPr>
-      <w:r>
-        <w:t xml:space="preserve">Wei, Tianqi, Zhi Chen, Zi Huang, and Xin Yu. 2024b.</w:t>
-      </w:r>
-      <w:r>
-        <w:t xml:space="preserve"> </w:t>
-      </w:r>
-      <w:r>
-        <w:t xml:space="preserve">“Plant Disease Recognition in the Wild.”</w:t>
-      </w:r>
-      <w:r>
-        <w:t xml:space="preserve"> </w:t>
-      </w:r>
-      <w:r>
-        <w:rPr>
-          <w:i/>
-          <w:iCs/>
-        </w:rPr>
-        <w:t xml:space="preserve">Proceedings of the 32nd ACM International Conference on Multimedia (MM ’24)</w:t>
-      </w:r>
-      <w:r>
-        <w:t xml:space="preserve">.</w:t>
-      </w:r>
-      <w:r>
-        <w:t xml:space="preserve"> </w:t>
-      </w:r>
-      <w:hyperlink r:id="rId203">
-        <w:r>
-          <w:rPr>
-            <w:rStyle w:val="Hyperlink"/>
-          </w:rPr>
-          <w:t xml:space="preserve">https://doi.org/10.1145/3664647.3681614</w:t>
-        </w:r>
-      </w:hyperlink>
-      <w:r>
-        <w:t xml:space="preserve">.</w:t>
-      </w:r>
-    </w:p>
-    <w:bookmarkEnd w:id="204"/>
-    <w:bookmarkStart w:id="206" w:name="ref-wolfert2017bigdata"/>
-    <w:p>
-      <w:pPr>
-        <w:pStyle w:val="Bibliography"/>
-      </w:pPr>
-      <w:r>
-        <w:t xml:space="preserve">Wolfert, Sjaak, Lan Ge, Cor Verdouw, and Marc-Jeroen Bogaardt. 2017.</w:t>
-      </w:r>
-      <w:r>
-        <w:t xml:space="preserve"> </w:t>
-      </w:r>
-      <w:r>
-        <w:t xml:space="preserve">“Big Data in Smart Farming – a Review.”</w:t>
-      </w:r>
-      <w:r>
-        <w:t xml:space="preserve"> </w:t>
-      </w:r>
-      <w:r>
-        <w:rPr>
-          <w:i/>
-          <w:iCs/>
-        </w:rPr>
-        <w:t xml:space="preserve">Agricultural Systems</w:t>
-      </w:r>
-      <w:r>
-        <w:t xml:space="preserve"> </w:t>
-      </w:r>
-      <w:r>
-        <w:t xml:space="preserve">153: 69–80.</w:t>
-      </w:r>
-      <w:r>
-        <w:t xml:space="preserve"> </w:t>
-      </w:r>
-      <w:hyperlink r:id="rId205">
-        <w:r>
-          <w:rPr>
-            <w:rStyle w:val="Hyperlink"/>
-          </w:rPr>
-          <w:t xml:space="preserve">https://doi.org/10.1016/j.agsy.2017.01.023</w:t>
-        </w:r>
-      </w:hyperlink>
-      <w:r>
-        <w:t xml:space="preserve">.</w:t>
-      </w:r>
-    </w:p>
-    <w:bookmarkEnd w:id="206"/>
-    <w:bookmarkStart w:id="208" w:name="ref-wu2023fromlaboratoryto"/>
-    <w:p>
-      <w:pPr>
-        <w:pStyle w:val="Bibliography"/>
-      </w:pPr>
-      <w:r>
-        <w:t xml:space="preserve">Wu, Xinlu, Xijian Fan, Peng Luo, Sruti Das Choudhury, Tardi Tjahjadi, and Chunhua Hu. 2023.</w:t>
-      </w:r>
-      <w:r>
-        <w:t xml:space="preserve"> </w:t>
-      </w:r>
-      <w:r>
-        <w:t xml:space="preserve">“From Laboratory to Field: Unsupervised Domain Adaptation for Plant Disease Recognition in the Wild.”</w:t>
-      </w:r>
-      <w:r>
-        <w:t xml:space="preserve"> </w:t>
-      </w:r>
-      <w:r>
-        <w:rPr>
-          <w:i/>
-          <w:iCs/>
-        </w:rPr>
-        <w:t xml:space="preserve">Plant Phenomics</w:t>
-      </w:r>
-      <w:r>
-        <w:t xml:space="preserve"> </w:t>
-      </w:r>
-      <w:r>
-        <w:t xml:space="preserve">5: 0038.</w:t>
-      </w:r>
-      <w:r>
-        <w:t xml:space="preserve"> </w:t>
-      </w:r>
-      <w:hyperlink r:id="rId207">
-        <w:r>
-          <w:rPr>
-            <w:rStyle w:val="Hyperlink"/>
-          </w:rPr>
-          <w:t xml:space="preserve">https://doi.org/10.34133/plantphenomics.0038</w:t>
         </w:r>
       </w:hyperlink>
       <w:r>

</xml_diff>